<commit_message>
FOPA lab2: table of tracing
</commit_message>
<xml_diff>
--- a/fopa/lab2/report.docx
+++ b/fopa/lab2/report.docx
@@ -103,7 +103,6 @@
           <w:bCs/>
           <w:sz w:val="32"/>
           <w:szCs w:val="32"/>
-          <w:lang w:val="en-US"/>
         </w:rPr>
       </w:pPr>
       <w:r>
@@ -981,9 +980,15 @@
           <w:p>
             <w:pPr>
               <w:jc w:val="center"/>
-            </w:pPr>
-            <w:r>
-              <w:t>Результат 1</w:t>
+              <w:rPr>
+                <w:lang w:val="en-US"/>
+              </w:rPr>
+            </w:pPr>
+            <w:r>
+              <w:rPr>
+                <w:lang w:val="en-US"/>
+              </w:rPr>
+              <w:t>C</w:t>
             </w:r>
           </w:p>
         </w:tc>
@@ -1068,9 +1073,6 @@
           <w:p>
             <w:pPr>
               <w:jc w:val="center"/>
-              <w:rPr>
-                <w:lang w:val="en-US"/>
-              </w:rPr>
             </w:pPr>
             <w:r>
               <w:t xml:space="preserve">(144) </w:t>
@@ -1079,10 +1081,13 @@
               <w:sym w:font="Symbol" w:char="F0DE"/>
             </w:r>
             <w:r>
-              <w:rPr>
-                <w:lang w:val="en-US"/>
-              </w:rPr>
-              <w:t xml:space="preserve"> AC</w:t>
+              <w:t xml:space="preserve"> </w:t>
+            </w:r>
+            <w:r>
+              <w:rPr>
+                <w:lang w:val="en-US"/>
+              </w:rPr>
+              <w:t>AC</w:t>
             </w:r>
           </w:p>
         </w:tc>
@@ -1544,9 +1549,6 @@
           <w:p>
             <w:pPr>
               <w:jc w:val="center"/>
-              <w:rPr>
-                <w:lang w:val="en-US"/>
-              </w:rPr>
             </w:pPr>
             <w:r>
               <w:t xml:space="preserve">Результат сложения ячейки 139 </w:t>
@@ -1572,7 +1574,19 @@
               <w:rPr>
                 <w:lang w:val="en-US"/>
               </w:rPr>
-              <w:t xml:space="preserve">AC + (145) </w:t>
+              <w:t>AC + (</w:t>
+            </w:r>
+            <w:r>
+              <w:rPr>
+                <w:lang w:val="en-US"/>
+              </w:rPr>
+              <w:t>139</w:t>
+            </w:r>
+            <w:r>
+              <w:rPr>
+                <w:lang w:val="en-US"/>
+              </w:rPr>
+              <w:t xml:space="preserve">) </w:t>
             </w:r>
             <w:r>
               <w:sym w:font="Symbol" w:char="F0DE"/>
@@ -1834,9 +1848,15 @@
           <w:p>
             <w:pPr>
               <w:jc w:val="center"/>
-            </w:pPr>
-            <w:r>
-              <w:t>Данные</w:t>
+              <w:rPr>
+                <w:lang w:val="en-US"/>
+              </w:rPr>
+            </w:pPr>
+            <w:r>
+              <w:rPr>
+                <w:lang w:val="en-US"/>
+              </w:rPr>
+              <w:t>B</w:t>
             </w:r>
           </w:p>
         </w:tc>
@@ -1900,9 +1920,15 @@
           <w:p>
             <w:pPr>
               <w:jc w:val="center"/>
-            </w:pPr>
-            <w:r>
-              <w:t>Данные</w:t>
+              <w:rPr>
+                <w:lang w:val="en-US"/>
+              </w:rPr>
+            </w:pPr>
+            <w:r>
+              <w:rPr>
+                <w:lang w:val="en-US"/>
+              </w:rPr>
+              <w:t>R</w:t>
             </w:r>
           </w:p>
         </w:tc>
@@ -1966,9 +1992,15 @@
           <w:p>
             <w:pPr>
               <w:jc w:val="center"/>
-            </w:pPr>
-            <w:r>
-              <w:t>Данные</w:t>
+              <w:rPr>
+                <w:lang w:val="en-US"/>
+              </w:rPr>
+            </w:pPr>
+            <w:r>
+              <w:rPr>
+                <w:lang w:val="en-US"/>
+              </w:rPr>
+              <w:t>A</w:t>
             </w:r>
           </w:p>
         </w:tc>
@@ -2032,9 +2064,15 @@
           <w:p>
             <w:pPr>
               <w:jc w:val="center"/>
-            </w:pPr>
-            <w:r>
-              <w:t>Данные</w:t>
+              <w:rPr>
+                <w:lang w:val="en-US"/>
+              </w:rPr>
+            </w:pPr>
+            <w:r>
+              <w:rPr>
+                <w:lang w:val="en-US"/>
+              </w:rPr>
+              <w:t>D</w:t>
             </w:r>
           </w:p>
         </w:tc>
@@ -2068,6 +2106,2484 @@
         <w:jc w:val="both"/>
       </w:pPr>
     </w:p>
+    <w:tbl>
+      <w:tblPr>
+        <w:tblStyle w:val="TableGrid"/>
+        <w:tblW w:w="0" w:type="auto"/>
+        <w:tblLook w:val="04A0" w:firstRow="1" w:lastRow="0" w:firstColumn="1" w:lastColumn="0" w:noHBand="0" w:noVBand="1"/>
+      </w:tblPr>
+      <w:tblGrid>
+        <w:gridCol w:w="836"/>
+        <w:gridCol w:w="736"/>
+        <w:gridCol w:w="617"/>
+        <w:gridCol w:w="732"/>
+        <w:gridCol w:w="732"/>
+        <w:gridCol w:w="745"/>
+        <w:gridCol w:w="681"/>
+        <w:gridCol w:w="732"/>
+        <w:gridCol w:w="718"/>
+        <w:gridCol w:w="1094"/>
+        <w:gridCol w:w="830"/>
+        <w:gridCol w:w="891"/>
+      </w:tblGrid>
+      <w:tr>
+        <w:tc>
+          <w:tcPr>
+            <w:tcW w:w="1572" w:type="dxa"/>
+            <w:gridSpan w:val="2"/>
+          </w:tcPr>
+          <w:p>
+            <w:pPr>
+              <w:jc w:val="both"/>
+              <w:rPr>
+                <w:sz w:val="22"/>
+                <w:szCs w:val="22"/>
+              </w:rPr>
+            </w:pPr>
+            <w:r>
+              <w:rPr>
+                <w:sz w:val="22"/>
+                <w:szCs w:val="22"/>
+              </w:rPr>
+              <w:lastRenderedPageBreak/>
+              <w:t>Выполняемая команда</w:t>
+            </w:r>
+          </w:p>
+        </w:tc>
+        <w:tc>
+          <w:tcPr>
+            <w:tcW w:w="6051" w:type="dxa"/>
+            <w:gridSpan w:val="8"/>
+          </w:tcPr>
+          <w:p>
+            <w:pPr>
+              <w:jc w:val="both"/>
+              <w:rPr>
+                <w:sz w:val="22"/>
+                <w:szCs w:val="22"/>
+              </w:rPr>
+            </w:pPr>
+            <w:r>
+              <w:rPr>
+                <w:sz w:val="22"/>
+                <w:szCs w:val="22"/>
+              </w:rPr>
+              <w:t>Содержимое регистров процессора после выполнения команды</w:t>
+            </w:r>
+          </w:p>
+        </w:tc>
+        <w:tc>
+          <w:tcPr>
+            <w:tcW w:w="1721" w:type="dxa"/>
+            <w:gridSpan w:val="2"/>
+          </w:tcPr>
+          <w:p>
+            <w:pPr>
+              <w:jc w:val="both"/>
+              <w:rPr>
+                <w:sz w:val="22"/>
+                <w:szCs w:val="22"/>
+              </w:rPr>
+            </w:pPr>
+            <w:r>
+              <w:rPr>
+                <w:sz w:val="22"/>
+                <w:szCs w:val="22"/>
+              </w:rPr>
+              <w:t>Ячейка, содержимое которой изменилось после новой выполнения команды</w:t>
+            </w:r>
+          </w:p>
+        </w:tc>
+      </w:tr>
+      <w:tr>
+        <w:tc>
+          <w:tcPr>
+            <w:tcW w:w="836" w:type="dxa"/>
+          </w:tcPr>
+          <w:p>
+            <w:pPr>
+              <w:jc w:val="both"/>
+              <w:rPr>
+                <w:sz w:val="22"/>
+                <w:szCs w:val="22"/>
+              </w:rPr>
+            </w:pPr>
+            <w:r>
+              <w:rPr>
+                <w:sz w:val="22"/>
+                <w:szCs w:val="22"/>
+              </w:rPr>
+              <w:t>Адрес</w:t>
+            </w:r>
+          </w:p>
+        </w:tc>
+        <w:tc>
+          <w:tcPr>
+            <w:tcW w:w="736" w:type="dxa"/>
+          </w:tcPr>
+          <w:p>
+            <w:pPr>
+              <w:jc w:val="both"/>
+              <w:rPr>
+                <w:sz w:val="22"/>
+                <w:szCs w:val="22"/>
+              </w:rPr>
+            </w:pPr>
+            <w:r>
+              <w:rPr>
+                <w:sz w:val="22"/>
+                <w:szCs w:val="22"/>
+              </w:rPr>
+              <w:t>Код</w:t>
+            </w:r>
+          </w:p>
+        </w:tc>
+        <w:tc>
+          <w:tcPr>
+            <w:tcW w:w="617" w:type="dxa"/>
+          </w:tcPr>
+          <w:p>
+            <w:pPr>
+              <w:jc w:val="both"/>
+              <w:rPr>
+                <w:sz w:val="22"/>
+                <w:szCs w:val="22"/>
+                <w:lang w:val="en-US"/>
+              </w:rPr>
+            </w:pPr>
+            <w:r>
+              <w:rPr>
+                <w:sz w:val="22"/>
+                <w:szCs w:val="22"/>
+                <w:lang w:val="en-US"/>
+              </w:rPr>
+              <w:t>IP</w:t>
+            </w:r>
+          </w:p>
+        </w:tc>
+        <w:tc>
+          <w:tcPr>
+            <w:tcW w:w="732" w:type="dxa"/>
+          </w:tcPr>
+          <w:p>
+            <w:pPr>
+              <w:jc w:val="both"/>
+              <w:rPr>
+                <w:sz w:val="22"/>
+                <w:szCs w:val="22"/>
+                <w:lang w:val="en-US"/>
+              </w:rPr>
+            </w:pPr>
+            <w:r>
+              <w:rPr>
+                <w:sz w:val="22"/>
+                <w:szCs w:val="22"/>
+                <w:lang w:val="en-US"/>
+              </w:rPr>
+              <w:t>CR</w:t>
+            </w:r>
+          </w:p>
+        </w:tc>
+        <w:tc>
+          <w:tcPr>
+            <w:tcW w:w="732" w:type="dxa"/>
+          </w:tcPr>
+          <w:p>
+            <w:pPr>
+              <w:jc w:val="both"/>
+              <w:rPr>
+                <w:sz w:val="22"/>
+                <w:szCs w:val="22"/>
+                <w:lang w:val="en-US"/>
+              </w:rPr>
+            </w:pPr>
+            <w:r>
+              <w:rPr>
+                <w:sz w:val="22"/>
+                <w:szCs w:val="22"/>
+                <w:lang w:val="en-US"/>
+              </w:rPr>
+              <w:t>AR</w:t>
+            </w:r>
+          </w:p>
+        </w:tc>
+        <w:tc>
+          <w:tcPr>
+            <w:tcW w:w="745" w:type="dxa"/>
+          </w:tcPr>
+          <w:p>
+            <w:pPr>
+              <w:jc w:val="both"/>
+              <w:rPr>
+                <w:sz w:val="22"/>
+                <w:szCs w:val="22"/>
+                <w:lang w:val="en-US"/>
+              </w:rPr>
+            </w:pPr>
+            <w:r>
+              <w:rPr>
+                <w:sz w:val="22"/>
+                <w:szCs w:val="22"/>
+                <w:lang w:val="en-US"/>
+              </w:rPr>
+              <w:t>DR</w:t>
+            </w:r>
+          </w:p>
+        </w:tc>
+        <w:tc>
+          <w:tcPr>
+            <w:tcW w:w="681" w:type="dxa"/>
+          </w:tcPr>
+          <w:p>
+            <w:pPr>
+              <w:jc w:val="both"/>
+              <w:rPr>
+                <w:sz w:val="22"/>
+                <w:szCs w:val="22"/>
+                <w:lang w:val="en-US"/>
+              </w:rPr>
+            </w:pPr>
+            <w:r>
+              <w:rPr>
+                <w:sz w:val="22"/>
+                <w:szCs w:val="22"/>
+                <w:lang w:val="en-US"/>
+              </w:rPr>
+              <w:t>SP</w:t>
+            </w:r>
+          </w:p>
+        </w:tc>
+        <w:tc>
+          <w:tcPr>
+            <w:tcW w:w="732" w:type="dxa"/>
+          </w:tcPr>
+          <w:p>
+            <w:pPr>
+              <w:jc w:val="both"/>
+              <w:rPr>
+                <w:sz w:val="22"/>
+                <w:szCs w:val="22"/>
+                <w:lang w:val="en-US"/>
+              </w:rPr>
+            </w:pPr>
+            <w:r>
+              <w:rPr>
+                <w:sz w:val="22"/>
+                <w:szCs w:val="22"/>
+                <w:lang w:val="en-US"/>
+              </w:rPr>
+              <w:t>BR</w:t>
+            </w:r>
+          </w:p>
+        </w:tc>
+        <w:tc>
+          <w:tcPr>
+            <w:tcW w:w="718" w:type="dxa"/>
+          </w:tcPr>
+          <w:p>
+            <w:pPr>
+              <w:jc w:val="both"/>
+              <w:rPr>
+                <w:sz w:val="22"/>
+                <w:szCs w:val="22"/>
+                <w:lang w:val="en-US"/>
+              </w:rPr>
+            </w:pPr>
+            <w:r>
+              <w:rPr>
+                <w:sz w:val="22"/>
+                <w:szCs w:val="22"/>
+                <w:lang w:val="en-US"/>
+              </w:rPr>
+              <w:t>AC</w:t>
+            </w:r>
+          </w:p>
+        </w:tc>
+        <w:tc>
+          <w:tcPr>
+            <w:tcW w:w="1094" w:type="dxa"/>
+          </w:tcPr>
+          <w:p>
+            <w:pPr>
+              <w:jc w:val="both"/>
+              <w:rPr>
+                <w:sz w:val="22"/>
+                <w:szCs w:val="22"/>
+                <w:lang w:val="en-US"/>
+              </w:rPr>
+            </w:pPr>
+            <w:r>
+              <w:rPr>
+                <w:sz w:val="22"/>
+                <w:szCs w:val="22"/>
+                <w:lang w:val="en-US"/>
+              </w:rPr>
+              <w:t>NZVC</w:t>
+            </w:r>
+          </w:p>
+        </w:tc>
+        <w:tc>
+          <w:tcPr>
+            <w:tcW w:w="830" w:type="dxa"/>
+          </w:tcPr>
+          <w:p>
+            <w:pPr>
+              <w:jc w:val="both"/>
+              <w:rPr>
+                <w:sz w:val="22"/>
+                <w:szCs w:val="22"/>
+              </w:rPr>
+            </w:pPr>
+            <w:r>
+              <w:rPr>
+                <w:sz w:val="22"/>
+                <w:szCs w:val="22"/>
+              </w:rPr>
+              <w:t>Адрес</w:t>
+            </w:r>
+          </w:p>
+        </w:tc>
+        <w:tc>
+          <w:tcPr>
+            <w:tcW w:w="891" w:type="dxa"/>
+          </w:tcPr>
+          <w:p>
+            <w:pPr>
+              <w:jc w:val="both"/>
+              <w:rPr>
+                <w:sz w:val="22"/>
+                <w:szCs w:val="22"/>
+              </w:rPr>
+            </w:pPr>
+            <w:r>
+              <w:rPr>
+                <w:sz w:val="22"/>
+                <w:szCs w:val="22"/>
+              </w:rPr>
+              <w:t>Новый код</w:t>
+            </w:r>
+          </w:p>
+        </w:tc>
+      </w:tr>
+      <w:tr>
+        <w:tc>
+          <w:tcPr>
+            <w:tcW w:w="836" w:type="dxa"/>
+          </w:tcPr>
+          <w:p>
+            <w:pPr>
+              <w:jc w:val="both"/>
+              <w:rPr>
+                <w:sz w:val="22"/>
+                <w:szCs w:val="22"/>
+                <w:lang w:val="en-US"/>
+              </w:rPr>
+            </w:pPr>
+            <w:r>
+              <w:rPr>
+                <w:sz w:val="22"/>
+                <w:szCs w:val="22"/>
+              </w:rPr>
+              <w:t>13</w:t>
+            </w:r>
+            <w:r>
+              <w:rPr>
+                <w:sz w:val="22"/>
+                <w:szCs w:val="22"/>
+                <w:lang w:val="en-US"/>
+              </w:rPr>
+              <w:t>A</w:t>
+            </w:r>
+          </w:p>
+        </w:tc>
+        <w:tc>
+          <w:tcPr>
+            <w:tcW w:w="736" w:type="dxa"/>
+          </w:tcPr>
+          <w:p>
+            <w:pPr>
+              <w:jc w:val="both"/>
+              <w:rPr>
+                <w:sz w:val="22"/>
+                <w:szCs w:val="22"/>
+              </w:rPr>
+            </w:pPr>
+            <w:r>
+              <w:rPr>
+                <w:sz w:val="22"/>
+                <w:szCs w:val="22"/>
+                <w:lang w:val="en-US"/>
+              </w:rPr>
+              <w:t>A144</w:t>
+            </w:r>
+          </w:p>
+        </w:tc>
+        <w:tc>
+          <w:tcPr>
+            <w:tcW w:w="617" w:type="dxa"/>
+          </w:tcPr>
+          <w:p>
+            <w:pPr>
+              <w:jc w:val="both"/>
+              <w:rPr>
+                <w:sz w:val="22"/>
+                <w:szCs w:val="22"/>
+              </w:rPr>
+            </w:pPr>
+            <w:r>
+              <w:rPr>
+                <w:sz w:val="22"/>
+                <w:szCs w:val="22"/>
+                <w:lang w:val="en-US"/>
+              </w:rPr>
+              <w:t>13B</w:t>
+            </w:r>
+          </w:p>
+        </w:tc>
+        <w:tc>
+          <w:tcPr>
+            <w:tcW w:w="732" w:type="dxa"/>
+          </w:tcPr>
+          <w:p>
+            <w:pPr>
+              <w:jc w:val="both"/>
+              <w:rPr>
+                <w:sz w:val="22"/>
+                <w:szCs w:val="22"/>
+              </w:rPr>
+            </w:pPr>
+            <w:r>
+              <w:rPr>
+                <w:sz w:val="22"/>
+                <w:szCs w:val="22"/>
+                <w:lang w:val="en-US"/>
+              </w:rPr>
+              <w:t>A144</w:t>
+            </w:r>
+          </w:p>
+        </w:tc>
+        <w:tc>
+          <w:tcPr>
+            <w:tcW w:w="732" w:type="dxa"/>
+          </w:tcPr>
+          <w:p>
+            <w:pPr>
+              <w:jc w:val="both"/>
+              <w:rPr>
+                <w:sz w:val="22"/>
+                <w:szCs w:val="22"/>
+              </w:rPr>
+            </w:pPr>
+            <w:r>
+              <w:rPr>
+                <w:sz w:val="22"/>
+                <w:szCs w:val="22"/>
+              </w:rPr>
+              <w:t>0144</w:t>
+            </w:r>
+          </w:p>
+        </w:tc>
+        <w:tc>
+          <w:tcPr>
+            <w:tcW w:w="745" w:type="dxa"/>
+          </w:tcPr>
+          <w:p>
+            <w:pPr>
+              <w:jc w:val="both"/>
+              <w:rPr>
+                <w:sz w:val="22"/>
+                <w:szCs w:val="22"/>
+                <w:lang w:val="en-US"/>
+              </w:rPr>
+            </w:pPr>
+            <w:r>
+              <w:rPr>
+                <w:sz w:val="22"/>
+                <w:szCs w:val="22"/>
+                <w:lang w:val="en-US"/>
+              </w:rPr>
+              <w:t>E143</w:t>
+            </w:r>
+          </w:p>
+        </w:tc>
+        <w:tc>
+          <w:tcPr>
+            <w:tcW w:w="681" w:type="dxa"/>
+          </w:tcPr>
+          <w:p>
+            <w:pPr>
+              <w:jc w:val="both"/>
+              <w:rPr>
+                <w:sz w:val="22"/>
+                <w:szCs w:val="22"/>
+                <w:lang w:val="en-US"/>
+              </w:rPr>
+            </w:pPr>
+            <w:r>
+              <w:rPr>
+                <w:sz w:val="22"/>
+                <w:szCs w:val="22"/>
+                <w:lang w:val="en-US"/>
+              </w:rPr>
+              <w:t>0000</w:t>
+            </w:r>
+          </w:p>
+        </w:tc>
+        <w:tc>
+          <w:tcPr>
+            <w:tcW w:w="732" w:type="dxa"/>
+          </w:tcPr>
+          <w:p>
+            <w:pPr>
+              <w:jc w:val="both"/>
+              <w:rPr>
+                <w:sz w:val="22"/>
+                <w:szCs w:val="22"/>
+                <w:lang w:val="en-US"/>
+              </w:rPr>
+            </w:pPr>
+            <w:r>
+              <w:rPr>
+                <w:sz w:val="22"/>
+                <w:szCs w:val="22"/>
+                <w:lang w:val="en-US"/>
+              </w:rPr>
+              <w:t>013A</w:t>
+            </w:r>
+          </w:p>
+        </w:tc>
+        <w:tc>
+          <w:tcPr>
+            <w:tcW w:w="718" w:type="dxa"/>
+          </w:tcPr>
+          <w:p>
+            <w:pPr>
+              <w:jc w:val="both"/>
+              <w:rPr>
+                <w:sz w:val="22"/>
+                <w:szCs w:val="22"/>
+                <w:lang w:val="en-US"/>
+              </w:rPr>
+            </w:pPr>
+            <w:r>
+              <w:rPr>
+                <w:sz w:val="22"/>
+                <w:szCs w:val="22"/>
+                <w:lang w:val="en-US"/>
+              </w:rPr>
+              <w:t>E143</w:t>
+            </w:r>
+          </w:p>
+        </w:tc>
+        <w:tc>
+          <w:tcPr>
+            <w:tcW w:w="1094" w:type="dxa"/>
+          </w:tcPr>
+          <w:p>
+            <w:pPr>
+              <w:jc w:val="both"/>
+              <w:rPr>
+                <w:sz w:val="22"/>
+                <w:szCs w:val="22"/>
+                <w:lang w:val="en-US"/>
+              </w:rPr>
+            </w:pPr>
+            <w:r>
+              <w:rPr>
+                <w:sz w:val="22"/>
+                <w:szCs w:val="22"/>
+                <w:lang w:val="en-US"/>
+              </w:rPr>
+              <w:t>1000</w:t>
+            </w:r>
+          </w:p>
+        </w:tc>
+        <w:tc>
+          <w:tcPr>
+            <w:tcW w:w="830" w:type="dxa"/>
+          </w:tcPr>
+          <w:p>
+            <w:pPr>
+              <w:jc w:val="both"/>
+              <w:rPr>
+                <w:sz w:val="22"/>
+                <w:szCs w:val="22"/>
+              </w:rPr>
+            </w:pPr>
+          </w:p>
+        </w:tc>
+        <w:tc>
+          <w:tcPr>
+            <w:tcW w:w="891" w:type="dxa"/>
+          </w:tcPr>
+          <w:p>
+            <w:pPr>
+              <w:jc w:val="both"/>
+              <w:rPr>
+                <w:sz w:val="22"/>
+                <w:szCs w:val="22"/>
+              </w:rPr>
+            </w:pPr>
+          </w:p>
+        </w:tc>
+      </w:tr>
+      <w:tr>
+        <w:tc>
+          <w:tcPr>
+            <w:tcW w:w="836" w:type="dxa"/>
+          </w:tcPr>
+          <w:p>
+            <w:pPr>
+              <w:jc w:val="both"/>
+              <w:rPr>
+                <w:sz w:val="22"/>
+                <w:szCs w:val="22"/>
+                <w:lang w:val="en-US"/>
+              </w:rPr>
+            </w:pPr>
+            <w:r>
+              <w:rPr>
+                <w:sz w:val="22"/>
+                <w:szCs w:val="22"/>
+                <w:lang w:val="en-US"/>
+              </w:rPr>
+              <w:t>13B</w:t>
+            </w:r>
+          </w:p>
+        </w:tc>
+        <w:tc>
+          <w:tcPr>
+            <w:tcW w:w="736" w:type="dxa"/>
+          </w:tcPr>
+          <w:p>
+            <w:pPr>
+              <w:jc w:val="both"/>
+              <w:rPr>
+                <w:sz w:val="22"/>
+                <w:szCs w:val="22"/>
+              </w:rPr>
+            </w:pPr>
+            <w:r>
+              <w:rPr>
+                <w:sz w:val="22"/>
+                <w:szCs w:val="22"/>
+                <w:lang w:val="en-US"/>
+              </w:rPr>
+              <w:t>2142</w:t>
+            </w:r>
+          </w:p>
+        </w:tc>
+        <w:tc>
+          <w:tcPr>
+            <w:tcW w:w="617" w:type="dxa"/>
+          </w:tcPr>
+          <w:p>
+            <w:pPr>
+              <w:jc w:val="both"/>
+              <w:rPr>
+                <w:sz w:val="22"/>
+                <w:szCs w:val="22"/>
+              </w:rPr>
+            </w:pPr>
+            <w:r>
+              <w:rPr>
+                <w:sz w:val="22"/>
+                <w:szCs w:val="22"/>
+                <w:lang w:val="en-US"/>
+              </w:rPr>
+              <w:t>13C</w:t>
+            </w:r>
+          </w:p>
+        </w:tc>
+        <w:tc>
+          <w:tcPr>
+            <w:tcW w:w="732" w:type="dxa"/>
+          </w:tcPr>
+          <w:p>
+            <w:pPr>
+              <w:jc w:val="both"/>
+              <w:rPr>
+                <w:sz w:val="22"/>
+                <w:szCs w:val="22"/>
+              </w:rPr>
+            </w:pPr>
+            <w:r>
+              <w:rPr>
+                <w:sz w:val="22"/>
+                <w:szCs w:val="22"/>
+                <w:lang w:val="en-US"/>
+              </w:rPr>
+              <w:t>2142</w:t>
+            </w:r>
+          </w:p>
+        </w:tc>
+        <w:tc>
+          <w:tcPr>
+            <w:tcW w:w="732" w:type="dxa"/>
+          </w:tcPr>
+          <w:p>
+            <w:pPr>
+              <w:jc w:val="both"/>
+              <w:rPr>
+                <w:sz w:val="22"/>
+                <w:szCs w:val="22"/>
+              </w:rPr>
+            </w:pPr>
+            <w:r>
+              <w:rPr>
+                <w:sz w:val="22"/>
+                <w:szCs w:val="22"/>
+              </w:rPr>
+              <w:t>0142</w:t>
+            </w:r>
+          </w:p>
+        </w:tc>
+        <w:tc>
+          <w:tcPr>
+            <w:tcW w:w="745" w:type="dxa"/>
+          </w:tcPr>
+          <w:p>
+            <w:pPr>
+              <w:jc w:val="both"/>
+              <w:rPr>
+                <w:sz w:val="22"/>
+                <w:szCs w:val="22"/>
+                <w:lang w:val="en-US"/>
+              </w:rPr>
+            </w:pPr>
+            <w:r>
+              <w:rPr>
+                <w:sz w:val="22"/>
+                <w:szCs w:val="22"/>
+                <w:lang w:val="en-US"/>
+              </w:rPr>
+              <w:t>E139</w:t>
+            </w:r>
+          </w:p>
+        </w:tc>
+        <w:tc>
+          <w:tcPr>
+            <w:tcW w:w="681" w:type="dxa"/>
+          </w:tcPr>
+          <w:p>
+            <w:pPr>
+              <w:jc w:val="both"/>
+              <w:rPr>
+                <w:sz w:val="22"/>
+                <w:szCs w:val="22"/>
+              </w:rPr>
+            </w:pPr>
+            <w:r>
+              <w:rPr>
+                <w:sz w:val="22"/>
+                <w:szCs w:val="22"/>
+                <w:lang w:val="en-US"/>
+              </w:rPr>
+              <w:t>0000</w:t>
+            </w:r>
+          </w:p>
+        </w:tc>
+        <w:tc>
+          <w:tcPr>
+            <w:tcW w:w="732" w:type="dxa"/>
+          </w:tcPr>
+          <w:p>
+            <w:pPr>
+              <w:jc w:val="both"/>
+              <w:rPr>
+                <w:sz w:val="22"/>
+                <w:szCs w:val="22"/>
+                <w:lang w:val="en-US"/>
+              </w:rPr>
+            </w:pPr>
+            <w:r>
+              <w:rPr>
+                <w:sz w:val="22"/>
+                <w:szCs w:val="22"/>
+                <w:lang w:val="en-US"/>
+              </w:rPr>
+              <w:t>013B</w:t>
+            </w:r>
+          </w:p>
+        </w:tc>
+        <w:tc>
+          <w:tcPr>
+            <w:tcW w:w="718" w:type="dxa"/>
+          </w:tcPr>
+          <w:p>
+            <w:pPr>
+              <w:jc w:val="both"/>
+              <w:rPr>
+                <w:sz w:val="22"/>
+                <w:szCs w:val="22"/>
+                <w:lang w:val="en-US"/>
+              </w:rPr>
+            </w:pPr>
+            <w:r>
+              <w:rPr>
+                <w:sz w:val="22"/>
+                <w:szCs w:val="22"/>
+                <w:lang w:val="en-US"/>
+              </w:rPr>
+              <w:t>E101</w:t>
+            </w:r>
+          </w:p>
+        </w:tc>
+        <w:tc>
+          <w:tcPr>
+            <w:tcW w:w="1094" w:type="dxa"/>
+          </w:tcPr>
+          <w:p>
+            <w:pPr>
+              <w:jc w:val="both"/>
+              <w:rPr>
+                <w:sz w:val="22"/>
+                <w:szCs w:val="22"/>
+                <w:lang w:val="en-US"/>
+              </w:rPr>
+            </w:pPr>
+            <w:r>
+              <w:rPr>
+                <w:sz w:val="22"/>
+                <w:szCs w:val="22"/>
+                <w:lang w:val="en-US"/>
+              </w:rPr>
+              <w:t>1000</w:t>
+            </w:r>
+          </w:p>
+        </w:tc>
+        <w:tc>
+          <w:tcPr>
+            <w:tcW w:w="830" w:type="dxa"/>
+          </w:tcPr>
+          <w:p>
+            <w:pPr>
+              <w:jc w:val="both"/>
+              <w:rPr>
+                <w:sz w:val="22"/>
+                <w:szCs w:val="22"/>
+              </w:rPr>
+            </w:pPr>
+          </w:p>
+        </w:tc>
+        <w:tc>
+          <w:tcPr>
+            <w:tcW w:w="891" w:type="dxa"/>
+          </w:tcPr>
+          <w:p>
+            <w:pPr>
+              <w:jc w:val="both"/>
+              <w:rPr>
+                <w:sz w:val="22"/>
+                <w:szCs w:val="22"/>
+              </w:rPr>
+            </w:pPr>
+          </w:p>
+        </w:tc>
+      </w:tr>
+      <w:tr>
+        <w:tc>
+          <w:tcPr>
+            <w:tcW w:w="836" w:type="dxa"/>
+          </w:tcPr>
+          <w:p>
+            <w:pPr>
+              <w:jc w:val="both"/>
+              <w:rPr>
+                <w:sz w:val="22"/>
+                <w:szCs w:val="22"/>
+                <w:lang w:val="en-US"/>
+              </w:rPr>
+            </w:pPr>
+            <w:r>
+              <w:rPr>
+                <w:sz w:val="22"/>
+                <w:szCs w:val="22"/>
+                <w:lang w:val="en-US"/>
+              </w:rPr>
+              <w:t>13C</w:t>
+            </w:r>
+          </w:p>
+        </w:tc>
+        <w:tc>
+          <w:tcPr>
+            <w:tcW w:w="736" w:type="dxa"/>
+          </w:tcPr>
+          <w:p>
+            <w:pPr>
+              <w:jc w:val="both"/>
+              <w:rPr>
+                <w:sz w:val="22"/>
+                <w:szCs w:val="22"/>
+              </w:rPr>
+            </w:pPr>
+            <w:r>
+              <w:rPr>
+                <w:sz w:val="22"/>
+                <w:szCs w:val="22"/>
+                <w:lang w:val="en-US"/>
+              </w:rPr>
+              <w:t>E139</w:t>
+            </w:r>
+          </w:p>
+        </w:tc>
+        <w:tc>
+          <w:tcPr>
+            <w:tcW w:w="617" w:type="dxa"/>
+          </w:tcPr>
+          <w:p>
+            <w:pPr>
+              <w:jc w:val="both"/>
+              <w:rPr>
+                <w:sz w:val="22"/>
+                <w:szCs w:val="22"/>
+              </w:rPr>
+            </w:pPr>
+            <w:r>
+              <w:rPr>
+                <w:sz w:val="22"/>
+                <w:szCs w:val="22"/>
+                <w:lang w:val="en-US"/>
+              </w:rPr>
+              <w:t>13D</w:t>
+            </w:r>
+          </w:p>
+        </w:tc>
+        <w:tc>
+          <w:tcPr>
+            <w:tcW w:w="732" w:type="dxa"/>
+          </w:tcPr>
+          <w:p>
+            <w:pPr>
+              <w:jc w:val="both"/>
+              <w:rPr>
+                <w:sz w:val="22"/>
+                <w:szCs w:val="22"/>
+              </w:rPr>
+            </w:pPr>
+            <w:r>
+              <w:rPr>
+                <w:sz w:val="22"/>
+                <w:szCs w:val="22"/>
+                <w:lang w:val="en-US"/>
+              </w:rPr>
+              <w:t>E139</w:t>
+            </w:r>
+          </w:p>
+        </w:tc>
+        <w:tc>
+          <w:tcPr>
+            <w:tcW w:w="732" w:type="dxa"/>
+          </w:tcPr>
+          <w:p>
+            <w:pPr>
+              <w:jc w:val="both"/>
+              <w:rPr>
+                <w:sz w:val="22"/>
+                <w:szCs w:val="22"/>
+              </w:rPr>
+            </w:pPr>
+            <w:r>
+              <w:rPr>
+                <w:sz w:val="22"/>
+                <w:szCs w:val="22"/>
+              </w:rPr>
+              <w:t>0139</w:t>
+            </w:r>
+          </w:p>
+        </w:tc>
+        <w:tc>
+          <w:tcPr>
+            <w:tcW w:w="745" w:type="dxa"/>
+          </w:tcPr>
+          <w:p>
+            <w:pPr>
+              <w:jc w:val="both"/>
+              <w:rPr>
+                <w:sz w:val="22"/>
+                <w:szCs w:val="22"/>
+                <w:lang w:val="en-US"/>
+              </w:rPr>
+            </w:pPr>
+            <w:r>
+              <w:rPr>
+                <w:sz w:val="22"/>
+                <w:szCs w:val="22"/>
+                <w:lang w:val="en-US"/>
+              </w:rPr>
+              <w:t>E101</w:t>
+            </w:r>
+          </w:p>
+        </w:tc>
+        <w:tc>
+          <w:tcPr>
+            <w:tcW w:w="681" w:type="dxa"/>
+          </w:tcPr>
+          <w:p>
+            <w:pPr>
+              <w:jc w:val="both"/>
+              <w:rPr>
+                <w:sz w:val="22"/>
+                <w:szCs w:val="22"/>
+              </w:rPr>
+            </w:pPr>
+            <w:r>
+              <w:rPr>
+                <w:sz w:val="22"/>
+                <w:szCs w:val="22"/>
+                <w:lang w:val="en-US"/>
+              </w:rPr>
+              <w:t>0000</w:t>
+            </w:r>
+          </w:p>
+        </w:tc>
+        <w:tc>
+          <w:tcPr>
+            <w:tcW w:w="732" w:type="dxa"/>
+          </w:tcPr>
+          <w:p>
+            <w:pPr>
+              <w:jc w:val="both"/>
+              <w:rPr>
+                <w:sz w:val="22"/>
+                <w:szCs w:val="22"/>
+                <w:lang w:val="en-US"/>
+              </w:rPr>
+            </w:pPr>
+            <w:r>
+              <w:rPr>
+                <w:sz w:val="22"/>
+                <w:szCs w:val="22"/>
+                <w:lang w:val="en-US"/>
+              </w:rPr>
+              <w:t>013C</w:t>
+            </w:r>
+          </w:p>
+        </w:tc>
+        <w:tc>
+          <w:tcPr>
+            <w:tcW w:w="718" w:type="dxa"/>
+          </w:tcPr>
+          <w:p>
+            <w:pPr>
+              <w:jc w:val="both"/>
+              <w:rPr>
+                <w:sz w:val="22"/>
+                <w:szCs w:val="22"/>
+                <w:lang w:val="en-US"/>
+              </w:rPr>
+            </w:pPr>
+            <w:r>
+              <w:rPr>
+                <w:sz w:val="22"/>
+                <w:szCs w:val="22"/>
+                <w:lang w:val="en-US"/>
+              </w:rPr>
+              <w:t>E101</w:t>
+            </w:r>
+          </w:p>
+        </w:tc>
+        <w:tc>
+          <w:tcPr>
+            <w:tcW w:w="1094" w:type="dxa"/>
+          </w:tcPr>
+          <w:p>
+            <w:pPr>
+              <w:jc w:val="both"/>
+              <w:rPr>
+                <w:sz w:val="22"/>
+                <w:szCs w:val="22"/>
+                <w:lang w:val="en-US"/>
+              </w:rPr>
+            </w:pPr>
+            <w:r>
+              <w:rPr>
+                <w:sz w:val="22"/>
+                <w:szCs w:val="22"/>
+                <w:lang w:val="en-US"/>
+              </w:rPr>
+              <w:t>1000</w:t>
+            </w:r>
+          </w:p>
+        </w:tc>
+        <w:tc>
+          <w:tcPr>
+            <w:tcW w:w="830" w:type="dxa"/>
+          </w:tcPr>
+          <w:p>
+            <w:pPr>
+              <w:jc w:val="both"/>
+              <w:rPr>
+                <w:sz w:val="22"/>
+                <w:szCs w:val="22"/>
+                <w:lang w:val="en-US"/>
+              </w:rPr>
+            </w:pPr>
+            <w:r>
+              <w:rPr>
+                <w:sz w:val="22"/>
+                <w:szCs w:val="22"/>
+                <w:lang w:val="en-US"/>
+              </w:rPr>
+              <w:t>139</w:t>
+            </w:r>
+          </w:p>
+        </w:tc>
+        <w:tc>
+          <w:tcPr>
+            <w:tcW w:w="891" w:type="dxa"/>
+          </w:tcPr>
+          <w:p>
+            <w:pPr>
+              <w:jc w:val="both"/>
+              <w:rPr>
+                <w:sz w:val="22"/>
+                <w:szCs w:val="22"/>
+                <w:lang w:val="en-US"/>
+              </w:rPr>
+            </w:pPr>
+            <w:r>
+              <w:rPr>
+                <w:sz w:val="22"/>
+                <w:szCs w:val="22"/>
+                <w:lang w:val="en-US"/>
+              </w:rPr>
+              <w:t>E101</w:t>
+            </w:r>
+          </w:p>
+        </w:tc>
+      </w:tr>
+      <w:tr>
+        <w:tc>
+          <w:tcPr>
+            <w:tcW w:w="836" w:type="dxa"/>
+          </w:tcPr>
+          <w:p>
+            <w:pPr>
+              <w:jc w:val="both"/>
+              <w:rPr>
+                <w:sz w:val="22"/>
+                <w:szCs w:val="22"/>
+                <w:lang w:val="en-US"/>
+              </w:rPr>
+            </w:pPr>
+            <w:r>
+              <w:rPr>
+                <w:sz w:val="22"/>
+                <w:szCs w:val="22"/>
+                <w:lang w:val="en-US"/>
+              </w:rPr>
+              <w:t>13D</w:t>
+            </w:r>
+          </w:p>
+        </w:tc>
+        <w:tc>
+          <w:tcPr>
+            <w:tcW w:w="736" w:type="dxa"/>
+          </w:tcPr>
+          <w:p>
+            <w:pPr>
+              <w:jc w:val="both"/>
+              <w:rPr>
+                <w:sz w:val="22"/>
+                <w:szCs w:val="22"/>
+              </w:rPr>
+            </w:pPr>
+            <w:r>
+              <w:rPr>
+                <w:sz w:val="22"/>
+                <w:szCs w:val="22"/>
+                <w:lang w:val="en-US"/>
+              </w:rPr>
+              <w:t>0200</w:t>
+            </w:r>
+          </w:p>
+        </w:tc>
+        <w:tc>
+          <w:tcPr>
+            <w:tcW w:w="617" w:type="dxa"/>
+          </w:tcPr>
+          <w:p>
+            <w:pPr>
+              <w:jc w:val="both"/>
+              <w:rPr>
+                <w:sz w:val="22"/>
+                <w:szCs w:val="22"/>
+              </w:rPr>
+            </w:pPr>
+            <w:r>
+              <w:rPr>
+                <w:sz w:val="22"/>
+                <w:szCs w:val="22"/>
+                <w:lang w:val="en-US"/>
+              </w:rPr>
+              <w:t>13E</w:t>
+            </w:r>
+          </w:p>
+        </w:tc>
+        <w:tc>
+          <w:tcPr>
+            <w:tcW w:w="732" w:type="dxa"/>
+          </w:tcPr>
+          <w:p>
+            <w:pPr>
+              <w:jc w:val="both"/>
+              <w:rPr>
+                <w:sz w:val="22"/>
+                <w:szCs w:val="22"/>
+              </w:rPr>
+            </w:pPr>
+            <w:r>
+              <w:rPr>
+                <w:sz w:val="22"/>
+                <w:szCs w:val="22"/>
+                <w:lang w:val="en-US"/>
+              </w:rPr>
+              <w:t>0200</w:t>
+            </w:r>
+          </w:p>
+        </w:tc>
+        <w:tc>
+          <w:tcPr>
+            <w:tcW w:w="732" w:type="dxa"/>
+          </w:tcPr>
+          <w:p>
+            <w:pPr>
+              <w:jc w:val="both"/>
+              <w:rPr>
+                <w:sz w:val="22"/>
+                <w:szCs w:val="22"/>
+                <w:lang w:val="en-US"/>
+              </w:rPr>
+            </w:pPr>
+            <w:r>
+              <w:rPr>
+                <w:sz w:val="22"/>
+                <w:szCs w:val="22"/>
+              </w:rPr>
+              <w:t>013</w:t>
+            </w:r>
+            <w:r>
+              <w:rPr>
+                <w:sz w:val="22"/>
+                <w:szCs w:val="22"/>
+                <w:lang w:val="en-US"/>
+              </w:rPr>
+              <w:t>D</w:t>
+            </w:r>
+          </w:p>
+        </w:tc>
+        <w:tc>
+          <w:tcPr>
+            <w:tcW w:w="745" w:type="dxa"/>
+          </w:tcPr>
+          <w:p>
+            <w:pPr>
+              <w:jc w:val="both"/>
+              <w:rPr>
+                <w:sz w:val="22"/>
+                <w:szCs w:val="22"/>
+                <w:lang w:val="en-US"/>
+              </w:rPr>
+            </w:pPr>
+            <w:r>
+              <w:rPr>
+                <w:sz w:val="22"/>
+                <w:szCs w:val="22"/>
+                <w:lang w:val="en-US"/>
+              </w:rPr>
+              <w:t>0100</w:t>
+            </w:r>
+          </w:p>
+        </w:tc>
+        <w:tc>
+          <w:tcPr>
+            <w:tcW w:w="681" w:type="dxa"/>
+          </w:tcPr>
+          <w:p>
+            <w:pPr>
+              <w:jc w:val="both"/>
+              <w:rPr>
+                <w:sz w:val="22"/>
+                <w:szCs w:val="22"/>
+              </w:rPr>
+            </w:pPr>
+            <w:r>
+              <w:rPr>
+                <w:sz w:val="22"/>
+                <w:szCs w:val="22"/>
+                <w:lang w:val="en-US"/>
+              </w:rPr>
+              <w:t>0000</w:t>
+            </w:r>
+          </w:p>
+        </w:tc>
+        <w:tc>
+          <w:tcPr>
+            <w:tcW w:w="732" w:type="dxa"/>
+          </w:tcPr>
+          <w:p>
+            <w:pPr>
+              <w:jc w:val="both"/>
+              <w:rPr>
+                <w:sz w:val="22"/>
+                <w:szCs w:val="22"/>
+                <w:lang w:val="en-US"/>
+              </w:rPr>
+            </w:pPr>
+            <w:r>
+              <w:rPr>
+                <w:sz w:val="22"/>
+                <w:szCs w:val="22"/>
+                <w:lang w:val="en-US"/>
+              </w:rPr>
+              <w:t>013D</w:t>
+            </w:r>
+          </w:p>
+        </w:tc>
+        <w:tc>
+          <w:tcPr>
+            <w:tcW w:w="718" w:type="dxa"/>
+          </w:tcPr>
+          <w:p>
+            <w:pPr>
+              <w:jc w:val="both"/>
+              <w:rPr>
+                <w:sz w:val="22"/>
+                <w:szCs w:val="22"/>
+                <w:lang w:val="en-US"/>
+              </w:rPr>
+            </w:pPr>
+            <w:r>
+              <w:rPr>
+                <w:sz w:val="22"/>
+                <w:szCs w:val="22"/>
+                <w:lang w:val="en-US"/>
+              </w:rPr>
+              <w:t>0000</w:t>
+            </w:r>
+          </w:p>
+        </w:tc>
+        <w:tc>
+          <w:tcPr>
+            <w:tcW w:w="1094" w:type="dxa"/>
+          </w:tcPr>
+          <w:p>
+            <w:pPr>
+              <w:jc w:val="both"/>
+              <w:rPr>
+                <w:sz w:val="22"/>
+                <w:szCs w:val="22"/>
+                <w:lang w:val="en-US"/>
+              </w:rPr>
+            </w:pPr>
+            <w:r>
+              <w:rPr>
+                <w:sz w:val="22"/>
+                <w:szCs w:val="22"/>
+                <w:lang w:val="en-US"/>
+              </w:rPr>
+              <w:t>0100</w:t>
+            </w:r>
+          </w:p>
+        </w:tc>
+        <w:tc>
+          <w:tcPr>
+            <w:tcW w:w="830" w:type="dxa"/>
+          </w:tcPr>
+          <w:p>
+            <w:pPr>
+              <w:jc w:val="both"/>
+              <w:rPr>
+                <w:sz w:val="22"/>
+                <w:szCs w:val="22"/>
+              </w:rPr>
+            </w:pPr>
+          </w:p>
+        </w:tc>
+        <w:tc>
+          <w:tcPr>
+            <w:tcW w:w="891" w:type="dxa"/>
+          </w:tcPr>
+          <w:p>
+            <w:pPr>
+              <w:jc w:val="both"/>
+              <w:rPr>
+                <w:sz w:val="22"/>
+                <w:szCs w:val="22"/>
+              </w:rPr>
+            </w:pPr>
+          </w:p>
+        </w:tc>
+      </w:tr>
+      <w:tr>
+        <w:tc>
+          <w:tcPr>
+            <w:tcW w:w="836" w:type="dxa"/>
+          </w:tcPr>
+          <w:p>
+            <w:pPr>
+              <w:jc w:val="both"/>
+              <w:rPr>
+                <w:sz w:val="22"/>
+                <w:szCs w:val="22"/>
+                <w:lang w:val="en-US"/>
+              </w:rPr>
+            </w:pPr>
+            <w:r>
+              <w:rPr>
+                <w:sz w:val="22"/>
+                <w:szCs w:val="22"/>
+                <w:lang w:val="en-US"/>
+              </w:rPr>
+              <w:t>13E</w:t>
+            </w:r>
+          </w:p>
+        </w:tc>
+        <w:tc>
+          <w:tcPr>
+            <w:tcW w:w="736" w:type="dxa"/>
+          </w:tcPr>
+          <w:p>
+            <w:pPr>
+              <w:jc w:val="both"/>
+              <w:rPr>
+                <w:sz w:val="22"/>
+                <w:szCs w:val="22"/>
+              </w:rPr>
+            </w:pPr>
+            <w:r>
+              <w:rPr>
+                <w:sz w:val="22"/>
+                <w:szCs w:val="22"/>
+                <w:lang w:val="en-US"/>
+              </w:rPr>
+              <w:t>6145</w:t>
+            </w:r>
+          </w:p>
+        </w:tc>
+        <w:tc>
+          <w:tcPr>
+            <w:tcW w:w="617" w:type="dxa"/>
+          </w:tcPr>
+          <w:p>
+            <w:pPr>
+              <w:jc w:val="both"/>
+              <w:rPr>
+                <w:sz w:val="22"/>
+                <w:szCs w:val="22"/>
+              </w:rPr>
+            </w:pPr>
+            <w:r>
+              <w:rPr>
+                <w:sz w:val="22"/>
+                <w:szCs w:val="22"/>
+                <w:lang w:val="en-US"/>
+              </w:rPr>
+              <w:t>13F</w:t>
+            </w:r>
+          </w:p>
+        </w:tc>
+        <w:tc>
+          <w:tcPr>
+            <w:tcW w:w="732" w:type="dxa"/>
+          </w:tcPr>
+          <w:p>
+            <w:pPr>
+              <w:jc w:val="both"/>
+              <w:rPr>
+                <w:sz w:val="22"/>
+                <w:szCs w:val="22"/>
+              </w:rPr>
+            </w:pPr>
+            <w:r>
+              <w:rPr>
+                <w:sz w:val="22"/>
+                <w:szCs w:val="22"/>
+                <w:lang w:val="en-US"/>
+              </w:rPr>
+              <w:t>6145</w:t>
+            </w:r>
+          </w:p>
+        </w:tc>
+        <w:tc>
+          <w:tcPr>
+            <w:tcW w:w="732" w:type="dxa"/>
+          </w:tcPr>
+          <w:p>
+            <w:pPr>
+              <w:jc w:val="both"/>
+              <w:rPr>
+                <w:sz w:val="22"/>
+                <w:szCs w:val="22"/>
+                <w:lang w:val="en-US"/>
+              </w:rPr>
+            </w:pPr>
+            <w:r>
+              <w:rPr>
+                <w:sz w:val="22"/>
+                <w:szCs w:val="22"/>
+                <w:lang w:val="en-US"/>
+              </w:rPr>
+              <w:t>0145</w:t>
+            </w:r>
+          </w:p>
+        </w:tc>
+        <w:tc>
+          <w:tcPr>
+            <w:tcW w:w="745" w:type="dxa"/>
+          </w:tcPr>
+          <w:p>
+            <w:pPr>
+              <w:jc w:val="both"/>
+              <w:rPr>
+                <w:sz w:val="22"/>
+                <w:szCs w:val="22"/>
+                <w:lang w:val="en-US"/>
+              </w:rPr>
+            </w:pPr>
+            <w:r>
+              <w:rPr>
+                <w:sz w:val="22"/>
+                <w:szCs w:val="22"/>
+                <w:lang w:val="en-US"/>
+              </w:rPr>
+              <w:t>0100</w:t>
+            </w:r>
+          </w:p>
+        </w:tc>
+        <w:tc>
+          <w:tcPr>
+            <w:tcW w:w="681" w:type="dxa"/>
+          </w:tcPr>
+          <w:p>
+            <w:pPr>
+              <w:jc w:val="both"/>
+              <w:rPr>
+                <w:sz w:val="22"/>
+                <w:szCs w:val="22"/>
+              </w:rPr>
+            </w:pPr>
+            <w:r>
+              <w:rPr>
+                <w:sz w:val="22"/>
+                <w:szCs w:val="22"/>
+                <w:lang w:val="en-US"/>
+              </w:rPr>
+              <w:t>0000</w:t>
+            </w:r>
+          </w:p>
+        </w:tc>
+        <w:tc>
+          <w:tcPr>
+            <w:tcW w:w="732" w:type="dxa"/>
+          </w:tcPr>
+          <w:p>
+            <w:pPr>
+              <w:jc w:val="both"/>
+              <w:rPr>
+                <w:sz w:val="22"/>
+                <w:szCs w:val="22"/>
+                <w:lang w:val="en-US"/>
+              </w:rPr>
+            </w:pPr>
+            <w:r>
+              <w:rPr>
+                <w:sz w:val="22"/>
+                <w:szCs w:val="22"/>
+                <w:lang w:val="en-US"/>
+              </w:rPr>
+              <w:t>013E</w:t>
+            </w:r>
+          </w:p>
+        </w:tc>
+        <w:tc>
+          <w:tcPr>
+            <w:tcW w:w="718" w:type="dxa"/>
+          </w:tcPr>
+          <w:p>
+            <w:pPr>
+              <w:jc w:val="both"/>
+              <w:rPr>
+                <w:sz w:val="22"/>
+                <w:szCs w:val="22"/>
+                <w:lang w:val="en-US"/>
+              </w:rPr>
+            </w:pPr>
+            <w:r>
+              <w:rPr>
+                <w:sz w:val="22"/>
+                <w:szCs w:val="22"/>
+                <w:lang w:val="en-US"/>
+              </w:rPr>
+              <w:t>FE00</w:t>
+            </w:r>
+          </w:p>
+        </w:tc>
+        <w:tc>
+          <w:tcPr>
+            <w:tcW w:w="1094" w:type="dxa"/>
+          </w:tcPr>
+          <w:p>
+            <w:pPr>
+              <w:jc w:val="both"/>
+              <w:rPr>
+                <w:sz w:val="22"/>
+                <w:szCs w:val="22"/>
+                <w:lang w:val="en-US"/>
+              </w:rPr>
+            </w:pPr>
+            <w:r>
+              <w:rPr>
+                <w:sz w:val="22"/>
+                <w:szCs w:val="22"/>
+                <w:lang w:val="en-US"/>
+              </w:rPr>
+              <w:t>1000</w:t>
+            </w:r>
+          </w:p>
+        </w:tc>
+        <w:tc>
+          <w:tcPr>
+            <w:tcW w:w="830" w:type="dxa"/>
+          </w:tcPr>
+          <w:p>
+            <w:pPr>
+              <w:jc w:val="both"/>
+              <w:rPr>
+                <w:sz w:val="22"/>
+                <w:szCs w:val="22"/>
+              </w:rPr>
+            </w:pPr>
+          </w:p>
+        </w:tc>
+        <w:tc>
+          <w:tcPr>
+            <w:tcW w:w="891" w:type="dxa"/>
+          </w:tcPr>
+          <w:p>
+            <w:pPr>
+              <w:jc w:val="both"/>
+              <w:rPr>
+                <w:sz w:val="22"/>
+                <w:szCs w:val="22"/>
+              </w:rPr>
+            </w:pPr>
+          </w:p>
+        </w:tc>
+      </w:tr>
+      <w:tr>
+        <w:tc>
+          <w:tcPr>
+            <w:tcW w:w="836" w:type="dxa"/>
+          </w:tcPr>
+          <w:p>
+            <w:pPr>
+              <w:jc w:val="both"/>
+              <w:rPr>
+                <w:sz w:val="22"/>
+                <w:szCs w:val="22"/>
+                <w:lang w:val="en-US"/>
+              </w:rPr>
+            </w:pPr>
+            <w:r>
+              <w:rPr>
+                <w:sz w:val="22"/>
+                <w:szCs w:val="22"/>
+                <w:lang w:val="en-US"/>
+              </w:rPr>
+              <w:t>13F</w:t>
+            </w:r>
+          </w:p>
+        </w:tc>
+        <w:tc>
+          <w:tcPr>
+            <w:tcW w:w="736" w:type="dxa"/>
+          </w:tcPr>
+          <w:p>
+            <w:pPr>
+              <w:jc w:val="both"/>
+              <w:rPr>
+                <w:sz w:val="22"/>
+                <w:szCs w:val="22"/>
+              </w:rPr>
+            </w:pPr>
+            <w:r>
+              <w:rPr>
+                <w:sz w:val="22"/>
+                <w:szCs w:val="22"/>
+                <w:lang w:val="en-US"/>
+              </w:rPr>
+              <w:t>4139</w:t>
+            </w:r>
+          </w:p>
+        </w:tc>
+        <w:tc>
+          <w:tcPr>
+            <w:tcW w:w="617" w:type="dxa"/>
+          </w:tcPr>
+          <w:p>
+            <w:pPr>
+              <w:jc w:val="both"/>
+              <w:rPr>
+                <w:sz w:val="22"/>
+                <w:szCs w:val="22"/>
+              </w:rPr>
+            </w:pPr>
+            <w:r>
+              <w:rPr>
+                <w:sz w:val="22"/>
+                <w:szCs w:val="22"/>
+              </w:rPr>
+              <w:t>140</w:t>
+            </w:r>
+          </w:p>
+        </w:tc>
+        <w:tc>
+          <w:tcPr>
+            <w:tcW w:w="732" w:type="dxa"/>
+          </w:tcPr>
+          <w:p>
+            <w:pPr>
+              <w:jc w:val="both"/>
+              <w:rPr>
+                <w:sz w:val="22"/>
+                <w:szCs w:val="22"/>
+              </w:rPr>
+            </w:pPr>
+            <w:r>
+              <w:rPr>
+                <w:sz w:val="22"/>
+                <w:szCs w:val="22"/>
+                <w:lang w:val="en-US"/>
+              </w:rPr>
+              <w:t>4139</w:t>
+            </w:r>
+          </w:p>
+        </w:tc>
+        <w:tc>
+          <w:tcPr>
+            <w:tcW w:w="732" w:type="dxa"/>
+          </w:tcPr>
+          <w:p>
+            <w:pPr>
+              <w:jc w:val="both"/>
+              <w:rPr>
+                <w:sz w:val="22"/>
+                <w:szCs w:val="22"/>
+                <w:lang w:val="en-US"/>
+              </w:rPr>
+            </w:pPr>
+            <w:r>
+              <w:rPr>
+                <w:sz w:val="22"/>
+                <w:szCs w:val="22"/>
+                <w:lang w:val="en-US"/>
+              </w:rPr>
+              <w:t>0139</w:t>
+            </w:r>
+          </w:p>
+        </w:tc>
+        <w:tc>
+          <w:tcPr>
+            <w:tcW w:w="745" w:type="dxa"/>
+          </w:tcPr>
+          <w:p>
+            <w:pPr>
+              <w:jc w:val="both"/>
+              <w:rPr>
+                <w:sz w:val="22"/>
+                <w:szCs w:val="22"/>
+                <w:lang w:val="en-US"/>
+              </w:rPr>
+            </w:pPr>
+            <w:r>
+              <w:rPr>
+                <w:sz w:val="22"/>
+                <w:szCs w:val="22"/>
+                <w:lang w:val="en-US"/>
+              </w:rPr>
+              <w:t>E101</w:t>
+            </w:r>
+          </w:p>
+        </w:tc>
+        <w:tc>
+          <w:tcPr>
+            <w:tcW w:w="681" w:type="dxa"/>
+          </w:tcPr>
+          <w:p>
+            <w:pPr>
+              <w:jc w:val="both"/>
+              <w:rPr>
+                <w:sz w:val="22"/>
+                <w:szCs w:val="22"/>
+              </w:rPr>
+            </w:pPr>
+            <w:r>
+              <w:rPr>
+                <w:sz w:val="22"/>
+                <w:szCs w:val="22"/>
+                <w:lang w:val="en-US"/>
+              </w:rPr>
+              <w:t>0000</w:t>
+            </w:r>
+          </w:p>
+        </w:tc>
+        <w:tc>
+          <w:tcPr>
+            <w:tcW w:w="732" w:type="dxa"/>
+          </w:tcPr>
+          <w:p>
+            <w:pPr>
+              <w:jc w:val="both"/>
+              <w:rPr>
+                <w:sz w:val="22"/>
+                <w:szCs w:val="22"/>
+                <w:lang w:val="en-US"/>
+              </w:rPr>
+            </w:pPr>
+            <w:r>
+              <w:rPr>
+                <w:sz w:val="22"/>
+                <w:szCs w:val="22"/>
+                <w:lang w:val="en-US"/>
+              </w:rPr>
+              <w:t>013D</w:t>
+            </w:r>
+          </w:p>
+        </w:tc>
+        <w:tc>
+          <w:tcPr>
+            <w:tcW w:w="718" w:type="dxa"/>
+          </w:tcPr>
+          <w:p>
+            <w:pPr>
+              <w:jc w:val="both"/>
+              <w:rPr>
+                <w:sz w:val="22"/>
+                <w:szCs w:val="22"/>
+                <w:lang w:val="en-US"/>
+              </w:rPr>
+            </w:pPr>
+            <w:r>
+              <w:rPr>
+                <w:sz w:val="22"/>
+                <w:szCs w:val="22"/>
+                <w:lang w:val="en-US"/>
+              </w:rPr>
+              <w:t>D</w:t>
+            </w:r>
+            <w:r>
+              <w:rPr>
+                <w:sz w:val="22"/>
+                <w:szCs w:val="22"/>
+                <w:lang w:val="en-US"/>
+              </w:rPr>
+              <w:t>F01</w:t>
+            </w:r>
+          </w:p>
+        </w:tc>
+        <w:tc>
+          <w:tcPr>
+            <w:tcW w:w="1094" w:type="dxa"/>
+          </w:tcPr>
+          <w:p>
+            <w:pPr>
+              <w:jc w:val="both"/>
+              <w:rPr>
+                <w:sz w:val="22"/>
+                <w:szCs w:val="22"/>
+                <w:lang w:val="en-US"/>
+              </w:rPr>
+            </w:pPr>
+            <w:r>
+              <w:rPr>
+                <w:sz w:val="22"/>
+                <w:szCs w:val="22"/>
+                <w:lang w:val="en-US"/>
+              </w:rPr>
+              <w:t>1001</w:t>
+            </w:r>
+          </w:p>
+        </w:tc>
+        <w:tc>
+          <w:tcPr>
+            <w:tcW w:w="830" w:type="dxa"/>
+          </w:tcPr>
+          <w:p>
+            <w:pPr>
+              <w:jc w:val="both"/>
+              <w:rPr>
+                <w:sz w:val="22"/>
+                <w:szCs w:val="22"/>
+              </w:rPr>
+            </w:pPr>
+          </w:p>
+        </w:tc>
+        <w:tc>
+          <w:tcPr>
+            <w:tcW w:w="891" w:type="dxa"/>
+          </w:tcPr>
+          <w:p>
+            <w:pPr>
+              <w:jc w:val="both"/>
+              <w:rPr>
+                <w:sz w:val="22"/>
+                <w:szCs w:val="22"/>
+              </w:rPr>
+            </w:pPr>
+          </w:p>
+        </w:tc>
+      </w:tr>
+      <w:tr>
+        <w:tc>
+          <w:tcPr>
+            <w:tcW w:w="836" w:type="dxa"/>
+          </w:tcPr>
+          <w:p>
+            <w:pPr>
+              <w:jc w:val="both"/>
+              <w:rPr>
+                <w:sz w:val="22"/>
+                <w:szCs w:val="22"/>
+              </w:rPr>
+            </w:pPr>
+            <w:r>
+              <w:rPr>
+                <w:sz w:val="22"/>
+                <w:szCs w:val="22"/>
+              </w:rPr>
+              <w:t>140</w:t>
+            </w:r>
+          </w:p>
+        </w:tc>
+        <w:tc>
+          <w:tcPr>
+            <w:tcW w:w="736" w:type="dxa"/>
+          </w:tcPr>
+          <w:p>
+            <w:pPr>
+              <w:jc w:val="both"/>
+              <w:rPr>
+                <w:sz w:val="22"/>
+                <w:szCs w:val="22"/>
+              </w:rPr>
+            </w:pPr>
+            <w:r>
+              <w:rPr>
+                <w:sz w:val="22"/>
+                <w:szCs w:val="22"/>
+                <w:lang w:val="en-US"/>
+              </w:rPr>
+              <w:t>E143</w:t>
+            </w:r>
+          </w:p>
+        </w:tc>
+        <w:tc>
+          <w:tcPr>
+            <w:tcW w:w="617" w:type="dxa"/>
+          </w:tcPr>
+          <w:p>
+            <w:pPr>
+              <w:jc w:val="both"/>
+              <w:rPr>
+                <w:sz w:val="22"/>
+                <w:szCs w:val="22"/>
+              </w:rPr>
+            </w:pPr>
+            <w:r>
+              <w:rPr>
+                <w:sz w:val="22"/>
+                <w:szCs w:val="22"/>
+              </w:rPr>
+              <w:t>141</w:t>
+            </w:r>
+          </w:p>
+        </w:tc>
+        <w:tc>
+          <w:tcPr>
+            <w:tcW w:w="732" w:type="dxa"/>
+          </w:tcPr>
+          <w:p>
+            <w:pPr>
+              <w:jc w:val="both"/>
+              <w:rPr>
+                <w:sz w:val="22"/>
+                <w:szCs w:val="22"/>
+              </w:rPr>
+            </w:pPr>
+            <w:r>
+              <w:rPr>
+                <w:sz w:val="22"/>
+                <w:szCs w:val="22"/>
+                <w:lang w:val="en-US"/>
+              </w:rPr>
+              <w:t>E143</w:t>
+            </w:r>
+          </w:p>
+        </w:tc>
+        <w:tc>
+          <w:tcPr>
+            <w:tcW w:w="732" w:type="dxa"/>
+          </w:tcPr>
+          <w:p>
+            <w:pPr>
+              <w:jc w:val="both"/>
+              <w:rPr>
+                <w:sz w:val="22"/>
+                <w:szCs w:val="22"/>
+                <w:lang w:val="en-US"/>
+              </w:rPr>
+            </w:pPr>
+            <w:r>
+              <w:rPr>
+                <w:sz w:val="22"/>
+                <w:szCs w:val="22"/>
+                <w:lang w:val="en-US"/>
+              </w:rPr>
+              <w:t>0143</w:t>
+            </w:r>
+          </w:p>
+        </w:tc>
+        <w:tc>
+          <w:tcPr>
+            <w:tcW w:w="745" w:type="dxa"/>
+          </w:tcPr>
+          <w:p>
+            <w:pPr>
+              <w:jc w:val="both"/>
+              <w:rPr>
+                <w:sz w:val="22"/>
+                <w:szCs w:val="22"/>
+                <w:lang w:val="en-US"/>
+              </w:rPr>
+            </w:pPr>
+            <w:r>
+              <w:rPr>
+                <w:sz w:val="22"/>
+                <w:szCs w:val="22"/>
+                <w:lang w:val="en-US"/>
+              </w:rPr>
+              <w:t>DF01</w:t>
+            </w:r>
+          </w:p>
+        </w:tc>
+        <w:tc>
+          <w:tcPr>
+            <w:tcW w:w="681" w:type="dxa"/>
+          </w:tcPr>
+          <w:p>
+            <w:pPr>
+              <w:jc w:val="both"/>
+              <w:rPr>
+                <w:sz w:val="22"/>
+                <w:szCs w:val="22"/>
+              </w:rPr>
+            </w:pPr>
+            <w:r>
+              <w:rPr>
+                <w:sz w:val="22"/>
+                <w:szCs w:val="22"/>
+                <w:lang w:val="en-US"/>
+              </w:rPr>
+              <w:t>0000</w:t>
+            </w:r>
+          </w:p>
+        </w:tc>
+        <w:tc>
+          <w:tcPr>
+            <w:tcW w:w="732" w:type="dxa"/>
+          </w:tcPr>
+          <w:p>
+            <w:pPr>
+              <w:jc w:val="both"/>
+              <w:rPr>
+                <w:sz w:val="22"/>
+                <w:szCs w:val="22"/>
+                <w:lang w:val="en-US"/>
+              </w:rPr>
+            </w:pPr>
+            <w:r>
+              <w:rPr>
+                <w:sz w:val="22"/>
+                <w:szCs w:val="22"/>
+                <w:lang w:val="en-US"/>
+              </w:rPr>
+              <w:t>0140</w:t>
+            </w:r>
+          </w:p>
+        </w:tc>
+        <w:tc>
+          <w:tcPr>
+            <w:tcW w:w="718" w:type="dxa"/>
+          </w:tcPr>
+          <w:p>
+            <w:pPr>
+              <w:jc w:val="both"/>
+              <w:rPr>
+                <w:sz w:val="22"/>
+                <w:szCs w:val="22"/>
+                <w:lang w:val="en-US"/>
+              </w:rPr>
+            </w:pPr>
+            <w:r>
+              <w:rPr>
+                <w:sz w:val="22"/>
+                <w:szCs w:val="22"/>
+                <w:lang w:val="en-US"/>
+              </w:rPr>
+              <w:t>D</w:t>
+            </w:r>
+            <w:r>
+              <w:rPr>
+                <w:sz w:val="22"/>
+                <w:szCs w:val="22"/>
+                <w:lang w:val="en-US"/>
+              </w:rPr>
+              <w:t>F01</w:t>
+            </w:r>
+          </w:p>
+        </w:tc>
+        <w:tc>
+          <w:tcPr>
+            <w:tcW w:w="1094" w:type="dxa"/>
+          </w:tcPr>
+          <w:p>
+            <w:pPr>
+              <w:jc w:val="both"/>
+              <w:rPr>
+                <w:sz w:val="22"/>
+                <w:szCs w:val="22"/>
+                <w:lang w:val="en-US"/>
+              </w:rPr>
+            </w:pPr>
+            <w:r>
+              <w:rPr>
+                <w:sz w:val="22"/>
+                <w:szCs w:val="22"/>
+                <w:lang w:val="en-US"/>
+              </w:rPr>
+              <w:t>1001</w:t>
+            </w:r>
+          </w:p>
+        </w:tc>
+        <w:tc>
+          <w:tcPr>
+            <w:tcW w:w="830" w:type="dxa"/>
+          </w:tcPr>
+          <w:p>
+            <w:pPr>
+              <w:jc w:val="both"/>
+              <w:rPr>
+                <w:sz w:val="22"/>
+                <w:szCs w:val="22"/>
+                <w:lang w:val="en-US"/>
+              </w:rPr>
+            </w:pPr>
+            <w:r>
+              <w:rPr>
+                <w:sz w:val="22"/>
+                <w:szCs w:val="22"/>
+                <w:lang w:val="en-US"/>
+              </w:rPr>
+              <w:t>143</w:t>
+            </w:r>
+          </w:p>
+        </w:tc>
+        <w:tc>
+          <w:tcPr>
+            <w:tcW w:w="891" w:type="dxa"/>
+          </w:tcPr>
+          <w:p>
+            <w:pPr>
+              <w:jc w:val="both"/>
+              <w:rPr>
+                <w:sz w:val="22"/>
+                <w:szCs w:val="22"/>
+                <w:lang w:val="en-US"/>
+              </w:rPr>
+            </w:pPr>
+            <w:r>
+              <w:rPr>
+                <w:sz w:val="22"/>
+                <w:szCs w:val="22"/>
+                <w:lang w:val="en-US"/>
+              </w:rPr>
+              <w:t>D</w:t>
+            </w:r>
+            <w:r>
+              <w:rPr>
+                <w:sz w:val="22"/>
+                <w:szCs w:val="22"/>
+                <w:lang w:val="en-US"/>
+              </w:rPr>
+              <w:t>F01</w:t>
+            </w:r>
+          </w:p>
+        </w:tc>
+      </w:tr>
+      <w:tr>
+        <w:tc>
+          <w:tcPr>
+            <w:tcW w:w="836" w:type="dxa"/>
+          </w:tcPr>
+          <w:p>
+            <w:pPr>
+              <w:jc w:val="both"/>
+              <w:rPr>
+                <w:sz w:val="22"/>
+                <w:szCs w:val="22"/>
+              </w:rPr>
+            </w:pPr>
+            <w:r>
+              <w:rPr>
+                <w:sz w:val="22"/>
+                <w:szCs w:val="22"/>
+              </w:rPr>
+              <w:t>141</w:t>
+            </w:r>
+          </w:p>
+        </w:tc>
+        <w:tc>
+          <w:tcPr>
+            <w:tcW w:w="736" w:type="dxa"/>
+          </w:tcPr>
+          <w:p>
+            <w:pPr>
+              <w:jc w:val="both"/>
+              <w:rPr>
+                <w:sz w:val="22"/>
+                <w:szCs w:val="22"/>
+              </w:rPr>
+            </w:pPr>
+            <w:r>
+              <w:rPr>
+                <w:sz w:val="22"/>
+                <w:szCs w:val="22"/>
+                <w:lang w:val="en-US"/>
+              </w:rPr>
+              <w:t>0100</w:t>
+            </w:r>
+          </w:p>
+        </w:tc>
+        <w:tc>
+          <w:tcPr>
+            <w:tcW w:w="617" w:type="dxa"/>
+          </w:tcPr>
+          <w:p>
+            <w:pPr>
+              <w:jc w:val="both"/>
+              <w:rPr>
+                <w:sz w:val="22"/>
+                <w:szCs w:val="22"/>
+              </w:rPr>
+            </w:pPr>
+            <w:r>
+              <w:rPr>
+                <w:sz w:val="22"/>
+                <w:szCs w:val="22"/>
+              </w:rPr>
+              <w:t>142</w:t>
+            </w:r>
+          </w:p>
+        </w:tc>
+        <w:tc>
+          <w:tcPr>
+            <w:tcW w:w="732" w:type="dxa"/>
+          </w:tcPr>
+          <w:p>
+            <w:pPr>
+              <w:jc w:val="both"/>
+              <w:rPr>
+                <w:sz w:val="22"/>
+                <w:szCs w:val="22"/>
+              </w:rPr>
+            </w:pPr>
+            <w:r>
+              <w:rPr>
+                <w:sz w:val="22"/>
+                <w:szCs w:val="22"/>
+                <w:lang w:val="en-US"/>
+              </w:rPr>
+              <w:t>0100</w:t>
+            </w:r>
+          </w:p>
+        </w:tc>
+        <w:tc>
+          <w:tcPr>
+            <w:tcW w:w="732" w:type="dxa"/>
+          </w:tcPr>
+          <w:p>
+            <w:pPr>
+              <w:jc w:val="both"/>
+              <w:rPr>
+                <w:sz w:val="22"/>
+                <w:szCs w:val="22"/>
+                <w:lang w:val="en-US"/>
+              </w:rPr>
+            </w:pPr>
+            <w:r>
+              <w:rPr>
+                <w:sz w:val="22"/>
+                <w:szCs w:val="22"/>
+                <w:lang w:val="en-US"/>
+              </w:rPr>
+              <w:t>0141</w:t>
+            </w:r>
+          </w:p>
+        </w:tc>
+        <w:tc>
+          <w:tcPr>
+            <w:tcW w:w="745" w:type="dxa"/>
+          </w:tcPr>
+          <w:p>
+            <w:pPr>
+              <w:jc w:val="both"/>
+              <w:rPr>
+                <w:sz w:val="22"/>
+                <w:szCs w:val="22"/>
+                <w:lang w:val="en-US"/>
+              </w:rPr>
+            </w:pPr>
+            <w:r>
+              <w:rPr>
+                <w:sz w:val="22"/>
+                <w:szCs w:val="22"/>
+                <w:lang w:val="en-US"/>
+              </w:rPr>
+              <w:t>0100</w:t>
+            </w:r>
+          </w:p>
+        </w:tc>
+        <w:tc>
+          <w:tcPr>
+            <w:tcW w:w="681" w:type="dxa"/>
+          </w:tcPr>
+          <w:p>
+            <w:pPr>
+              <w:jc w:val="both"/>
+              <w:rPr>
+                <w:sz w:val="22"/>
+                <w:szCs w:val="22"/>
+              </w:rPr>
+            </w:pPr>
+            <w:r>
+              <w:rPr>
+                <w:sz w:val="22"/>
+                <w:szCs w:val="22"/>
+                <w:lang w:val="en-US"/>
+              </w:rPr>
+              <w:t>0000</w:t>
+            </w:r>
+          </w:p>
+        </w:tc>
+        <w:tc>
+          <w:tcPr>
+            <w:tcW w:w="732" w:type="dxa"/>
+          </w:tcPr>
+          <w:p>
+            <w:pPr>
+              <w:jc w:val="both"/>
+              <w:rPr>
+                <w:sz w:val="22"/>
+                <w:szCs w:val="22"/>
+                <w:lang w:val="en-US"/>
+              </w:rPr>
+            </w:pPr>
+            <w:r>
+              <w:rPr>
+                <w:sz w:val="22"/>
+                <w:szCs w:val="22"/>
+                <w:lang w:val="en-US"/>
+              </w:rPr>
+              <w:t>0141</w:t>
+            </w:r>
+          </w:p>
+        </w:tc>
+        <w:tc>
+          <w:tcPr>
+            <w:tcW w:w="718" w:type="dxa"/>
+          </w:tcPr>
+          <w:p>
+            <w:pPr>
+              <w:jc w:val="both"/>
+              <w:rPr>
+                <w:sz w:val="22"/>
+                <w:szCs w:val="22"/>
+                <w:lang w:val="en-US"/>
+              </w:rPr>
+            </w:pPr>
+            <w:r>
+              <w:rPr>
+                <w:sz w:val="22"/>
+                <w:szCs w:val="22"/>
+                <w:lang w:val="en-US"/>
+              </w:rPr>
+              <w:t>D</w:t>
+            </w:r>
+            <w:r>
+              <w:rPr>
+                <w:sz w:val="22"/>
+                <w:szCs w:val="22"/>
+                <w:lang w:val="en-US"/>
+              </w:rPr>
+              <w:t>F01</w:t>
+            </w:r>
+          </w:p>
+        </w:tc>
+        <w:tc>
+          <w:tcPr>
+            <w:tcW w:w="1094" w:type="dxa"/>
+          </w:tcPr>
+          <w:p>
+            <w:pPr>
+              <w:jc w:val="both"/>
+              <w:rPr>
+                <w:sz w:val="22"/>
+                <w:szCs w:val="22"/>
+                <w:lang w:val="en-US"/>
+              </w:rPr>
+            </w:pPr>
+            <w:r>
+              <w:rPr>
+                <w:sz w:val="22"/>
+                <w:szCs w:val="22"/>
+                <w:lang w:val="en-US"/>
+              </w:rPr>
+              <w:t>1001</w:t>
+            </w:r>
+          </w:p>
+        </w:tc>
+        <w:tc>
+          <w:tcPr>
+            <w:tcW w:w="830" w:type="dxa"/>
+          </w:tcPr>
+          <w:p>
+            <w:pPr>
+              <w:jc w:val="both"/>
+              <w:rPr>
+                <w:sz w:val="22"/>
+                <w:szCs w:val="22"/>
+              </w:rPr>
+            </w:pPr>
+          </w:p>
+        </w:tc>
+        <w:tc>
+          <w:tcPr>
+            <w:tcW w:w="891" w:type="dxa"/>
+          </w:tcPr>
+          <w:p>
+            <w:pPr>
+              <w:jc w:val="both"/>
+              <w:rPr>
+                <w:sz w:val="22"/>
+                <w:szCs w:val="22"/>
+              </w:rPr>
+            </w:pPr>
+          </w:p>
+        </w:tc>
+      </w:tr>
+    </w:tbl>
     <w:p>
       <w:pPr>
         <w:jc w:val="both"/>
@@ -2099,7 +4615,6 @@
         <w:rPr>
           <w:b/>
           <w:bCs/>
-          <w:lang w:val="en-US"/>
         </w:rPr>
       </w:pPr>
     </w:p>
@@ -2109,7 +4624,6 @@
         <w:rPr>
           <w:b/>
           <w:bCs/>
-          <w:lang w:val="en-US"/>
         </w:rPr>
       </w:pPr>
       <w:bookmarkStart w:id="2" w:name="_Toc209088594"/>
@@ -2120,7 +4634,6 @@
         <w:rPr>
           <w:b/>
           <w:bCs/>
-          <w:lang w:val="en-US"/>
         </w:rPr>
       </w:pPr>
     </w:p>
@@ -2130,7 +4643,6 @@
         <w:rPr>
           <w:b/>
           <w:bCs/>
-          <w:lang w:val="en-US"/>
         </w:rPr>
       </w:pPr>
     </w:p>
@@ -2140,7 +4652,6 @@
         <w:rPr>
           <w:b/>
           <w:bCs/>
-          <w:lang w:val="en-US"/>
         </w:rPr>
       </w:pPr>
     </w:p>
@@ -2151,7 +4662,6 @@
         <w:rPr>
           <w:b/>
           <w:bCs/>
-          <w:lang w:val="en-US"/>
         </w:rPr>
       </w:pPr>
     </w:p>
@@ -2162,17 +4672,10 @@
         <w:rPr>
           <w:b/>
           <w:bCs/>
-          <w:lang w:val="en-US"/>
         </w:rPr>
       </w:pPr>
     </w:p>
-    <w:p>
-      <w:pPr>
-        <w:rPr>
-          <w:lang w:val="en-US"/>
-        </w:rPr>
-      </w:pPr>
-    </w:p>
+    <w:p/>
     <w:p>
       <w:pPr>
         <w:pStyle w:val="Heading1"/>
@@ -2187,6 +4690,7 @@
           <w:b/>
           <w:bCs/>
         </w:rPr>
+        <w:lastRenderedPageBreak/>
         <w:t>Заключение</w:t>
       </w:r>
       <w:bookmarkEnd w:id="2"/>
@@ -2240,6 +4744,7 @@
           <w:b/>
           <w:bCs/>
         </w:rPr>
+        <w:lastRenderedPageBreak/>
         <w:t xml:space="preserve">Список </w:t>
       </w:r>
       <w:r>
@@ -2293,7 +4798,6 @@
     </w:p>
     <w:p>
       <w:r>
-        <w:lastRenderedPageBreak/>
         <w:t xml:space="preserve">2. </w:t>
       </w:r>
       <w:r>

</xml_diff>

<commit_message>
FOPA lab2: program with less instructions, part of program description
</commit_message>
<xml_diff>
--- a/fopa/lab2/report.docx
+++ b/fopa/lab2/report.docx
@@ -850,6 +850,15 @@
       </w:r>
       <w:bookmarkEnd w:id="1"/>
     </w:p>
+    <w:p>
+      <w:pPr>
+        <w:pStyle w:val="Heading2"/>
+        <w:jc w:val="center"/>
+      </w:pPr>
+      <w:r>
+        <w:t>Текст исходной программы</w:t>
+      </w:r>
+    </w:p>
     <w:tbl>
       <w:tblPr>
         <w:tblStyle w:val="TableGrid"/>
@@ -893,11 +902,9 @@
               </w:rPr>
               <w:t xml:space="preserve"> </w:t>
             </w:r>
-            <w:proofErr w:type="spellStart"/>
-            <w:r>
-              <w:t>комманды</w:t>
-            </w:r>
-            <w:proofErr w:type="spellEnd"/>
+            <w:r>
+              <w:t>команды</w:t>
+            </w:r>
           </w:p>
         </w:tc>
         <w:tc>
@@ -2084,6 +2091,1316 @@
         <w:rPr>
           <w:lang w:val="en-US"/>
         </w:rPr>
+      </w:pPr>
+    </w:p>
+    <w:p>
+      <w:pPr>
+        <w:jc w:val="both"/>
+      </w:pPr>
+    </w:p>
+    <w:p>
+      <w:pPr>
+        <w:jc w:val="both"/>
+      </w:pPr>
+    </w:p>
+    <w:p>
+      <w:pPr>
+        <w:jc w:val="both"/>
+      </w:pPr>
+    </w:p>
+    <w:p>
+      <w:pPr>
+        <w:pStyle w:val="Heading2"/>
+        <w:jc w:val="center"/>
+      </w:pPr>
+      <w:r>
+        <w:lastRenderedPageBreak/>
+        <w:t>Описание программы</w:t>
+      </w:r>
+    </w:p>
+    <w:p>
+      <w:pPr>
+        <w:pStyle w:val="ListParagraph"/>
+        <w:numPr>
+          <w:ilvl w:val="0"/>
+          <w:numId w:val="5"/>
+        </w:numPr>
+        <w:jc w:val="both"/>
+        <w:rPr>
+          <w:lang w:val="en-US"/>
+        </w:rPr>
+      </w:pPr>
+      <w:r>
+        <w:t>Формула</w:t>
+      </w:r>
+      <w:r>
+        <w:rPr>
+          <w:lang w:val="en-US"/>
+        </w:rPr>
+        <w:t>:</w:t>
+      </w:r>
+    </w:p>
+    <w:p>
+      <w:pPr>
+        <w:jc w:val="both"/>
+        <w:rPr>
+          <w:lang w:val="en-US"/>
+        </w:rPr>
+      </w:pPr>
+      <w:r>
+        <w:rPr>
+          <w:lang w:val="en-US"/>
+        </w:rPr>
+        <w:t>R = (A&amp;B)-D</w:t>
+      </w:r>
+    </w:p>
+    <w:p>
+      <w:pPr>
+        <w:pStyle w:val="ListParagraph"/>
+        <w:numPr>
+          <w:ilvl w:val="0"/>
+          <w:numId w:val="5"/>
+        </w:numPr>
+        <w:jc w:val="both"/>
+        <w:rPr>
+          <w:lang w:val="en-US"/>
+        </w:rPr>
+      </w:pPr>
+      <w:r>
+        <w:t>Область представления</w:t>
+      </w:r>
+    </w:p>
+    <w:p>
+      <w:pPr>
+        <w:pStyle w:val="ListParagraph"/>
+        <w:numPr>
+          <w:ilvl w:val="0"/>
+          <w:numId w:val="5"/>
+        </w:numPr>
+        <w:jc w:val="both"/>
+        <w:rPr>
+          <w:lang w:val="en-US"/>
+        </w:rPr>
+      </w:pPr>
+      <w:r>
+        <w:t>Область допустимых значений</w:t>
+      </w:r>
+    </w:p>
+    <w:p>
+      <w:pPr>
+        <w:pStyle w:val="ListParagraph"/>
+        <w:numPr>
+          <w:ilvl w:val="0"/>
+          <w:numId w:val="5"/>
+        </w:numPr>
+        <w:jc w:val="both"/>
+        <w:rPr>
+          <w:lang w:val="en-US"/>
+        </w:rPr>
+      </w:pPr>
+      <w:r>
+        <w:t>Расположение в памяти БЭВМ</w:t>
+      </w:r>
+    </w:p>
+    <w:p>
+      <w:pPr>
+        <w:jc w:val="both"/>
+      </w:pPr>
+      <w:r>
+        <w:rPr>
+          <w:lang w:val="en-US"/>
+        </w:rPr>
+        <w:t xml:space="preserve">139 – </w:t>
+      </w:r>
+      <w:r>
+        <w:t>промежуточный результат</w:t>
+      </w:r>
+    </w:p>
+    <w:p>
+      <w:pPr>
+        <w:jc w:val="both"/>
+      </w:pPr>
+      <w:r>
+        <w:rPr>
+          <w:lang w:val="en-US"/>
+        </w:rPr>
+        <w:t xml:space="preserve">142, 144-145 </w:t>
+      </w:r>
+      <w:r>
+        <w:rPr>
+          <w:lang w:val="en-US"/>
+        </w:rPr>
+        <w:t>–</w:t>
+      </w:r>
+      <w:r>
+        <w:rPr>
+          <w:lang w:val="en-US"/>
+        </w:rPr>
+        <w:t xml:space="preserve"> </w:t>
+      </w:r>
+      <w:r>
+        <w:t>исходные данные</w:t>
+      </w:r>
+    </w:p>
+    <w:p>
+      <w:pPr>
+        <w:jc w:val="both"/>
+      </w:pPr>
+      <w:r>
+        <w:rPr>
+          <w:lang w:val="en-US"/>
+        </w:rPr>
+        <w:t xml:space="preserve">143 - </w:t>
+      </w:r>
+      <w:r>
+        <w:t>результат</w:t>
+      </w:r>
+    </w:p>
+    <w:p>
+      <w:pPr>
+        <w:jc w:val="both"/>
+      </w:pPr>
+      <w:r>
+        <w:rPr>
+          <w:lang w:val="en-US"/>
+        </w:rPr>
+        <w:t xml:space="preserve">13A-141 </w:t>
+      </w:r>
+      <w:r>
+        <w:rPr>
+          <w:lang w:val="en-US"/>
+        </w:rPr>
+        <w:t>–</w:t>
+      </w:r>
+      <w:r>
+        <w:rPr>
+          <w:lang w:val="en-US"/>
+        </w:rPr>
+        <w:t xml:space="preserve"> </w:t>
+      </w:r>
+      <w:r>
+        <w:t>и</w:t>
+      </w:r>
+      <w:r>
+        <w:t>нструкции</w:t>
+      </w:r>
+    </w:p>
+    <w:p>
+      <w:pPr>
+        <w:pStyle w:val="ListParagraph"/>
+        <w:numPr>
+          <w:ilvl w:val="0"/>
+          <w:numId w:val="5"/>
+        </w:numPr>
+        <w:jc w:val="both"/>
+      </w:pPr>
+      <w:r>
+        <w:t xml:space="preserve">Адреса первой и последней </w:t>
+      </w:r>
+      <w:r>
+        <w:t>инструкций</w:t>
+      </w:r>
+    </w:p>
+    <w:p>
+      <w:pPr>
+        <w:jc w:val="both"/>
+        <w:rPr>
+          <w:lang w:val="en-US"/>
+        </w:rPr>
+      </w:pPr>
+      <w:r>
+        <w:t>Первая – 13</w:t>
+      </w:r>
+      <w:r>
+        <w:rPr>
+          <w:lang w:val="en-US"/>
+        </w:rPr>
+        <w:t>A</w:t>
+      </w:r>
+    </w:p>
+    <w:p>
+      <w:pPr>
+        <w:jc w:val="both"/>
+        <w:rPr>
+          <w:lang w:val="en-US"/>
+        </w:rPr>
+      </w:pPr>
+      <w:r>
+        <w:t xml:space="preserve">Последняя - </w:t>
+      </w:r>
+      <w:r>
+        <w:rPr>
+          <w:lang w:val="en-US"/>
+        </w:rPr>
+        <w:t>141</w:t>
+      </w:r>
+    </w:p>
+    <w:p>
+      <w:pPr>
+        <w:jc w:val="both"/>
+      </w:pPr>
+    </w:p>
+    <w:p>
+      <w:pPr>
+        <w:jc w:val="both"/>
+      </w:pPr>
+    </w:p>
+    <w:p>
+      <w:pPr>
+        <w:jc w:val="both"/>
+      </w:pPr>
+    </w:p>
+    <w:p>
+      <w:pPr>
+        <w:jc w:val="both"/>
+      </w:pPr>
+    </w:p>
+    <w:p>
+      <w:pPr>
+        <w:jc w:val="both"/>
+      </w:pPr>
+    </w:p>
+    <w:p>
+      <w:pPr>
+        <w:jc w:val="both"/>
+      </w:pPr>
+    </w:p>
+    <w:p>
+      <w:pPr>
+        <w:jc w:val="both"/>
+      </w:pPr>
+    </w:p>
+    <w:p>
+      <w:pPr>
+        <w:jc w:val="both"/>
+      </w:pPr>
+    </w:p>
+    <w:p>
+      <w:pPr>
+        <w:jc w:val="both"/>
+      </w:pPr>
+    </w:p>
+    <w:p>
+      <w:pPr>
+        <w:jc w:val="both"/>
+      </w:pPr>
+    </w:p>
+    <w:p>
+      <w:pPr>
+        <w:jc w:val="both"/>
+      </w:pPr>
+    </w:p>
+    <w:p>
+      <w:pPr>
+        <w:jc w:val="both"/>
+      </w:pPr>
+    </w:p>
+    <w:p>
+      <w:pPr>
+        <w:jc w:val="both"/>
+      </w:pPr>
+    </w:p>
+    <w:p>
+      <w:pPr>
+        <w:jc w:val="both"/>
+      </w:pPr>
+    </w:p>
+    <w:p>
+      <w:pPr>
+        <w:jc w:val="both"/>
+      </w:pPr>
+    </w:p>
+    <w:p>
+      <w:pPr>
+        <w:jc w:val="both"/>
+      </w:pPr>
+    </w:p>
+    <w:p>
+      <w:pPr>
+        <w:jc w:val="both"/>
+      </w:pPr>
+    </w:p>
+    <w:p>
+      <w:pPr>
+        <w:jc w:val="both"/>
+      </w:pPr>
+    </w:p>
+    <w:p>
+      <w:pPr>
+        <w:jc w:val="both"/>
+      </w:pPr>
+    </w:p>
+    <w:p>
+      <w:pPr>
+        <w:jc w:val="both"/>
+      </w:pPr>
+    </w:p>
+    <w:p>
+      <w:pPr>
+        <w:jc w:val="both"/>
+      </w:pPr>
+    </w:p>
+    <w:tbl>
+      <w:tblPr>
+        <w:tblStyle w:val="TableGrid"/>
+        <w:tblW w:w="0" w:type="auto"/>
+        <w:tblLook w:val="04A0" w:firstRow="1" w:lastRow="0" w:firstColumn="1" w:lastColumn="0" w:noHBand="0" w:noVBand="1"/>
+      </w:tblPr>
+      <w:tblGrid>
+        <w:gridCol w:w="2021"/>
+        <w:gridCol w:w="2065"/>
+        <w:gridCol w:w="1613"/>
+        <w:gridCol w:w="3645"/>
+      </w:tblGrid>
+      <w:tr>
+        <w:tc>
+          <w:tcPr>
+            <w:tcW w:w="2021" w:type="dxa"/>
+          </w:tcPr>
+          <w:p>
+            <w:pPr>
+              <w:jc w:val="both"/>
+              <w:rPr>
+                <w:lang w:val="en-US"/>
+              </w:rPr>
+            </w:pPr>
+            <w:r>
+              <w:t>Ячейка памяти</w:t>
+            </w:r>
+          </w:p>
+        </w:tc>
+        <w:tc>
+          <w:tcPr>
+            <w:tcW w:w="2065" w:type="dxa"/>
+          </w:tcPr>
+          <w:p>
+            <w:pPr>
+              <w:jc w:val="both"/>
+              <w:rPr>
+                <w:lang w:val="en-US"/>
+              </w:rPr>
+            </w:pPr>
+            <w:r>
+              <w:t>Код</w:t>
+            </w:r>
+            <w:r>
+              <w:rPr>
+                <w:lang w:val="en-US"/>
+              </w:rPr>
+              <w:t xml:space="preserve"> </w:t>
+            </w:r>
+            <w:r>
+              <w:t>команды</w:t>
+            </w:r>
+          </w:p>
+        </w:tc>
+        <w:tc>
+          <w:tcPr>
+            <w:tcW w:w="1613" w:type="dxa"/>
+          </w:tcPr>
+          <w:p>
+            <w:pPr>
+              <w:jc w:val="both"/>
+              <w:rPr>
+                <w:lang w:val="en-US"/>
+              </w:rPr>
+            </w:pPr>
+            <w:r>
+              <w:t>Мнемоника</w:t>
+            </w:r>
+          </w:p>
+        </w:tc>
+        <w:tc>
+          <w:tcPr>
+            <w:tcW w:w="3645" w:type="dxa"/>
+          </w:tcPr>
+          <w:p>
+            <w:pPr>
+              <w:jc w:val="both"/>
+              <w:rPr>
+                <w:lang w:val="en-US"/>
+              </w:rPr>
+            </w:pPr>
+            <w:r>
+              <w:t>Комментарии</w:t>
+            </w:r>
+          </w:p>
+        </w:tc>
+      </w:tr>
+      <w:tr>
+        <w:tc>
+          <w:tcPr>
+            <w:tcW w:w="2021" w:type="dxa"/>
+            <w:shd w:val="clear" w:color="auto" w:fill="92D050"/>
+          </w:tcPr>
+          <w:p>
+            <w:pPr>
+              <w:jc w:val="both"/>
+              <w:rPr>
+                <w:lang w:val="en-US"/>
+              </w:rPr>
+            </w:pPr>
+            <w:r>
+              <w:rPr>
+                <w:lang w:val="en-US"/>
+              </w:rPr>
+              <w:t>13A</w:t>
+            </w:r>
+          </w:p>
+        </w:tc>
+        <w:tc>
+          <w:tcPr>
+            <w:tcW w:w="2065" w:type="dxa"/>
+            <w:shd w:val="clear" w:color="auto" w:fill="92D050"/>
+          </w:tcPr>
+          <w:p>
+            <w:pPr>
+              <w:jc w:val="both"/>
+              <w:rPr>
+                <w:lang w:val="en-US"/>
+              </w:rPr>
+            </w:pPr>
+            <w:r>
+              <w:rPr>
+                <w:lang w:val="en-US"/>
+              </w:rPr>
+              <w:t>A144</w:t>
+            </w:r>
+          </w:p>
+        </w:tc>
+        <w:tc>
+          <w:tcPr>
+            <w:tcW w:w="1613" w:type="dxa"/>
+            <w:shd w:val="clear" w:color="auto" w:fill="92D050"/>
+          </w:tcPr>
+          <w:p>
+            <w:pPr>
+              <w:jc w:val="both"/>
+              <w:rPr>
+                <w:lang w:val="en-US"/>
+              </w:rPr>
+            </w:pPr>
+            <w:r>
+              <w:rPr>
+                <w:lang w:val="en-US"/>
+              </w:rPr>
+              <w:t>LD 144</w:t>
+            </w:r>
+          </w:p>
+        </w:tc>
+        <w:tc>
+          <w:tcPr>
+            <w:tcW w:w="3645" w:type="dxa"/>
+            <w:shd w:val="clear" w:color="auto" w:fill="92D050"/>
+          </w:tcPr>
+          <w:p>
+            <w:pPr>
+              <w:jc w:val="center"/>
+            </w:pPr>
+            <w:r>
+              <w:t>Загрузить содержимое ячейки 144 в аккумулятор</w:t>
+            </w:r>
+          </w:p>
+          <w:p>
+            <w:pPr>
+              <w:jc w:val="center"/>
+            </w:pPr>
+            <w:r>
+              <w:t xml:space="preserve">(144) </w:t>
+            </w:r>
+            <w:r>
+              <w:sym w:font="Symbol" w:char="F0DE"/>
+            </w:r>
+            <w:r>
+              <w:t xml:space="preserve"> </w:t>
+            </w:r>
+            <w:r>
+              <w:rPr>
+                <w:lang w:val="en-US"/>
+              </w:rPr>
+              <w:t>AC</w:t>
+            </w:r>
+          </w:p>
+        </w:tc>
+      </w:tr>
+      <w:tr>
+        <w:tc>
+          <w:tcPr>
+            <w:tcW w:w="2021" w:type="dxa"/>
+          </w:tcPr>
+          <w:p>
+            <w:pPr>
+              <w:jc w:val="both"/>
+              <w:rPr>
+                <w:lang w:val="en-US"/>
+              </w:rPr>
+            </w:pPr>
+            <w:r>
+              <w:t>13</w:t>
+            </w:r>
+            <w:r>
+              <w:rPr>
+                <w:lang w:val="en-US"/>
+              </w:rPr>
+              <w:t>B</w:t>
+            </w:r>
+          </w:p>
+        </w:tc>
+        <w:tc>
+          <w:tcPr>
+            <w:tcW w:w="2065" w:type="dxa"/>
+          </w:tcPr>
+          <w:p>
+            <w:pPr>
+              <w:jc w:val="both"/>
+            </w:pPr>
+            <w:r>
+              <w:rPr>
+                <w:lang w:val="en-US"/>
+              </w:rPr>
+              <w:t>2142</w:t>
+            </w:r>
+          </w:p>
+        </w:tc>
+        <w:tc>
+          <w:tcPr>
+            <w:tcW w:w="1613" w:type="dxa"/>
+          </w:tcPr>
+          <w:p>
+            <w:pPr>
+              <w:jc w:val="both"/>
+            </w:pPr>
+            <w:r>
+              <w:rPr>
+                <w:lang w:val="en-US"/>
+              </w:rPr>
+              <w:t>AND 142</w:t>
+            </w:r>
+          </w:p>
+        </w:tc>
+        <w:tc>
+          <w:tcPr>
+            <w:tcW w:w="3645" w:type="dxa"/>
+          </w:tcPr>
+          <w:p>
+            <w:pPr>
+              <w:jc w:val="center"/>
+            </w:pPr>
+            <w:r>
+              <w:t>Результат операции логического «И» ячейки памяти 142 с аккумулятором записать в аккумулятор</w:t>
+            </w:r>
+          </w:p>
+          <w:p>
+            <w:pPr>
+              <w:jc w:val="center"/>
+            </w:pPr>
+            <w:r>
+              <w:rPr>
+                <w:lang w:val="en-US"/>
+              </w:rPr>
+              <w:t>AC</w:t>
+            </w:r>
+            <w:r>
+              <w:t xml:space="preserve"> &amp; (142)</w:t>
+            </w:r>
+            <w:r>
+              <w:t xml:space="preserve"> </w:t>
+            </w:r>
+            <w:r>
+              <w:sym w:font="Symbol" w:char="F0DE"/>
+            </w:r>
+            <w:r>
+              <w:t xml:space="preserve"> </w:t>
+            </w:r>
+            <w:r>
+              <w:rPr>
+                <w:lang w:val="en-US"/>
+              </w:rPr>
+              <w:t>AC</w:t>
+            </w:r>
+          </w:p>
+        </w:tc>
+      </w:tr>
+      <w:tr>
+        <w:tc>
+          <w:tcPr>
+            <w:tcW w:w="2021" w:type="dxa"/>
+          </w:tcPr>
+          <w:p>
+            <w:pPr>
+              <w:jc w:val="both"/>
+              <w:rPr>
+                <w:lang w:val="en-US"/>
+              </w:rPr>
+            </w:pPr>
+            <w:r>
+              <w:rPr>
+                <w:lang w:val="en-US"/>
+              </w:rPr>
+              <w:t>13</w:t>
+            </w:r>
+            <w:r>
+              <w:rPr>
+                <w:lang w:val="en-US"/>
+              </w:rPr>
+              <w:t>C</w:t>
+            </w:r>
+          </w:p>
+        </w:tc>
+        <w:tc>
+          <w:tcPr>
+            <w:tcW w:w="2065" w:type="dxa"/>
+          </w:tcPr>
+          <w:p>
+            <w:pPr>
+              <w:jc w:val="both"/>
+            </w:pPr>
+            <w:r>
+              <w:rPr>
+                <w:lang w:val="en-US"/>
+              </w:rPr>
+              <w:t>6145</w:t>
+            </w:r>
+          </w:p>
+        </w:tc>
+        <w:tc>
+          <w:tcPr>
+            <w:tcW w:w="1613" w:type="dxa"/>
+          </w:tcPr>
+          <w:p>
+            <w:pPr>
+              <w:jc w:val="both"/>
+            </w:pPr>
+            <w:r>
+              <w:rPr>
+                <w:lang w:val="en-US"/>
+              </w:rPr>
+              <w:t>SUB 145</w:t>
+            </w:r>
+          </w:p>
+        </w:tc>
+        <w:tc>
+          <w:tcPr>
+            <w:tcW w:w="3645" w:type="dxa"/>
+          </w:tcPr>
+          <w:p>
+            <w:pPr>
+              <w:jc w:val="center"/>
+            </w:pPr>
+            <w:r>
+              <w:t>Результат вычитания ячейки 145 из аккумулятора записать в аккумулятор</w:t>
+            </w:r>
+          </w:p>
+          <w:p>
+            <w:pPr>
+              <w:jc w:val="center"/>
+            </w:pPr>
+            <w:r>
+              <w:rPr>
+                <w:lang w:val="en-US"/>
+              </w:rPr>
+              <w:t xml:space="preserve">AC – (145) </w:t>
+            </w:r>
+            <w:r>
+              <w:sym w:font="Symbol" w:char="F0DE"/>
+            </w:r>
+            <w:r>
+              <w:rPr>
+                <w:lang w:val="en-US"/>
+              </w:rPr>
+              <w:t xml:space="preserve"> AC</w:t>
+            </w:r>
+          </w:p>
+        </w:tc>
+      </w:tr>
+      <w:tr>
+        <w:tc>
+          <w:tcPr>
+            <w:tcW w:w="2021" w:type="dxa"/>
+          </w:tcPr>
+          <w:p>
+            <w:pPr>
+              <w:jc w:val="both"/>
+              <w:rPr>
+                <w:lang w:val="en-US"/>
+              </w:rPr>
+            </w:pPr>
+            <w:r>
+              <w:rPr>
+                <w:lang w:val="en-US"/>
+              </w:rPr>
+              <w:t>1</w:t>
+            </w:r>
+            <w:r>
+              <w:rPr>
+                <w:lang w:val="en-US"/>
+              </w:rPr>
+              <w:t>3D</w:t>
+            </w:r>
+          </w:p>
+        </w:tc>
+        <w:tc>
+          <w:tcPr>
+            <w:tcW w:w="2065" w:type="dxa"/>
+          </w:tcPr>
+          <w:p>
+            <w:pPr>
+              <w:jc w:val="both"/>
+            </w:pPr>
+            <w:r>
+              <w:rPr>
+                <w:lang w:val="en-US"/>
+              </w:rPr>
+              <w:t>E143</w:t>
+            </w:r>
+          </w:p>
+        </w:tc>
+        <w:tc>
+          <w:tcPr>
+            <w:tcW w:w="1613" w:type="dxa"/>
+          </w:tcPr>
+          <w:p>
+            <w:pPr>
+              <w:jc w:val="both"/>
+            </w:pPr>
+            <w:r>
+              <w:rPr>
+                <w:lang w:val="en-US"/>
+              </w:rPr>
+              <w:t>ST 143</w:t>
+            </w:r>
+          </w:p>
+        </w:tc>
+        <w:tc>
+          <w:tcPr>
+            <w:tcW w:w="3645" w:type="dxa"/>
+          </w:tcPr>
+          <w:p>
+            <w:pPr>
+              <w:jc w:val="center"/>
+            </w:pPr>
+            <w:r>
+              <w:t>Загрузить содержимое аккумулятора в ячейку 1</w:t>
+            </w:r>
+            <w:r>
+              <w:t>43</w:t>
+            </w:r>
+          </w:p>
+          <w:p>
+            <w:pPr>
+              <w:jc w:val="center"/>
+            </w:pPr>
+            <w:r>
+              <w:rPr>
+                <w:lang w:val="en-US"/>
+              </w:rPr>
+              <w:t>AC</w:t>
+            </w:r>
+            <w:r>
+              <w:t xml:space="preserve"> </w:t>
+            </w:r>
+            <w:r>
+              <w:sym w:font="Symbol" w:char="F0DE"/>
+            </w:r>
+            <w:r>
+              <w:t xml:space="preserve"> </w:t>
+            </w:r>
+            <w:r>
+              <w:t>(</w:t>
+            </w:r>
+            <w:r>
+              <w:rPr>
+                <w:lang w:val="en-US"/>
+              </w:rPr>
+              <w:t>143</w:t>
+            </w:r>
+            <w:r>
+              <w:t>)</w:t>
+            </w:r>
+          </w:p>
+        </w:tc>
+      </w:tr>
+      <w:tr>
+        <w:tc>
+          <w:tcPr>
+            <w:tcW w:w="2021" w:type="dxa"/>
+            <w:shd w:val="clear" w:color="auto" w:fill="FFC000"/>
+          </w:tcPr>
+          <w:p>
+            <w:pPr>
+              <w:jc w:val="both"/>
+              <w:rPr>
+                <w:lang w:val="en-US"/>
+              </w:rPr>
+            </w:pPr>
+            <w:r>
+              <w:rPr>
+                <w:lang w:val="en-US"/>
+              </w:rPr>
+              <w:t>1</w:t>
+            </w:r>
+            <w:r>
+              <w:rPr>
+                <w:lang w:val="en-US"/>
+              </w:rPr>
+              <w:t>3E</w:t>
+            </w:r>
+          </w:p>
+        </w:tc>
+        <w:tc>
+          <w:tcPr>
+            <w:tcW w:w="2065" w:type="dxa"/>
+            <w:shd w:val="clear" w:color="auto" w:fill="FFC000"/>
+          </w:tcPr>
+          <w:p>
+            <w:pPr>
+              <w:jc w:val="both"/>
+            </w:pPr>
+            <w:r>
+              <w:rPr>
+                <w:lang w:val="en-US"/>
+              </w:rPr>
+              <w:t>0100</w:t>
+            </w:r>
+          </w:p>
+        </w:tc>
+        <w:tc>
+          <w:tcPr>
+            <w:tcW w:w="1613" w:type="dxa"/>
+            <w:shd w:val="clear" w:color="auto" w:fill="FFC000"/>
+          </w:tcPr>
+          <w:p>
+            <w:pPr>
+              <w:jc w:val="both"/>
+            </w:pPr>
+            <w:r>
+              <w:rPr>
+                <w:lang w:val="en-US"/>
+              </w:rPr>
+              <w:t>HLT</w:t>
+            </w:r>
+          </w:p>
+        </w:tc>
+        <w:tc>
+          <w:tcPr>
+            <w:tcW w:w="3645" w:type="dxa"/>
+            <w:shd w:val="clear" w:color="auto" w:fill="FFC000"/>
+          </w:tcPr>
+          <w:p>
+            <w:pPr>
+              <w:jc w:val="center"/>
+              <w:rPr>
+                <w:lang w:val="en-US"/>
+              </w:rPr>
+            </w:pPr>
+            <w:r>
+              <w:t>Остановка программы</w:t>
+            </w:r>
+          </w:p>
+        </w:tc>
+      </w:tr>
+      <w:tr>
+        <w:tc>
+          <w:tcPr>
+            <w:tcW w:w="2021" w:type="dxa"/>
+          </w:tcPr>
+          <w:p>
+            <w:pPr>
+              <w:jc w:val="both"/>
+              <w:rPr>
+                <w:lang w:val="en-US"/>
+              </w:rPr>
+            </w:pPr>
+            <w:r>
+              <w:rPr>
+                <w:lang w:val="en-US"/>
+              </w:rPr>
+              <w:t>142</w:t>
+            </w:r>
+          </w:p>
+        </w:tc>
+        <w:tc>
+          <w:tcPr>
+            <w:tcW w:w="2065" w:type="dxa"/>
+          </w:tcPr>
+          <w:p>
+            <w:pPr>
+              <w:jc w:val="both"/>
+              <w:rPr>
+                <w:lang w:val="en-US"/>
+              </w:rPr>
+            </w:pPr>
+            <w:r>
+              <w:rPr>
+                <w:lang w:val="en-US"/>
+              </w:rPr>
+              <w:t>E139</w:t>
+            </w:r>
+          </w:p>
+        </w:tc>
+        <w:tc>
+          <w:tcPr>
+            <w:tcW w:w="1613" w:type="dxa"/>
+          </w:tcPr>
+          <w:p>
+            <w:pPr>
+              <w:jc w:val="both"/>
+              <w:rPr>
+                <w:lang w:val="en-US"/>
+              </w:rPr>
+            </w:pPr>
+            <w:r>
+              <w:t>-</w:t>
+            </w:r>
+          </w:p>
+        </w:tc>
+        <w:tc>
+          <w:tcPr>
+            <w:tcW w:w="3645" w:type="dxa"/>
+          </w:tcPr>
+          <w:p>
+            <w:pPr>
+              <w:jc w:val="center"/>
+            </w:pPr>
+            <w:r>
+              <w:rPr>
+                <w:lang w:val="en-US"/>
+              </w:rPr>
+              <w:t>B</w:t>
+            </w:r>
+          </w:p>
+        </w:tc>
+      </w:tr>
+      <w:tr>
+        <w:tc>
+          <w:tcPr>
+            <w:tcW w:w="2021" w:type="dxa"/>
+          </w:tcPr>
+          <w:p>
+            <w:pPr>
+              <w:jc w:val="both"/>
+              <w:rPr>
+                <w:lang w:val="en-US"/>
+              </w:rPr>
+            </w:pPr>
+            <w:r>
+              <w:rPr>
+                <w:lang w:val="en-US"/>
+              </w:rPr>
+              <w:t>143</w:t>
+            </w:r>
+          </w:p>
+        </w:tc>
+        <w:tc>
+          <w:tcPr>
+            <w:tcW w:w="2065" w:type="dxa"/>
+          </w:tcPr>
+          <w:p>
+            <w:pPr>
+              <w:jc w:val="both"/>
+              <w:rPr>
+                <w:lang w:val="en-US"/>
+              </w:rPr>
+            </w:pPr>
+            <w:r>
+              <w:rPr>
+                <w:lang w:val="en-US"/>
+              </w:rPr>
+              <w:t>0200</w:t>
+            </w:r>
+          </w:p>
+        </w:tc>
+        <w:tc>
+          <w:tcPr>
+            <w:tcW w:w="1613" w:type="dxa"/>
+          </w:tcPr>
+          <w:p>
+            <w:pPr>
+              <w:jc w:val="both"/>
+            </w:pPr>
+            <w:r>
+              <w:t>-</w:t>
+            </w:r>
+          </w:p>
+        </w:tc>
+        <w:tc>
+          <w:tcPr>
+            <w:tcW w:w="3645" w:type="dxa"/>
+          </w:tcPr>
+          <w:p>
+            <w:pPr>
+              <w:jc w:val="center"/>
+              <w:rPr>
+                <w:lang w:val="en-US"/>
+              </w:rPr>
+            </w:pPr>
+            <w:r>
+              <w:rPr>
+                <w:lang w:val="en-US"/>
+              </w:rPr>
+              <w:t>R</w:t>
+            </w:r>
+          </w:p>
+        </w:tc>
+      </w:tr>
+      <w:tr>
+        <w:tc>
+          <w:tcPr>
+            <w:tcW w:w="2021" w:type="dxa"/>
+          </w:tcPr>
+          <w:p>
+            <w:pPr>
+              <w:jc w:val="both"/>
+              <w:rPr>
+                <w:lang w:val="en-US"/>
+              </w:rPr>
+            </w:pPr>
+            <w:r>
+              <w:rPr>
+                <w:lang w:val="en-US"/>
+              </w:rPr>
+              <w:t>144</w:t>
+            </w:r>
+          </w:p>
+        </w:tc>
+        <w:tc>
+          <w:tcPr>
+            <w:tcW w:w="2065" w:type="dxa"/>
+          </w:tcPr>
+          <w:p>
+            <w:pPr>
+              <w:jc w:val="both"/>
+              <w:rPr>
+                <w:lang w:val="en-US"/>
+              </w:rPr>
+            </w:pPr>
+            <w:r>
+              <w:rPr>
+                <w:lang w:val="en-US"/>
+              </w:rPr>
+              <w:t>E143</w:t>
+            </w:r>
+          </w:p>
+        </w:tc>
+        <w:tc>
+          <w:tcPr>
+            <w:tcW w:w="1613" w:type="dxa"/>
+          </w:tcPr>
+          <w:p>
+            <w:pPr>
+              <w:jc w:val="both"/>
+            </w:pPr>
+            <w:r>
+              <w:t>-</w:t>
+            </w:r>
+          </w:p>
+        </w:tc>
+        <w:tc>
+          <w:tcPr>
+            <w:tcW w:w="3645" w:type="dxa"/>
+          </w:tcPr>
+          <w:p>
+            <w:pPr>
+              <w:jc w:val="center"/>
+              <w:rPr>
+                <w:lang w:val="en-US"/>
+              </w:rPr>
+            </w:pPr>
+            <w:r>
+              <w:rPr>
+                <w:lang w:val="en-US"/>
+              </w:rPr>
+              <w:t>A</w:t>
+            </w:r>
+          </w:p>
+        </w:tc>
+      </w:tr>
+      <w:tr>
+        <w:tc>
+          <w:tcPr>
+            <w:tcW w:w="2021" w:type="dxa"/>
+          </w:tcPr>
+          <w:p>
+            <w:pPr>
+              <w:jc w:val="both"/>
+              <w:rPr>
+                <w:lang w:val="en-US"/>
+              </w:rPr>
+            </w:pPr>
+            <w:r>
+              <w:rPr>
+                <w:lang w:val="en-US"/>
+              </w:rPr>
+              <w:t>145</w:t>
+            </w:r>
+          </w:p>
+        </w:tc>
+        <w:tc>
+          <w:tcPr>
+            <w:tcW w:w="2065" w:type="dxa"/>
+          </w:tcPr>
+          <w:p>
+            <w:pPr>
+              <w:jc w:val="both"/>
+              <w:rPr>
+                <w:lang w:val="en-US"/>
+              </w:rPr>
+            </w:pPr>
+            <w:r>
+              <w:rPr>
+                <w:lang w:val="en-US"/>
+              </w:rPr>
+              <w:t>0200</w:t>
+            </w:r>
+          </w:p>
+        </w:tc>
+        <w:tc>
+          <w:tcPr>
+            <w:tcW w:w="1613" w:type="dxa"/>
+          </w:tcPr>
+          <w:p>
+            <w:pPr>
+              <w:jc w:val="both"/>
+            </w:pPr>
+            <w:r>
+              <w:t>-</w:t>
+            </w:r>
+          </w:p>
+        </w:tc>
+        <w:tc>
+          <w:tcPr>
+            <w:tcW w:w="3645" w:type="dxa"/>
+          </w:tcPr>
+          <w:p>
+            <w:pPr>
+              <w:jc w:val="center"/>
+              <w:rPr>
+                <w:lang w:val="en-US"/>
+              </w:rPr>
+            </w:pPr>
+            <w:r>
+              <w:rPr>
+                <w:lang w:val="en-US"/>
+              </w:rPr>
+              <w:t>D</w:t>
+            </w:r>
+          </w:p>
+        </w:tc>
+      </w:tr>
+    </w:tbl>
+    <w:p>
+      <w:pPr>
+        <w:jc w:val="both"/>
+      </w:pPr>
+    </w:p>
+    <w:p>
+      <w:pPr>
+        <w:jc w:val="both"/>
+      </w:pPr>
+    </w:p>
+    <w:p>
+      <w:pPr>
+        <w:jc w:val="both"/>
+      </w:pPr>
+    </w:p>
+    <w:p>
+      <w:pPr>
+        <w:jc w:val="both"/>
+      </w:pPr>
+    </w:p>
+    <w:p>
+      <w:pPr>
+        <w:jc w:val="both"/>
+      </w:pPr>
+    </w:p>
+    <w:p>
+      <w:pPr>
+        <w:jc w:val="both"/>
+      </w:pPr>
+    </w:p>
+    <w:p>
+      <w:pPr>
+        <w:jc w:val="both"/>
+      </w:pPr>
+    </w:p>
+    <w:p>
+      <w:pPr>
+        <w:jc w:val="both"/>
+      </w:pPr>
+    </w:p>
+    <w:p>
+      <w:pPr>
+        <w:jc w:val="both"/>
+      </w:pPr>
+    </w:p>
+    <w:p>
+      <w:pPr>
+        <w:jc w:val="both"/>
+      </w:pPr>
+    </w:p>
+    <w:p>
+      <w:pPr>
+        <w:jc w:val="both"/>
+      </w:pPr>
+    </w:p>
+    <w:p>
+      <w:pPr>
+        <w:jc w:val="both"/>
+      </w:pPr>
+    </w:p>
+    <w:p>
+      <w:pPr>
+        <w:jc w:val="both"/>
+      </w:pPr>
+    </w:p>
+    <w:p>
+      <w:pPr>
+        <w:jc w:val="both"/>
+      </w:pPr>
+    </w:p>
+    <w:p>
+      <w:pPr>
+        <w:jc w:val="both"/>
+      </w:pPr>
+    </w:p>
+    <w:p>
+      <w:pPr>
+        <w:jc w:val="both"/>
+      </w:pPr>
+    </w:p>
+    <w:p>
+      <w:pPr>
+        <w:jc w:val="both"/>
+      </w:pPr>
+    </w:p>
+    <w:p>
+      <w:pPr>
+        <w:jc w:val="both"/>
+      </w:pPr>
+    </w:p>
+    <w:p>
+      <w:pPr>
+        <w:jc w:val="both"/>
+      </w:pPr>
+    </w:p>
+    <w:p>
+      <w:pPr>
+        <w:jc w:val="both"/>
+      </w:pPr>
+    </w:p>
+    <w:p>
+      <w:pPr>
+        <w:jc w:val="both"/>
+      </w:pPr>
+    </w:p>
+    <w:p>
+      <w:pPr>
+        <w:jc w:val="both"/>
+      </w:pPr>
+    </w:p>
+    <w:p>
+      <w:pPr>
+        <w:jc w:val="both"/>
       </w:pPr>
     </w:p>
     <w:p>
@@ -2145,7 +3462,6 @@
                 <w:sz w:val="22"/>
                 <w:szCs w:val="22"/>
               </w:rPr>
-              <w:lastRenderedPageBreak/>
               <w:t>Выполняемая команда</w:t>
             </w:r>
           </w:p>
@@ -4690,7 +6006,6 @@
           <w:b/>
           <w:bCs/>
         </w:rPr>
-        <w:lastRenderedPageBreak/>
         <w:t>Заключение</w:t>
       </w:r>
       <w:bookmarkEnd w:id="2"/>
@@ -4744,7 +6059,6 @@
           <w:b/>
           <w:bCs/>
         </w:rPr>
-        <w:lastRenderedPageBreak/>
         <w:t xml:space="preserve">Список </w:t>
       </w:r>
       <w:r>
@@ -4931,6 +6245,95 @@
 <file path=word/numbering.xml><?xml version="1.0" encoding="utf-8"?>
 <w:numbering xmlns:wpc="http://schemas.microsoft.com/office/word/2010/wordprocessingCanvas" xmlns:cx="http://schemas.microsoft.com/office/drawing/2014/chartex" xmlns:cx1="http://schemas.microsoft.com/office/drawing/2015/9/8/chartex" xmlns:cx2="http://schemas.microsoft.com/office/drawing/2015/10/21/chartex" xmlns:cx3="http://schemas.microsoft.com/office/drawing/2016/5/9/chartex" xmlns:cx4="http://schemas.microsoft.com/office/drawing/2016/5/10/chartex" xmlns:cx5="http://schemas.microsoft.com/office/drawing/2016/5/11/chartex" xmlns:cx6="http://schemas.microsoft.com/office/drawing/2016/5/12/chartex" xmlns:cx7="http://schemas.microsoft.com/office/drawing/2016/5/13/chartex" xmlns:cx8="http://schemas.microsoft.com/office/drawing/2016/5/14/chartex" xmlns:mc="http://schemas.openxmlformats.org/markup-compatibility/2006" xmlns:aink="http://schemas.microsoft.com/office/drawing/2016/ink" xmlns:am3d="http://schemas.microsoft.com/office/drawing/2017/model3d" xmlns:o="urn:schemas-microsoft-com:office:office" xmlns:oel="http://schemas.microsoft.com/office/2019/extlst" xmlns:r="http://schemas.openxmlformats.org/officeDocument/2006/relationships" xmlns:m="http://schemas.openxmlformats.org/officeDocument/2006/math" xmlns:v="urn:schemas-microsoft-com:vml" xmlns:wp14="http://schemas.microsoft.com/office/word/2010/wordprocessingDrawing" xmlns:wp="http://schemas.openxmlformats.org/drawingml/2006/wordprocessingDrawing" xmlns:w10="urn:schemas-microsoft-com:office:word" xmlns:w="http://schemas.openxmlformats.org/wordprocessingml/2006/main" xmlns:w14="http://schemas.microsoft.com/office/word/2010/wordml" xmlns:w15="http://schemas.microsoft.com/office/word/2012/wordml" xmlns:w16cex="http://schemas.microsoft.com/office/word/2018/wordml/cex" xmlns:w16cid="http://schemas.microsoft.com/office/word/2016/wordml/cid" xmlns:w16="http://schemas.microsoft.com/office/word/2018/wordml" xmlns:w16du="http://schemas.microsoft.com/office/word/2023/wordml/word16du" xmlns:w16sdtdh="http://schemas.microsoft.com/office/word/2020/wordml/sdtdatahash" xmlns:w16sdtfl="http://schemas.microsoft.com/office/word/2024/wordml/sdtformatlock" xmlns:w16se="http://schemas.microsoft.com/office/word/2015/wordml/symex" xmlns:wpg="http://schemas.microsoft.com/office/word/2010/wordprocessingGroup" xmlns:wpi="http://schemas.microsoft.com/office/word/2010/wordprocessingInk" xmlns:wne="http://schemas.microsoft.com/office/word/2006/wordml" xmlns:wps="http://schemas.microsoft.com/office/word/2010/wordprocessingShape" mc:Ignorable="w14 w15 w16se w16cid w16 w16cex w16sdtdh w16sdtfl w16du wp14">
   <w:abstractNum w:abstractNumId="0" w15:restartNumberingAfterBreak="0">
+    <w:nsid w:val="1B4C6716"/>
+    <w:multiLevelType w:val="hybridMultilevel"/>
+    <w:tmpl w:val="9940CED0"/>
+    <w:lvl w:ilvl="0" w:tplc="0809000F">
+      <w:start w:val="1"/>
+      <w:numFmt w:val="decimal"/>
+      <w:lvlText w:val="%1."/>
+      <w:lvlJc w:val="left"/>
+      <w:pPr>
+        <w:ind w:left="720" w:hanging="360"/>
+      </w:pPr>
+      <w:rPr>
+        <w:rFonts w:hint="default"/>
+      </w:rPr>
+    </w:lvl>
+    <w:lvl w:ilvl="1" w:tplc="08090019" w:tentative="1">
+      <w:start w:val="1"/>
+      <w:numFmt w:val="lowerLetter"/>
+      <w:lvlText w:val="%2."/>
+      <w:lvlJc w:val="left"/>
+      <w:pPr>
+        <w:ind w:left="1440" w:hanging="360"/>
+      </w:pPr>
+    </w:lvl>
+    <w:lvl w:ilvl="2" w:tplc="0809001B" w:tentative="1">
+      <w:start w:val="1"/>
+      <w:numFmt w:val="lowerRoman"/>
+      <w:lvlText w:val="%3."/>
+      <w:lvlJc w:val="right"/>
+      <w:pPr>
+        <w:ind w:left="2160" w:hanging="180"/>
+      </w:pPr>
+    </w:lvl>
+    <w:lvl w:ilvl="3" w:tplc="0809000F" w:tentative="1">
+      <w:start w:val="1"/>
+      <w:numFmt w:val="decimal"/>
+      <w:lvlText w:val="%4."/>
+      <w:lvlJc w:val="left"/>
+      <w:pPr>
+        <w:ind w:left="2880" w:hanging="360"/>
+      </w:pPr>
+    </w:lvl>
+    <w:lvl w:ilvl="4" w:tplc="08090019" w:tentative="1">
+      <w:start w:val="1"/>
+      <w:numFmt w:val="lowerLetter"/>
+      <w:lvlText w:val="%5."/>
+      <w:lvlJc w:val="left"/>
+      <w:pPr>
+        <w:ind w:left="3600" w:hanging="360"/>
+      </w:pPr>
+    </w:lvl>
+    <w:lvl w:ilvl="5" w:tplc="0809001B" w:tentative="1">
+      <w:start w:val="1"/>
+      <w:numFmt w:val="lowerRoman"/>
+      <w:lvlText w:val="%6."/>
+      <w:lvlJc w:val="right"/>
+      <w:pPr>
+        <w:ind w:left="4320" w:hanging="180"/>
+      </w:pPr>
+    </w:lvl>
+    <w:lvl w:ilvl="6" w:tplc="0809000F" w:tentative="1">
+      <w:start w:val="1"/>
+      <w:numFmt w:val="decimal"/>
+      <w:lvlText w:val="%7."/>
+      <w:lvlJc w:val="left"/>
+      <w:pPr>
+        <w:ind w:left="5040" w:hanging="360"/>
+      </w:pPr>
+    </w:lvl>
+    <w:lvl w:ilvl="7" w:tplc="08090019" w:tentative="1">
+      <w:start w:val="1"/>
+      <w:numFmt w:val="lowerLetter"/>
+      <w:lvlText w:val="%8."/>
+      <w:lvlJc w:val="left"/>
+      <w:pPr>
+        <w:ind w:left="5760" w:hanging="360"/>
+      </w:pPr>
+    </w:lvl>
+    <w:lvl w:ilvl="8" w:tplc="0809001B" w:tentative="1">
+      <w:start w:val="1"/>
+      <w:numFmt w:val="lowerRoman"/>
+      <w:lvlText w:val="%9."/>
+      <w:lvlJc w:val="right"/>
+      <w:pPr>
+        <w:ind w:left="6480" w:hanging="180"/>
+      </w:pPr>
+    </w:lvl>
+  </w:abstractNum>
+  <w:abstractNum w:abstractNumId="1" w15:restartNumberingAfterBreak="0">
     <w:nsid w:val="549A720B"/>
     <w:multiLevelType w:val="hybridMultilevel"/>
     <w:tmpl w:val="71843932"/>
@@ -5019,7 +6422,7 @@
       </w:pPr>
     </w:lvl>
   </w:abstractNum>
-  <w:abstractNum w:abstractNumId="1" w15:restartNumberingAfterBreak="0">
+  <w:abstractNum w:abstractNumId="2" w15:restartNumberingAfterBreak="0">
     <w:nsid w:val="68485FBB"/>
     <w:multiLevelType w:val="hybridMultilevel"/>
     <w:tmpl w:val="BFD498BE"/>
@@ -5108,7 +6511,7 @@
       </w:pPr>
     </w:lvl>
   </w:abstractNum>
-  <w:abstractNum w:abstractNumId="2" w15:restartNumberingAfterBreak="0">
+  <w:abstractNum w:abstractNumId="3" w15:restartNumberingAfterBreak="0">
     <w:nsid w:val="70943128"/>
     <w:multiLevelType w:val="hybridMultilevel"/>
     <w:tmpl w:val="45A0603E"/>
@@ -5197,7 +6600,7 @@
       </w:pPr>
     </w:lvl>
   </w:abstractNum>
-  <w:abstractNum w:abstractNumId="3" w15:restartNumberingAfterBreak="0">
+  <w:abstractNum w:abstractNumId="4" w15:restartNumberingAfterBreak="0">
     <w:nsid w:val="733C0BE0"/>
     <w:multiLevelType w:val="hybridMultilevel"/>
     <w:tmpl w:val="95186468"/>
@@ -5284,16 +6687,19 @@
     </w:lvl>
   </w:abstractNum>
   <w:num w:numId="1" w16cid:durableId="1067338956">
+    <w:abstractNumId w:val="4"/>
+  </w:num>
+  <w:num w:numId="2" w16cid:durableId="590284260">
+    <w:abstractNumId w:val="1"/>
+  </w:num>
+  <w:num w:numId="3" w16cid:durableId="294259356">
     <w:abstractNumId w:val="3"/>
   </w:num>
-  <w:num w:numId="2" w16cid:durableId="590284260">
-    <w:abstractNumId w:val="0"/>
-  </w:num>
-  <w:num w:numId="3" w16cid:durableId="294259356">
+  <w:num w:numId="4" w16cid:durableId="170342946">
     <w:abstractNumId w:val="2"/>
   </w:num>
-  <w:num w:numId="4" w16cid:durableId="170342946">
-    <w:abstractNumId w:val="1"/>
+  <w:num w:numId="5" w16cid:durableId="483355893">
+    <w:abstractNumId w:val="0"/>
   </w:num>
 </w:numbering>
 </file>

</xml_diff>

<commit_message>
FOPA lab2: presentation area added
</commit_message>
<xml_diff>
--- a/fopa/lab2/report.docx
+++ b/fopa/lab2/report.docx
@@ -987,15 +987,15 @@
           <w:p>
             <w:pPr>
               <w:jc w:val="center"/>
-              <w:rPr>
-                <w:lang w:val="en-US"/>
-              </w:rPr>
             </w:pPr>
             <w:r>
               <w:rPr>
                 <w:lang w:val="en-US"/>
               </w:rPr>
               <w:t>C</w:t>
+            </w:r>
+            <w:r>
+              <w:t xml:space="preserve"> – промежуточное значение</w:t>
             </w:r>
           </w:p>
         </w:tc>
@@ -1927,15 +1927,15 @@
           <w:p>
             <w:pPr>
               <w:jc w:val="center"/>
-              <w:rPr>
-                <w:lang w:val="en-US"/>
-              </w:rPr>
             </w:pPr>
             <w:r>
               <w:rPr>
                 <w:lang w:val="en-US"/>
               </w:rPr>
               <w:t>R</w:t>
+            </w:r>
+            <w:r>
+              <w:t xml:space="preserve"> - результат</w:t>
             </w:r>
           </w:p>
         </w:tc>
@@ -2172,6 +2172,119 @@
     </w:p>
     <w:p>
       <w:pPr>
+        <w:jc w:val="both"/>
+      </w:pPr>
+      <w:r>
+        <w:rPr>
+          <w:lang w:val="en-US"/>
+        </w:rPr>
+        <w:t>R</w:t>
+      </w:r>
+      <w:r>
+        <w:t xml:space="preserve"> – </w:t>
+      </w:r>
+      <w:r>
+        <w:t>знаковое</w:t>
+      </w:r>
+      <w:r>
+        <w:t xml:space="preserve">, </w:t>
+      </w:r>
+      <w:r>
+        <w:t>16-ти разрядное число</w:t>
+      </w:r>
+    </w:p>
+    <w:p>
+      <w:pPr>
+        <w:jc w:val="both"/>
+      </w:pPr>
+      <w:r>
+        <w:rPr>
+          <w:lang w:val="en-US"/>
+        </w:rPr>
+        <w:t>D</w:t>
+      </w:r>
+      <w:r>
+        <w:t xml:space="preserve"> – </w:t>
+      </w:r>
+      <w:r>
+        <w:t>знаковое</w:t>
+      </w:r>
+      <w:r>
+        <w:t xml:space="preserve">, </w:t>
+      </w:r>
+      <w:r>
+        <w:t>16-ти разрядное число</w:t>
+      </w:r>
+    </w:p>
+    <w:p>
+      <w:pPr>
+        <w:jc w:val="both"/>
+      </w:pPr>
+      <w:r>
+        <w:rPr>
+          <w:lang w:val="en-US"/>
+        </w:rPr>
+        <w:t>A</w:t>
+      </w:r>
+      <w:r>
+        <w:t>,</w:t>
+      </w:r>
+      <w:r>
+        <w:rPr>
+          <w:lang w:val="en-US"/>
+        </w:rPr>
+        <w:t>B</w:t>
+      </w:r>
+      <w:r>
+        <w:t xml:space="preserve"> </w:t>
+      </w:r>
+      <w:r>
+        <w:t>–</w:t>
+      </w:r>
+      <w:r>
+        <w:t xml:space="preserve"> набор из 16-ти логических однобитовых значений</w:t>
+      </w:r>
+    </w:p>
+    <w:p>
+      <w:pPr>
+        <w:jc w:val="both"/>
+      </w:pPr>
+      <w:r>
+        <w:t>(</w:t>
+      </w:r>
+      <w:r>
+        <w:rPr>
+          <w:lang w:val="en-US"/>
+        </w:rPr>
+        <w:t>A</w:t>
+      </w:r>
+      <w:r>
+        <w:t>&amp;</w:t>
+      </w:r>
+      <w:r>
+        <w:rPr>
+          <w:lang w:val="en-US"/>
+        </w:rPr>
+        <w:t>B</w:t>
+      </w:r>
+      <w:r>
+        <w:t>)</w:t>
+      </w:r>
+      <w:r>
+        <w:t xml:space="preserve"> – </w:t>
+      </w:r>
+      <w:r>
+        <w:t>трактуется как знаковое</w:t>
+      </w:r>
+      <w:r>
+        <w:t xml:space="preserve">, </w:t>
+      </w:r>
+      <w:r>
+        <w:t>16-ти разрядное число</w:t>
+      </w:r>
+    </w:p>
+    <w:p>
+      <w:pPr>
         <w:pStyle w:val="ListParagraph"/>
         <w:numPr>
           <w:ilvl w:val="0"/>
@@ -2188,6 +2301,146 @@
     </w:p>
     <w:p>
       <w:pPr>
+        <w:spacing w:line="480" w:lineRule="auto"/>
+        <w:rPr>
+          <w:szCs w:val="28"/>
+          <w:lang w:val="en-US"/>
+        </w:rPr>
+      </w:pPr>
+      <w:r>
+        <w:rPr>
+          <w:szCs w:val="28"/>
+          <w:lang w:val="en-US"/>
+        </w:rPr>
+        <w:t>-2</w:t>
+      </w:r>
+      <w:r>
+        <w:rPr>
+          <w:szCs w:val="28"/>
+          <w:vertAlign w:val="superscript"/>
+          <w:lang w:val="en-US"/>
+        </w:rPr>
+        <w:t>15</w:t>
+      </w:r>
+      <w:r>
+        <w:rPr>
+          <w:szCs w:val="28"/>
+          <w:lang w:val="en-US"/>
+        </w:rPr>
+        <w:t xml:space="preserve"> </w:t>
+      </w:r>
+      <w:r>
+        <w:rPr>
+          <w:rFonts w:ascii="less" w:hAnsi="less"/>
+          <w:szCs w:val="28"/>
+          <w:lang w:val="en-US"/>
+        </w:rPr>
+        <w:t xml:space="preserve"> </w:t>
+      </w:r>
+      <w:r>
+        <w:rPr>
+          <w:szCs w:val="28"/>
+        </w:rPr>
+        <w:t xml:space="preserve">≤ </w:t>
+      </w:r>
+      <w:r>
+        <w:rPr>
+          <w:szCs w:val="28"/>
+          <w:lang w:val="en-US"/>
+        </w:rPr>
+        <w:t xml:space="preserve">R </w:t>
+      </w:r>
+      <w:r>
+        <w:rPr>
+          <w:szCs w:val="28"/>
+          <w:lang w:val="en-US"/>
+        </w:rPr>
+        <w:t xml:space="preserve">≤ </w:t>
+      </w:r>
+      <w:r>
+        <w:rPr>
+          <w:szCs w:val="28"/>
+          <w:lang w:val="en-US"/>
+        </w:rPr>
+        <w:t>2</w:t>
+      </w:r>
+      <w:r>
+        <w:rPr>
+          <w:szCs w:val="28"/>
+          <w:vertAlign w:val="superscript"/>
+          <w:lang w:val="en-US"/>
+        </w:rPr>
+        <w:t>15</w:t>
+      </w:r>
+      <w:r>
+        <w:rPr>
+          <w:szCs w:val="28"/>
+          <w:lang w:val="en-US"/>
+        </w:rPr>
+        <w:t xml:space="preserve"> </w:t>
+      </w:r>
+      <w:r>
+        <w:rPr>
+          <w:szCs w:val="28"/>
+        </w:rPr>
+        <w:t xml:space="preserve">- </w:t>
+      </w:r>
+      <w:r>
+        <w:rPr>
+          <w:szCs w:val="28"/>
+          <w:lang w:val="en-US"/>
+        </w:rPr>
+        <w:t>1</w:t>
+      </w:r>
+    </w:p>
+    <w:p>
+      <w:pPr>
+        <w:spacing w:line="480" w:lineRule="auto"/>
+        <w:rPr>
+          <w:szCs w:val="28"/>
+        </w:rPr>
+      </w:pPr>
+      <w:r>
+        <w:rPr>
+          <w:szCs w:val="28"/>
+        </w:rPr>
+        <w:t>Случай 1</w:t>
+      </w:r>
+      <w:r>
+        <w:rPr>
+          <w:szCs w:val="28"/>
+        </w:rPr>
+        <w:t xml:space="preserve">. </w:t>
+      </w:r>
+      <w:r>
+        <w:rPr>
+          <w:szCs w:val="28"/>
+        </w:rPr>
+        <w:t>Если ограничить разрядность слагаемых</w:t>
+      </w:r>
+      <w:r>
+        <w:rPr>
+          <w:szCs w:val="28"/>
+        </w:rPr>
+        <w:t xml:space="preserve">, </w:t>
+      </w:r>
+      <w:r>
+        <w:rPr>
+          <w:szCs w:val="28"/>
+        </w:rPr>
+        <w:t>переполнения не возникнет</w:t>
+      </w:r>
+    </w:p>
+    <w:p>
+      <w:pPr>
+        <w:spacing w:line="480" w:lineRule="auto"/>
+        <w:rPr>
+          <w:szCs w:val="28"/>
+        </w:rPr>
+      </w:pPr>
+    </w:p>
+    <w:p>
+      <w:pPr>
         <w:pStyle w:val="ListParagraph"/>
         <w:numPr>
           <w:ilvl w:val="0"/>
@@ -2245,6 +2498,9 @@
     <w:p>
       <w:pPr>
         <w:jc w:val="both"/>
+        <w:rPr>
+          <w:lang w:val="en-US"/>
+        </w:rPr>
       </w:pPr>
       <w:r>
         <w:rPr>
@@ -2636,6 +2892,7 @@
               </w:rPr>
             </w:pPr>
             <w:r>
+              <w:lastRenderedPageBreak/>
               <w:t>13</w:t>
             </w:r>
             <w:r>

</xml_diff>

<commit_message>
FOPA lab2: report finished
</commit_message>
<xml_diff>
--- a/fopa/lab2/report.docx
+++ b/fopa/lab2/report.docx
@@ -665,161 +665,101 @@
     <w:p>
       <w:pPr>
         <w:jc w:val="both"/>
-        <w:rPr>
-          <w:lang w:val="en-US"/>
-        </w:rPr>
-      </w:pPr>
-    </w:p>
-    <w:p>
-      <w:pPr>
-        <w:jc w:val="both"/>
-        <w:rPr>
-          <w:lang w:val="en-US"/>
-        </w:rPr>
-      </w:pPr>
-    </w:p>
-    <w:p>
-      <w:pPr>
-        <w:jc w:val="both"/>
-        <w:rPr>
-          <w:lang w:val="en-US"/>
-        </w:rPr>
-      </w:pPr>
-    </w:p>
-    <w:p>
-      <w:pPr>
-        <w:jc w:val="both"/>
-        <w:rPr>
-          <w:lang w:val="en-US"/>
-        </w:rPr>
-      </w:pPr>
-    </w:p>
-    <w:p>
-      <w:pPr>
-        <w:jc w:val="both"/>
-        <w:rPr>
-          <w:lang w:val="en-US"/>
-        </w:rPr>
-      </w:pPr>
-    </w:p>
-    <w:p>
-      <w:pPr>
-        <w:jc w:val="both"/>
-        <w:rPr>
-          <w:lang w:val="en-US"/>
-        </w:rPr>
-      </w:pPr>
-    </w:p>
-    <w:p>
-      <w:pPr>
-        <w:jc w:val="both"/>
-        <w:rPr>
-          <w:lang w:val="en-US"/>
-        </w:rPr>
-      </w:pPr>
-    </w:p>
-    <w:p>
-      <w:pPr>
-        <w:jc w:val="both"/>
-        <w:rPr>
-          <w:lang w:val="en-US"/>
-        </w:rPr>
-      </w:pPr>
-    </w:p>
-    <w:p>
-      <w:pPr>
-        <w:jc w:val="both"/>
-        <w:rPr>
-          <w:lang w:val="en-US"/>
-        </w:rPr>
-      </w:pPr>
-    </w:p>
-    <w:p>
-      <w:pPr>
-        <w:jc w:val="both"/>
-        <w:rPr>
-          <w:lang w:val="en-US"/>
-        </w:rPr>
-      </w:pPr>
-    </w:p>
-    <w:p>
-      <w:pPr>
-        <w:jc w:val="both"/>
-        <w:rPr>
-          <w:lang w:val="en-US"/>
-        </w:rPr>
-      </w:pPr>
-    </w:p>
-    <w:p>
-      <w:pPr>
-        <w:jc w:val="both"/>
-        <w:rPr>
-          <w:lang w:val="en-US"/>
-        </w:rPr>
-      </w:pPr>
-    </w:p>
-    <w:p>
-      <w:pPr>
-        <w:jc w:val="both"/>
-        <w:rPr>
-          <w:lang w:val="en-US"/>
-        </w:rPr>
-      </w:pPr>
-    </w:p>
-    <w:p>
-      <w:pPr>
-        <w:jc w:val="both"/>
-        <w:rPr>
-          <w:lang w:val="en-US"/>
-        </w:rPr>
-      </w:pPr>
-    </w:p>
-    <w:p>
-      <w:pPr>
-        <w:jc w:val="both"/>
-        <w:rPr>
-          <w:lang w:val="en-US"/>
-        </w:rPr>
-      </w:pPr>
-    </w:p>
-    <w:p>
-      <w:pPr>
-        <w:jc w:val="both"/>
-        <w:rPr>
-          <w:lang w:val="en-US"/>
-        </w:rPr>
-      </w:pPr>
-    </w:p>
-    <w:p>
-      <w:pPr>
-        <w:jc w:val="both"/>
-        <w:rPr>
-          <w:lang w:val="en-US"/>
-        </w:rPr>
-      </w:pPr>
-    </w:p>
-    <w:p>
-      <w:pPr>
-        <w:jc w:val="both"/>
-        <w:rPr>
-          <w:lang w:val="en-US"/>
-        </w:rPr>
-      </w:pPr>
-    </w:p>
-    <w:p>
-      <w:pPr>
-        <w:jc w:val="both"/>
-        <w:rPr>
-          <w:lang w:val="en-US"/>
-        </w:rPr>
-      </w:pPr>
-    </w:p>
-    <w:p>
-      <w:pPr>
-        <w:jc w:val="both"/>
-        <w:rPr>
-          <w:lang w:val="en-US"/>
-        </w:rPr>
+      </w:pPr>
+    </w:p>
+    <w:p>
+      <w:pPr>
+        <w:jc w:val="both"/>
+      </w:pPr>
+    </w:p>
+    <w:p>
+      <w:pPr>
+        <w:jc w:val="both"/>
+      </w:pPr>
+    </w:p>
+    <w:p>
+      <w:pPr>
+        <w:jc w:val="both"/>
+      </w:pPr>
+    </w:p>
+    <w:p>
+      <w:pPr>
+        <w:jc w:val="both"/>
+      </w:pPr>
+    </w:p>
+    <w:p>
+      <w:pPr>
+        <w:jc w:val="both"/>
+      </w:pPr>
+    </w:p>
+    <w:p>
+      <w:pPr>
+        <w:jc w:val="both"/>
+      </w:pPr>
+    </w:p>
+    <w:p>
+      <w:pPr>
+        <w:jc w:val="both"/>
+      </w:pPr>
+    </w:p>
+    <w:p>
+      <w:pPr>
+        <w:jc w:val="both"/>
+      </w:pPr>
+    </w:p>
+    <w:p>
+      <w:pPr>
+        <w:jc w:val="both"/>
+      </w:pPr>
+    </w:p>
+    <w:p>
+      <w:pPr>
+        <w:jc w:val="both"/>
+      </w:pPr>
+    </w:p>
+    <w:p>
+      <w:pPr>
+        <w:jc w:val="both"/>
+      </w:pPr>
+    </w:p>
+    <w:p>
+      <w:pPr>
+        <w:jc w:val="both"/>
+      </w:pPr>
+    </w:p>
+    <w:p>
+      <w:pPr>
+        <w:jc w:val="both"/>
+      </w:pPr>
+    </w:p>
+    <w:p>
+      <w:pPr>
+        <w:jc w:val="both"/>
+      </w:pPr>
+    </w:p>
+    <w:p>
+      <w:pPr>
+        <w:jc w:val="both"/>
+      </w:pPr>
+    </w:p>
+    <w:p>
+      <w:pPr>
+        <w:jc w:val="both"/>
+      </w:pPr>
+    </w:p>
+    <w:p>
+      <w:pPr>
+        <w:jc w:val="both"/>
+      </w:pPr>
+    </w:p>
+    <w:p>
+      <w:pPr>
+        <w:jc w:val="both"/>
+      </w:pPr>
+    </w:p>
+    <w:p>
+      <w:pPr>
+        <w:jc w:val="both"/>
       </w:pPr>
     </w:p>
     <w:p>
@@ -829,7 +769,6 @@
         <w:rPr>
           <w:b/>
           <w:bCs/>
-          <w:lang w:val="en-US"/>
         </w:rPr>
       </w:pPr>
       <w:bookmarkStart w:id="1" w:name="_Toc209088593"/>
@@ -2438,6 +2377,1551 @@
           <w:szCs w:val="28"/>
         </w:rPr>
       </w:pPr>
+      <w:r>
+        <w:rPr>
+          <w:noProof/>
+          <w:szCs w:val="28"/>
+        </w:rPr>
+        <mc:AlternateContent>
+          <mc:Choice Requires="wps">
+            <w:drawing>
+              <wp:anchor distT="0" distB="0" distL="114300" distR="114300" simplePos="0" relativeHeight="251661312" behindDoc="0" locked="0" layoutInCell="1" allowOverlap="1" wp14:anchorId="5340C518" wp14:editId="36E27656">
+                <wp:simplePos x="0" y="0"/>
+                <wp:positionH relativeFrom="column">
+                  <wp:posOffset>-163668</wp:posOffset>
+                </wp:positionH>
+                <wp:positionV relativeFrom="paragraph">
+                  <wp:posOffset>1733949</wp:posOffset>
+                </wp:positionV>
+                <wp:extent cx="224775" cy="1858630"/>
+                <wp:effectExtent l="12700" t="12700" r="4445" b="8890"/>
+                <wp:wrapNone/>
+                <wp:docPr id="1126851216" name="Left Brace 4"/>
+                <wp:cNvGraphicFramePr/>
+                <a:graphic xmlns:a="http://schemas.openxmlformats.org/drawingml/2006/main">
+                  <a:graphicData uri="http://schemas.microsoft.com/office/word/2010/wordprocessingShape">
+                    <wps:wsp>
+                      <wps:cNvSpPr/>
+                      <wps:spPr>
+                        <a:xfrm>
+                          <a:off x="0" y="0"/>
+                          <a:ext cx="224775" cy="1858630"/>
+                        </a:xfrm>
+                        <a:prstGeom prst="leftBrace">
+                          <a:avLst/>
+                        </a:prstGeom>
+                        <a:ln w="19050">
+                          <a:solidFill>
+                            <a:schemeClr val="tx1"/>
+                          </a:solidFill>
+                        </a:ln>
+                      </wps:spPr>
+                      <wps:style>
+                        <a:lnRef idx="1">
+                          <a:schemeClr val="dk1"/>
+                        </a:lnRef>
+                        <a:fillRef idx="0">
+                          <a:schemeClr val="dk1"/>
+                        </a:fillRef>
+                        <a:effectRef idx="0">
+                          <a:schemeClr val="dk1"/>
+                        </a:effectRef>
+                        <a:fontRef idx="minor">
+                          <a:schemeClr val="tx1"/>
+                        </a:fontRef>
+                      </wps:style>
+                      <wps:bodyPr rot="0" spcFirstLastPara="0" vertOverflow="overflow" horzOverflow="overflow" vert="horz" wrap="square" lIns="91440" tIns="45720" rIns="91440" bIns="45720" numCol="1" spcCol="0" rtlCol="0" fromWordArt="0" anchor="ctr" anchorCtr="0" forceAA="0" compatLnSpc="1">
+                        <a:prstTxWarp prst="textNoShape">
+                          <a:avLst/>
+                        </a:prstTxWarp>
+                        <a:noAutofit/>
+                      </wps:bodyPr>
+                    </wps:wsp>
+                  </a:graphicData>
+                </a:graphic>
+                <wp14:sizeRelH relativeFrom="margin">
+                  <wp14:pctWidth>0</wp14:pctWidth>
+                </wp14:sizeRelH>
+                <wp14:sizeRelV relativeFrom="margin">
+                  <wp14:pctHeight>0</wp14:pctHeight>
+                </wp14:sizeRelV>
+              </wp:anchor>
+            </w:drawing>
+          </mc:Choice>
+          <mc:Fallback>
+            <w:pict>
+              <v:shapetype w14:anchorId="1D4BD6F1" id="_x0000_t87" coordsize="21600,21600" o:spt="87" adj="1800,10800" path="m21600,qx10800@0l10800@2qy0@11,10800@3l10800@1qy21600,21600e" filled="f">
+                <v:formulas>
+                  <v:f eqn="val #0"/>
+                  <v:f eqn="sum 21600 0 #0"/>
+                  <v:f eqn="sum #1 0 #0"/>
+                  <v:f eqn="sum #1 #0 0"/>
+                  <v:f eqn="prod #0 9598 32768"/>
+                  <v:f eqn="sum 21600 0 @4"/>
+                  <v:f eqn="sum 21600 0 #1"/>
+                  <v:f eqn="min #1 @6"/>
+                  <v:f eqn="prod @7 1 2"/>
+                  <v:f eqn="prod #0 2 1"/>
+                  <v:f eqn="sum 21600 0 @9"/>
+                  <v:f eqn="val #1"/>
+                </v:formulas>
+                <v:path arrowok="t" o:connecttype="custom" o:connectlocs="21600,0;0,10800;21600,21600" textboxrect="13963,@4,21600,@5"/>
+                <v:handles>
+                  <v:h position="center,#0" yrange="0,@8"/>
+                  <v:h position="topLeft,#1" yrange="@9,@10"/>
+                </v:handles>
+              </v:shapetype>
+              <v:shape id="Left Brace 4" o:spid="_x0000_s1026" type="#_x0000_t87" style="position:absolute;margin-left:-12.9pt;margin-top:136.55pt;width:17.7pt;height:146.35pt;z-index:251661312;visibility:visible;mso-wrap-style:square;mso-width-percent:0;mso-height-percent:0;mso-wrap-distance-left:9pt;mso-wrap-distance-top:0;mso-wrap-distance-right:9pt;mso-wrap-distance-bottom:0;mso-position-horizontal:absolute;mso-position-horizontal-relative:text;mso-position-vertical:absolute;mso-position-vertical-relative:text;mso-width-percent:0;mso-height-percent:0;mso-width-relative:margin;mso-height-relative:margin;v-text-anchor:middle" o:gfxdata="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" adj="218" strokecolor="black [3213]" strokeweight="1.5pt">
+                <v:stroke joinstyle="miter"/>
+              </v:shape>
+            </w:pict>
+          </mc:Fallback>
+        </mc:AlternateContent>
+      </w:r>
+      <w:r>
+        <w:rPr>
+          <w:noProof/>
+          <w:szCs w:val="28"/>
+        </w:rPr>
+        <w:drawing>
+          <wp:inline distT="0" distB="0" distL="0" distR="0" wp14:anchorId="51AFD355" wp14:editId="612FD1CF">
+            <wp:extent cx="5939790" cy="1408430"/>
+            <wp:effectExtent l="0" t="0" r="3810" b="1270"/>
+            <wp:docPr id="1771665743" name="Picture 1" descr="A close-up of a gauge&#10;&#10;AI-generated content may be incorrect."/>
+            <wp:cNvGraphicFramePr>
+              <a:graphicFrameLocks xmlns:a="http://schemas.openxmlformats.org/drawingml/2006/main" noChangeAspect="1"/>
+            </wp:cNvGraphicFramePr>
+            <a:graphic xmlns:a="http://schemas.openxmlformats.org/drawingml/2006/main">
+              <a:graphicData uri="http://schemas.openxmlformats.org/drawingml/2006/picture">
+                <pic:pic xmlns:pic="http://schemas.openxmlformats.org/drawingml/2006/picture">
+                  <pic:nvPicPr>
+                    <pic:cNvPr id="1771665743" name="Picture 1" descr="A close-up of a gauge&#10;&#10;AI-generated content may be incorrect."/>
+                    <pic:cNvPicPr/>
+                  </pic:nvPicPr>
+                  <pic:blipFill>
+                    <a:blip r:embed="rId8" cstate="print">
+                      <a:extLst>
+                        <a:ext uri="{28A0092B-C50C-407E-A947-70E740481C1C}">
+                          <a14:useLocalDpi xmlns:a14="http://schemas.microsoft.com/office/drawing/2010/main" val="0"/>
+                        </a:ext>
+                      </a:extLst>
+                    </a:blip>
+                    <a:stretch>
+                      <a:fillRect/>
+                    </a:stretch>
+                  </pic:blipFill>
+                  <pic:spPr>
+                    <a:xfrm>
+                      <a:off x="0" y="0"/>
+                      <a:ext cx="5939790" cy="1408430"/>
+                    </a:xfrm>
+                    <a:prstGeom prst="rect">
+                      <a:avLst/>
+                    </a:prstGeom>
+                  </pic:spPr>
+                </pic:pic>
+              </a:graphicData>
+            </a:graphic>
+          </wp:inline>
+        </w:drawing>
+      </w:r>
+    </w:p>
+    <w:p>
+      <w:pPr>
+        <w:rPr>
+          <w:lang w:val="en-US"/>
+        </w:rPr>
+      </w:pPr>
+      <w:r>
+        <w:rPr>
+          <w:lang w:val="en-US"/>
+        </w:rPr>
+        <w:t>-2</w:t>
+      </w:r>
+      <w:r>
+        <w:rPr>
+          <w:vertAlign w:val="superscript"/>
+          <w:lang w:val="en-US"/>
+        </w:rPr>
+        <w:t xml:space="preserve">14 </w:t>
+      </w:r>
+      <w:r>
+        <w:rPr>
+          <w:lang w:val="en-US"/>
+        </w:rPr>
+        <w:t>≤ (A &amp; B) ≤ 2</w:t>
+      </w:r>
+      <w:r>
+        <w:rPr>
+          <w:vertAlign w:val="superscript"/>
+          <w:lang w:val="en-US"/>
+        </w:rPr>
+        <w:t xml:space="preserve">14 </w:t>
+      </w:r>
+      <w:r>
+        <w:rPr>
+          <w:lang w:val="en-US"/>
+        </w:rPr>
+        <w:t>– 1</w:t>
+      </w:r>
+    </w:p>
+    <w:p>
+      <w:pPr>
+        <w:rPr>
+          <w:lang w:val="en-US"/>
+        </w:rPr>
+      </w:pPr>
+      <w:r>
+        <w:rPr>
+          <w:lang w:val="en-US"/>
+        </w:rPr>
+        <w:t>-2</w:t>
+      </w:r>
+      <w:r>
+        <w:rPr>
+          <w:vertAlign w:val="superscript"/>
+          <w:lang w:val="en-US"/>
+        </w:rPr>
+        <w:t xml:space="preserve">14 </w:t>
+      </w:r>
+      <w:r>
+        <w:rPr>
+          <w:lang w:val="en-US"/>
+        </w:rPr>
+        <w:t xml:space="preserve">≤ </w:t>
+      </w:r>
+      <w:r>
+        <w:rPr>
+          <w:lang w:val="en-US"/>
+        </w:rPr>
+        <w:t>D</w:t>
+      </w:r>
+      <w:r>
+        <w:rPr>
+          <w:lang w:val="en-US"/>
+        </w:rPr>
+        <w:t xml:space="preserve"> ≤ 2</w:t>
+      </w:r>
+      <w:r>
+        <w:rPr>
+          <w:vertAlign w:val="superscript"/>
+          <w:lang w:val="en-US"/>
+        </w:rPr>
+        <w:t xml:space="preserve">14 </w:t>
+      </w:r>
+      <w:r>
+        <w:rPr>
+          <w:lang w:val="en-US"/>
+        </w:rPr>
+        <w:t>–</w:t>
+      </w:r>
+      <w:r>
+        <w:rPr>
+          <w:lang w:val="en-US"/>
+        </w:rPr>
+        <w:t xml:space="preserve"> 1</w:t>
+      </w:r>
+    </w:p>
+    <w:p>
+      <w:pPr>
+        <w:rPr>
+          <w:lang w:val="en-US"/>
+        </w:rPr>
+      </w:pPr>
+      <w:r>
+        <w:rPr>
+          <w:lang w:val="en-US"/>
+        </w:rPr>
+        <w:t>A</w:t>
+      </w:r>
+      <w:r>
+        <w:rPr>
+          <w:vertAlign w:val="subscript"/>
+          <w:lang w:val="en-US"/>
+        </w:rPr>
+        <w:t>15</w:t>
+      </w:r>
+      <w:r>
+        <w:rPr>
+          <w:lang w:val="en-US"/>
+        </w:rPr>
+        <w:t xml:space="preserve"> </w:t>
+      </w:r>
+      <w:r>
+        <w:rPr>
+          <w:rFonts w:eastAsia="Times New Roman"/>
+          <w:noProof/>
+          <w:kern w:val="0"/>
+          <w:lang w:val="en-RU" w:eastAsia="en-GB"/>
+          <w14:ligatures w14:val="none"/>
+        </w:rPr>
+        <w:drawing>
+          <wp:inline distT="0" distB="0" distL="0" distR="0" wp14:anchorId="75B50FAA" wp14:editId="131F8FA6">
+            <wp:extent cx="5080" cy="5080"/>
+            <wp:effectExtent l="0" t="0" r="0" b="0"/>
+            <wp:docPr id="856794671" name="Picture 2"/>
+            <wp:cNvGraphicFramePr>
+              <a:graphicFrameLocks xmlns:a="http://schemas.openxmlformats.org/drawingml/2006/main" noChangeAspect="1"/>
+            </wp:cNvGraphicFramePr>
+            <a:graphic xmlns:a="http://schemas.openxmlformats.org/drawingml/2006/main">
+              <a:graphicData uri="http://schemas.openxmlformats.org/drawingml/2006/picture">
+                <pic:pic xmlns:pic="http://schemas.openxmlformats.org/drawingml/2006/picture">
+                  <pic:nvPicPr>
+                    <pic:cNvPr id="0" name="Picture 1"/>
+                    <pic:cNvPicPr>
+                      <a:picLocks noChangeAspect="1" noChangeArrowheads="1"/>
+                    </pic:cNvPicPr>
+                  </pic:nvPicPr>
+                  <pic:blipFill>
+                    <a:blip r:embed="rId9">
+                      <a:extLst>
+                        <a:ext uri="{28A0092B-C50C-407E-A947-70E740481C1C}">
+                          <a14:useLocalDpi xmlns:a14="http://schemas.microsoft.com/office/drawing/2010/main" val="0"/>
+                        </a:ext>
+                      </a:extLst>
+                    </a:blip>
+                    <a:srcRect/>
+                    <a:stretch>
+                      <a:fillRect/>
+                    </a:stretch>
+                  </pic:blipFill>
+                  <pic:spPr bwMode="auto">
+                    <a:xfrm>
+                      <a:off x="0" y="0"/>
+                      <a:ext cx="5080" cy="5080"/>
+                    </a:xfrm>
+                    <a:prstGeom prst="rect">
+                      <a:avLst/>
+                    </a:prstGeom>
+                    <a:noFill/>
+                    <a:ln>
+                      <a:noFill/>
+                    </a:ln>
+                  </pic:spPr>
+                </pic:pic>
+              </a:graphicData>
+            </a:graphic>
+          </wp:inline>
+        </w:drawing>
+      </w:r>
+      <w:r>
+        <w:rPr>
+          <w:rFonts w:ascii="Cambria Math" w:eastAsia="Times New Roman" w:hAnsi="Cambria Math" w:cs="Cambria Math"/>
+          <w:kern w:val="0"/>
+          <w:lang w:val="en-RU" w:eastAsia="en-GB"/>
+          <w14:ligatures w14:val="none"/>
+        </w:rPr>
+        <w:t>⊕</w:t>
+      </w:r>
+      <w:r>
+        <w:rPr>
+          <w:rFonts w:eastAsia="Times New Roman"/>
+          <w:kern w:val="0"/>
+          <w:lang w:val="en-RU" w:eastAsia="en-GB"/>
+          <w14:ligatures w14:val="none"/>
+        </w:rPr>
+        <w:t xml:space="preserve"> </w:t>
+      </w:r>
+      <w:r>
+        <w:rPr>
+          <w:lang w:val="en-US"/>
+        </w:rPr>
+        <w:t>A</w:t>
+      </w:r>
+      <w:r>
+        <w:rPr>
+          <w:vertAlign w:val="subscript"/>
+          <w:lang w:val="en-US"/>
+        </w:rPr>
+        <w:t>14</w:t>
+      </w:r>
+      <w:r>
+        <w:rPr>
+          <w:lang w:val="en-US"/>
+        </w:rPr>
+        <w:t xml:space="preserve"> = 0</w:t>
+      </w:r>
+    </w:p>
+    <w:p>
+      <w:pPr>
+        <w:rPr>
+          <w:rFonts w:eastAsia="Times New Roman"/>
+          <w:kern w:val="0"/>
+          <w:lang w:val="en-RU" w:eastAsia="en-GB"/>
+          <w14:ligatures w14:val="none"/>
+        </w:rPr>
+      </w:pPr>
+      <w:r>
+        <w:rPr>
+          <w:lang w:val="en-US"/>
+        </w:rPr>
+        <w:t>B</w:t>
+      </w:r>
+      <w:r>
+        <w:rPr>
+          <w:vertAlign w:val="subscript"/>
+          <w:lang w:val="en-US"/>
+        </w:rPr>
+        <w:t>15</w:t>
+      </w:r>
+      <w:r>
+        <w:rPr>
+          <w:lang w:val="en-US"/>
+        </w:rPr>
+        <w:t xml:space="preserve"> </w:t>
+      </w:r>
+      <w:r>
+        <w:rPr>
+          <w:rFonts w:ascii="Cambria Math" w:eastAsia="Times New Roman" w:hAnsi="Cambria Math" w:cs="Cambria Math"/>
+          <w:kern w:val="0"/>
+          <w:lang w:val="en-RU" w:eastAsia="en-GB"/>
+          <w14:ligatures w14:val="none"/>
+        </w:rPr>
+        <w:t>⊕</w:t>
+      </w:r>
+      <w:r>
+        <w:rPr>
+          <w:rFonts w:eastAsia="Times New Roman"/>
+          <w:kern w:val="0"/>
+          <w:lang w:val="en-RU" w:eastAsia="en-GB"/>
+          <w14:ligatures w14:val="none"/>
+        </w:rPr>
+        <w:t xml:space="preserve"> </w:t>
+      </w:r>
+      <w:r>
+        <w:rPr>
+          <w:rFonts w:eastAsia="Times New Roman"/>
+          <w:kern w:val="0"/>
+          <w:lang w:val="en-RU" w:eastAsia="en-GB"/>
+          <w14:ligatures w14:val="none"/>
+        </w:rPr>
+        <w:t>B</w:t>
+      </w:r>
+      <w:r>
+        <w:rPr>
+          <w:rFonts w:eastAsia="Times New Roman"/>
+          <w:kern w:val="0"/>
+          <w:vertAlign w:val="subscript"/>
+          <w:lang w:val="en-RU" w:eastAsia="en-GB"/>
+          <w14:ligatures w14:val="none"/>
+        </w:rPr>
+        <w:t>14</w:t>
+      </w:r>
+      <w:r>
+        <w:rPr>
+          <w:rFonts w:eastAsia="Times New Roman"/>
+          <w:kern w:val="0"/>
+          <w:lang w:val="en-RU" w:eastAsia="en-GB"/>
+          <w14:ligatures w14:val="none"/>
+        </w:rPr>
+        <w:t xml:space="preserve"> = 0</w:t>
+      </w:r>
+    </w:p>
+    <w:p>
+      <w:pPr>
+        <w:rPr>
+          <w:rFonts w:eastAsia="Times New Roman"/>
+          <w:kern w:val="0"/>
+          <w:lang w:val="en-RU" w:eastAsia="en-GB"/>
+          <w14:ligatures w14:val="none"/>
+        </w:rPr>
+      </w:pPr>
+      <w:r>
+        <w:rPr>
+          <w:rFonts w:eastAsia="Times New Roman"/>
+          <w:kern w:val="0"/>
+          <w:lang w:val="en-RU" w:eastAsia="en-GB"/>
+          <w14:ligatures w14:val="none"/>
+        </w:rPr>
+        <w:t>A</w:t>
+      </w:r>
+      <w:r>
+        <w:rPr>
+          <w:rFonts w:eastAsia="Times New Roman"/>
+          <w:kern w:val="0"/>
+          <w:vertAlign w:val="subscript"/>
+          <w:lang w:val="en-RU" w:eastAsia="en-GB"/>
+          <w14:ligatures w14:val="none"/>
+        </w:rPr>
+        <w:t>i</w:t>
+      </w:r>
+      <w:r>
+        <w:rPr>
+          <w:rFonts w:eastAsia="Times New Roman"/>
+          <w:kern w:val="0"/>
+          <w:lang w:val="en-RU" w:eastAsia="en-GB"/>
+          <w14:ligatures w14:val="none"/>
+        </w:rPr>
+        <w:t xml:space="preserve">, </w:t>
+      </w:r>
+      <w:r>
+        <w:rPr>
+          <w:rFonts w:eastAsia="Times New Roman"/>
+          <w:kern w:val="0"/>
+          <w:lang w:val="en-RU" w:eastAsia="en-GB"/>
+          <w14:ligatures w14:val="none"/>
+        </w:rPr>
+        <w:t>B</w:t>
+      </w:r>
+      <w:r>
+        <w:rPr>
+          <w:rFonts w:eastAsia="Times New Roman"/>
+          <w:kern w:val="0"/>
+          <w:vertAlign w:val="subscript"/>
+          <w:lang w:val="en-RU" w:eastAsia="en-GB"/>
+          <w14:ligatures w14:val="none"/>
+        </w:rPr>
+        <w:t>i</w:t>
+      </w:r>
+      <w:r>
+        <w:rPr>
+          <w:rFonts w:eastAsia="Times New Roman"/>
+          <w:kern w:val="0"/>
+          <w:lang w:val="en-RU" w:eastAsia="en-GB"/>
+          <w14:ligatures w14:val="none"/>
+        </w:rPr>
+        <w:t xml:space="preserve"> in {0,1}, 0 ≤ i ≤ 13</w:t>
+      </w:r>
+    </w:p>
+    <w:p>
+      <w:pPr>
+        <w:spacing w:line="480" w:lineRule="auto"/>
+        <w:rPr>
+          <w:szCs w:val="28"/>
+          <w:lang w:val="en-US"/>
+        </w:rPr>
+      </w:pPr>
+    </w:p>
+    <w:p>
+      <w:pPr>
+        <w:spacing w:line="480" w:lineRule="auto"/>
+        <w:rPr>
+          <w:szCs w:val="28"/>
+          <w:lang w:val="en-US"/>
+        </w:rPr>
+      </w:pPr>
+      <w:r>
+        <w:rPr>
+          <w:szCs w:val="28"/>
+        </w:rPr>
+        <w:lastRenderedPageBreak/>
+        <w:t>Случай 2</w:t>
+      </w:r>
+      <w:r>
+        <w:rPr>
+          <w:szCs w:val="28"/>
+          <w:lang w:val="en-US"/>
+        </w:rPr>
+        <w:t>.</w:t>
+      </w:r>
+      <w:r>
+        <w:rPr>
+          <w:szCs w:val="28"/>
+        </w:rPr>
+        <w:t xml:space="preserve"> Пусть 2</w:t>
+      </w:r>
+      <w:r>
+        <w:rPr>
+          <w:szCs w:val="28"/>
+          <w:vertAlign w:val="superscript"/>
+          <w:lang w:val="en-US"/>
+        </w:rPr>
+        <w:t>14</w:t>
+      </w:r>
+      <w:r>
+        <w:rPr>
+          <w:szCs w:val="28"/>
+          <w:lang w:val="en-US"/>
+        </w:rPr>
+        <w:t xml:space="preserve"> ≤ D ≤ </w:t>
+      </w:r>
+      <w:r>
+        <w:rPr>
+          <w:szCs w:val="28"/>
+          <w:lang w:val="en-US"/>
+        </w:rPr>
+        <w:t>2</w:t>
+      </w:r>
+      <w:r>
+        <w:rPr>
+          <w:szCs w:val="28"/>
+          <w:vertAlign w:val="superscript"/>
+          <w:lang w:val="en-US"/>
+        </w:rPr>
+        <w:t>15</w:t>
+      </w:r>
+      <w:r>
+        <w:rPr>
+          <w:szCs w:val="28"/>
+          <w:lang w:val="en-US"/>
+        </w:rPr>
+        <w:t xml:space="preserve"> </w:t>
+      </w:r>
+      <w:r>
+        <w:rPr>
+          <w:szCs w:val="28"/>
+          <w:lang w:val="en-US"/>
+        </w:rPr>
+        <w:t>–</w:t>
+      </w:r>
+      <w:r>
+        <w:rPr>
+          <w:szCs w:val="28"/>
+          <w:lang w:val="en-US"/>
+        </w:rPr>
+        <w:t xml:space="preserve"> 1</w:t>
+      </w:r>
+    </w:p>
+    <w:p>
+      <w:pPr>
+        <w:spacing w:line="480" w:lineRule="auto"/>
+        <w:rPr>
+          <w:szCs w:val="28"/>
+          <w:lang w:val="en-US"/>
+        </w:rPr>
+      </w:pPr>
+      <w:r>
+        <w:rPr>
+          <w:noProof/>
+          <w:szCs w:val="28"/>
+        </w:rPr>
+        <mc:AlternateContent>
+          <mc:Choice Requires="wps">
+            <w:drawing>
+              <wp:anchor distT="0" distB="0" distL="114300" distR="114300" simplePos="0" relativeHeight="251659264" behindDoc="0" locked="0" layoutInCell="1" allowOverlap="1" wp14:anchorId="4A0909C9" wp14:editId="35CE7468">
+                <wp:simplePos x="0" y="0"/>
+                <wp:positionH relativeFrom="column">
+                  <wp:posOffset>-165392</wp:posOffset>
+                </wp:positionH>
+                <wp:positionV relativeFrom="paragraph">
+                  <wp:posOffset>1871259</wp:posOffset>
+                </wp:positionV>
+                <wp:extent cx="170121" cy="1395970"/>
+                <wp:effectExtent l="12700" t="12700" r="0" b="13970"/>
+                <wp:wrapNone/>
+                <wp:docPr id="706362351" name="Left Brace 4"/>
+                <wp:cNvGraphicFramePr/>
+                <a:graphic xmlns:a="http://schemas.openxmlformats.org/drawingml/2006/main">
+                  <a:graphicData uri="http://schemas.microsoft.com/office/word/2010/wordprocessingShape">
+                    <wps:wsp>
+                      <wps:cNvSpPr/>
+                      <wps:spPr>
+                        <a:xfrm>
+                          <a:off x="0" y="0"/>
+                          <a:ext cx="170121" cy="1395970"/>
+                        </a:xfrm>
+                        <a:prstGeom prst="leftBrace">
+                          <a:avLst/>
+                        </a:prstGeom>
+                        <a:ln w="19050">
+                          <a:solidFill>
+                            <a:schemeClr val="tx1"/>
+                          </a:solidFill>
+                        </a:ln>
+                      </wps:spPr>
+                      <wps:style>
+                        <a:lnRef idx="1">
+                          <a:schemeClr val="dk1"/>
+                        </a:lnRef>
+                        <a:fillRef idx="0">
+                          <a:schemeClr val="dk1"/>
+                        </a:fillRef>
+                        <a:effectRef idx="0">
+                          <a:schemeClr val="dk1"/>
+                        </a:effectRef>
+                        <a:fontRef idx="minor">
+                          <a:schemeClr val="tx1"/>
+                        </a:fontRef>
+                      </wps:style>
+                      <wps:bodyPr rot="0" spcFirstLastPara="0" vertOverflow="overflow" horzOverflow="overflow" vert="horz" wrap="square" lIns="91440" tIns="45720" rIns="91440" bIns="45720" numCol="1" spcCol="0" rtlCol="0" fromWordArt="0" anchor="ctr" anchorCtr="0" forceAA="0" compatLnSpc="1">
+                        <a:prstTxWarp prst="textNoShape">
+                          <a:avLst/>
+                        </a:prstTxWarp>
+                        <a:noAutofit/>
+                      </wps:bodyPr>
+                    </wps:wsp>
+                  </a:graphicData>
+                </a:graphic>
+                <wp14:sizeRelV relativeFrom="margin">
+                  <wp14:pctHeight>0</wp14:pctHeight>
+                </wp14:sizeRelV>
+              </wp:anchor>
+            </w:drawing>
+          </mc:Choice>
+          <mc:Fallback>
+            <w:pict>
+              <v:shape w14:anchorId="6AE223CD" id="Left Brace 4" o:spid="_x0000_s1026" type="#_x0000_t87" style="position:absolute;margin-left:-13pt;margin-top:147.35pt;width:13.4pt;height:109.9pt;z-index:251659264;visibility:visible;mso-wrap-style:square;mso-height-percent:0;mso-wrap-distance-left:9pt;mso-wrap-distance-top:0;mso-wrap-distance-right:9pt;mso-wrap-distance-bottom:0;mso-position-horizontal:absolute;mso-position-horizontal-relative:text;mso-position-vertical:absolute;mso-position-vertical-relative:text;mso-height-percent:0;mso-height-relative:margin;v-text-anchor:middle" o:gfxdata="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" adj="219" strokecolor="black [3213]" strokeweight="1.5pt">
+                <v:stroke joinstyle="miter"/>
+              </v:shape>
+            </w:pict>
+          </mc:Fallback>
+        </mc:AlternateContent>
+      </w:r>
+      <w:r>
+        <w:rPr>
+          <w:noProof/>
+          <w:szCs w:val="28"/>
+        </w:rPr>
+        <w:drawing>
+          <wp:inline distT="0" distB="0" distL="0" distR="0" wp14:anchorId="0D34CC53" wp14:editId="0CB2F72F">
+            <wp:extent cx="5939790" cy="1659890"/>
+            <wp:effectExtent l="0" t="0" r="3810" b="3810"/>
+            <wp:docPr id="806304535" name="Picture 7" descr="A diagram of a curve&#10;&#10;AI-generated content may be incorrect."/>
+            <wp:cNvGraphicFramePr>
+              <a:graphicFrameLocks xmlns:a="http://schemas.openxmlformats.org/drawingml/2006/main" noChangeAspect="1"/>
+            </wp:cNvGraphicFramePr>
+            <a:graphic xmlns:a="http://schemas.openxmlformats.org/drawingml/2006/main">
+              <a:graphicData uri="http://schemas.openxmlformats.org/drawingml/2006/picture">
+                <pic:pic xmlns:pic="http://schemas.openxmlformats.org/drawingml/2006/picture">
+                  <pic:nvPicPr>
+                    <pic:cNvPr id="806304535" name="Picture 7" descr="A diagram of a curve&#10;&#10;AI-generated content may be incorrect."/>
+                    <pic:cNvPicPr/>
+                  </pic:nvPicPr>
+                  <pic:blipFill>
+                    <a:blip r:embed="rId10">
+                      <a:extLst>
+                        <a:ext uri="{28A0092B-C50C-407E-A947-70E740481C1C}">
+                          <a14:useLocalDpi xmlns:a14="http://schemas.microsoft.com/office/drawing/2010/main" val="0"/>
+                        </a:ext>
+                      </a:extLst>
+                    </a:blip>
+                    <a:stretch>
+                      <a:fillRect/>
+                    </a:stretch>
+                  </pic:blipFill>
+                  <pic:spPr>
+                    <a:xfrm>
+                      <a:off x="0" y="0"/>
+                      <a:ext cx="5939790" cy="1659890"/>
+                    </a:xfrm>
+                    <a:prstGeom prst="rect">
+                      <a:avLst/>
+                    </a:prstGeom>
+                  </pic:spPr>
+                </pic:pic>
+              </a:graphicData>
+            </a:graphic>
+          </wp:inline>
+        </w:drawing>
+      </w:r>
+    </w:p>
+    <w:p>
+      <w:pPr>
+        <w:spacing w:line="480" w:lineRule="auto"/>
+        <w:rPr>
+          <w:szCs w:val="28"/>
+          <w:lang w:val="en-US"/>
+        </w:rPr>
+      </w:pPr>
+      <w:r>
+        <w:rPr>
+          <w:szCs w:val="28"/>
+          <w:lang w:val="en-US"/>
+        </w:rPr>
+        <w:t>2</w:t>
+      </w:r>
+      <w:r>
+        <w:rPr>
+          <w:szCs w:val="28"/>
+          <w:vertAlign w:val="superscript"/>
+          <w:lang w:val="en-US"/>
+        </w:rPr>
+        <w:t>14</w:t>
+      </w:r>
+      <w:r>
+        <w:rPr>
+          <w:szCs w:val="28"/>
+          <w:lang w:val="en-US"/>
+        </w:rPr>
+        <w:t xml:space="preserve"> ≤ D ≤ 2</w:t>
+      </w:r>
+      <w:r>
+        <w:rPr>
+          <w:szCs w:val="28"/>
+          <w:vertAlign w:val="superscript"/>
+          <w:lang w:val="en-US"/>
+        </w:rPr>
+        <w:t>15</w:t>
+      </w:r>
+      <w:r>
+        <w:rPr>
+          <w:szCs w:val="28"/>
+          <w:lang w:val="en-US"/>
+        </w:rPr>
+        <w:t xml:space="preserve"> – 1</w:t>
+      </w:r>
+    </w:p>
+    <w:p>
+      <w:pPr>
+        <w:spacing w:line="480" w:lineRule="auto"/>
+        <w:rPr>
+          <w:szCs w:val="28"/>
+          <w:lang w:val="en-US"/>
+        </w:rPr>
+      </w:pPr>
+      <w:r>
+        <w:rPr>
+          <w:szCs w:val="28"/>
+          <w:lang w:val="en-US"/>
+        </w:rPr>
+        <w:t>A</w:t>
+      </w:r>
+      <w:r>
+        <w:rPr>
+          <w:szCs w:val="28"/>
+          <w:vertAlign w:val="subscript"/>
+          <w:lang w:val="en-US"/>
+        </w:rPr>
+        <w:t>15</w:t>
+      </w:r>
+      <w:r>
+        <w:rPr>
+          <w:szCs w:val="28"/>
+          <w:lang w:val="en-US"/>
+        </w:rPr>
+        <w:t xml:space="preserve"> = 1, B</w:t>
+      </w:r>
+      <w:r>
+        <w:rPr>
+          <w:szCs w:val="28"/>
+          <w:vertAlign w:val="subscript"/>
+          <w:lang w:val="en-US"/>
+        </w:rPr>
+        <w:t>15</w:t>
+      </w:r>
+      <w:r>
+        <w:rPr>
+          <w:szCs w:val="28"/>
+          <w:lang w:val="en-US"/>
+        </w:rPr>
+        <w:t xml:space="preserve"> = 1</w:t>
+      </w:r>
+    </w:p>
+    <w:p>
+      <w:pPr>
+        <w:rPr>
+          <w:rFonts w:eastAsia="Times New Roman"/>
+          <w:kern w:val="0"/>
+          <w:lang w:val="en-RU" w:eastAsia="en-GB"/>
+          <w14:ligatures w14:val="none"/>
+        </w:rPr>
+      </w:pPr>
+      <w:r>
+        <w:rPr>
+          <w:rFonts w:eastAsia="Times New Roman"/>
+          <w:kern w:val="0"/>
+          <w:lang w:val="en-RU" w:eastAsia="en-GB"/>
+          <w14:ligatures w14:val="none"/>
+        </w:rPr>
+        <w:t>A</w:t>
+      </w:r>
+      <w:r>
+        <w:rPr>
+          <w:rFonts w:eastAsia="Times New Roman"/>
+          <w:kern w:val="0"/>
+          <w:vertAlign w:val="subscript"/>
+          <w:lang w:val="en-RU" w:eastAsia="en-GB"/>
+          <w14:ligatures w14:val="none"/>
+        </w:rPr>
+        <w:t>i</w:t>
+      </w:r>
+      <w:r>
+        <w:rPr>
+          <w:rFonts w:eastAsia="Times New Roman"/>
+          <w:kern w:val="0"/>
+          <w:lang w:val="en-RU" w:eastAsia="en-GB"/>
+          <w14:ligatures w14:val="none"/>
+        </w:rPr>
+        <w:t xml:space="preserve">, </w:t>
+      </w:r>
+      <w:r>
+        <w:rPr>
+          <w:rFonts w:eastAsia="Times New Roman"/>
+          <w:kern w:val="0"/>
+          <w:lang w:val="en-RU" w:eastAsia="en-GB"/>
+          <w14:ligatures w14:val="none"/>
+        </w:rPr>
+        <w:t>B</w:t>
+      </w:r>
+      <w:r>
+        <w:rPr>
+          <w:rFonts w:eastAsia="Times New Roman"/>
+          <w:kern w:val="0"/>
+          <w:vertAlign w:val="subscript"/>
+          <w:lang w:val="en-RU" w:eastAsia="en-GB"/>
+          <w14:ligatures w14:val="none"/>
+        </w:rPr>
+        <w:t>i</w:t>
+      </w:r>
+      <w:r>
+        <w:rPr>
+          <w:rFonts w:eastAsia="Times New Roman"/>
+          <w:kern w:val="0"/>
+          <w:lang w:val="en-RU" w:eastAsia="en-GB"/>
+          <w14:ligatures w14:val="none"/>
+        </w:rPr>
+        <w:t xml:space="preserve"> in {0,1}, 0 ≤ i ≤ 1</w:t>
+      </w:r>
+      <w:r>
+        <w:rPr>
+          <w:rFonts w:eastAsia="Times New Roman"/>
+          <w:kern w:val="0"/>
+          <w:lang w:val="en-RU" w:eastAsia="en-GB"/>
+          <w14:ligatures w14:val="none"/>
+        </w:rPr>
+        <w:t>4</w:t>
+      </w:r>
+    </w:p>
+    <w:p>
+      <w:pPr>
+        <w:rPr>
+          <w:rFonts w:eastAsia="Times New Roman"/>
+          <w:kern w:val="0"/>
+          <w:lang w:val="en-US" w:eastAsia="en-GB"/>
+          <w14:ligatures w14:val="none"/>
+        </w:rPr>
+      </w:pPr>
+      <w:r>
+        <w:rPr>
+          <w:rFonts w:eastAsia="Times New Roman"/>
+          <w:kern w:val="0"/>
+          <w:lang w:eastAsia="en-GB"/>
+          <w14:ligatures w14:val="none"/>
+        </w:rPr>
+        <w:t>Случай 3</w:t>
+      </w:r>
+      <w:r>
+        <w:rPr>
+          <w:rFonts w:eastAsia="Times New Roman"/>
+          <w:kern w:val="0"/>
+          <w:lang w:val="en-US" w:eastAsia="en-GB"/>
+          <w14:ligatures w14:val="none"/>
+        </w:rPr>
+        <w:t xml:space="preserve">. </w:t>
+      </w:r>
+      <w:r>
+        <w:rPr>
+          <w:rFonts w:eastAsia="Times New Roman"/>
+          <w:kern w:val="0"/>
+          <w:lang w:eastAsia="en-GB"/>
+          <w14:ligatures w14:val="none"/>
+        </w:rPr>
+        <w:t>Пусть -2</w:t>
+      </w:r>
+      <w:r>
+        <w:rPr>
+          <w:rFonts w:eastAsia="Times New Roman"/>
+          <w:kern w:val="0"/>
+          <w:vertAlign w:val="superscript"/>
+          <w:lang w:val="en-US" w:eastAsia="en-GB"/>
+          <w14:ligatures w14:val="none"/>
+        </w:rPr>
+        <w:t>15</w:t>
+      </w:r>
+      <w:r>
+        <w:rPr>
+          <w:rFonts w:eastAsia="Times New Roman"/>
+          <w:kern w:val="0"/>
+          <w:lang w:val="en-US" w:eastAsia="en-GB"/>
+          <w14:ligatures w14:val="none"/>
+        </w:rPr>
+        <w:t xml:space="preserve"> ≤ D ≤ -2</w:t>
+      </w:r>
+      <w:r>
+        <w:rPr>
+          <w:rFonts w:eastAsia="Times New Roman"/>
+          <w:kern w:val="0"/>
+          <w:vertAlign w:val="superscript"/>
+          <w:lang w:val="en-US" w:eastAsia="en-GB"/>
+          <w14:ligatures w14:val="none"/>
+        </w:rPr>
+        <w:t>14</w:t>
+      </w:r>
+      <w:r>
+        <w:rPr>
+          <w:rFonts w:eastAsia="Times New Roman"/>
+          <w:kern w:val="0"/>
+          <w:lang w:val="en-US" w:eastAsia="en-GB"/>
+          <w14:ligatures w14:val="none"/>
+        </w:rPr>
+        <w:t xml:space="preserve"> - 1</w:t>
+      </w:r>
+    </w:p>
+    <w:p>
+      <w:pPr>
+        <w:spacing w:line="480" w:lineRule="auto"/>
+        <w:rPr>
+          <w:szCs w:val="28"/>
+          <w:lang w:val="en-US"/>
+        </w:rPr>
+      </w:pPr>
+      <w:r>
+        <w:rPr>
+          <w:noProof/>
+          <w:szCs w:val="28"/>
+        </w:rPr>
+        <mc:AlternateContent>
+          <mc:Choice Requires="wps">
+            <w:drawing>
+              <wp:anchor distT="0" distB="0" distL="114300" distR="114300" simplePos="0" relativeHeight="251663360" behindDoc="0" locked="0" layoutInCell="1" allowOverlap="1" wp14:anchorId="6CB73185" wp14:editId="067DA6F5">
+                <wp:simplePos x="0" y="0"/>
+                <wp:positionH relativeFrom="column">
+                  <wp:posOffset>-264246</wp:posOffset>
+                </wp:positionH>
+                <wp:positionV relativeFrom="paragraph">
+                  <wp:posOffset>1566940</wp:posOffset>
+                </wp:positionV>
+                <wp:extent cx="170121" cy="2267121"/>
+                <wp:effectExtent l="12700" t="12700" r="0" b="19050"/>
+                <wp:wrapNone/>
+                <wp:docPr id="2094581118" name="Left Brace 4"/>
+                <wp:cNvGraphicFramePr/>
+                <a:graphic xmlns:a="http://schemas.openxmlformats.org/drawingml/2006/main">
+                  <a:graphicData uri="http://schemas.microsoft.com/office/word/2010/wordprocessingShape">
+                    <wps:wsp>
+                      <wps:cNvSpPr/>
+                      <wps:spPr>
+                        <a:xfrm>
+                          <a:off x="0" y="0"/>
+                          <a:ext cx="170121" cy="2267121"/>
+                        </a:xfrm>
+                        <a:prstGeom prst="leftBrace">
+                          <a:avLst/>
+                        </a:prstGeom>
+                        <a:ln w="19050">
+                          <a:solidFill>
+                            <a:schemeClr val="tx1"/>
+                          </a:solidFill>
+                        </a:ln>
+                      </wps:spPr>
+                      <wps:style>
+                        <a:lnRef idx="1">
+                          <a:schemeClr val="dk1"/>
+                        </a:lnRef>
+                        <a:fillRef idx="0">
+                          <a:schemeClr val="dk1"/>
+                        </a:fillRef>
+                        <a:effectRef idx="0">
+                          <a:schemeClr val="dk1"/>
+                        </a:effectRef>
+                        <a:fontRef idx="minor">
+                          <a:schemeClr val="tx1"/>
+                        </a:fontRef>
+                      </wps:style>
+                      <wps:bodyPr rot="0" spcFirstLastPara="0" vertOverflow="overflow" horzOverflow="overflow" vert="horz" wrap="square" lIns="91440" tIns="45720" rIns="91440" bIns="45720" numCol="1" spcCol="0" rtlCol="0" fromWordArt="0" anchor="ctr" anchorCtr="0" forceAA="0" compatLnSpc="1">
+                        <a:prstTxWarp prst="textNoShape">
+                          <a:avLst/>
+                        </a:prstTxWarp>
+                        <a:noAutofit/>
+                      </wps:bodyPr>
+                    </wps:wsp>
+                  </a:graphicData>
+                </a:graphic>
+                <wp14:sizeRelV relativeFrom="margin">
+                  <wp14:pctHeight>0</wp14:pctHeight>
+                </wp14:sizeRelV>
+              </wp:anchor>
+            </w:drawing>
+          </mc:Choice>
+          <mc:Fallback>
+            <w:pict>
+              <v:shape w14:anchorId="55D104AB" id="Left Brace 4" o:spid="_x0000_s1026" type="#_x0000_t87" style="position:absolute;margin-left:-20.8pt;margin-top:123.4pt;width:13.4pt;height:178.5pt;z-index:251663360;visibility:visible;mso-wrap-style:square;mso-height-percent:0;mso-wrap-distance-left:9pt;mso-wrap-distance-top:0;mso-wrap-distance-right:9pt;mso-wrap-distance-bottom:0;mso-position-horizontal:absolute;mso-position-horizontal-relative:text;mso-position-vertical:absolute;mso-position-vertical-relative:text;mso-height-percent:0;mso-height-relative:margin;v-text-anchor:middle" o:gfxdata="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" adj="135" strokecolor="black [3213]" strokeweight="1.5pt">
+                <v:stroke joinstyle="miter"/>
+              </v:shape>
+            </w:pict>
+          </mc:Fallback>
+        </mc:AlternateContent>
+      </w:r>
+      <w:r>
+        <w:rPr>
+          <w:noProof/>
+          <w:szCs w:val="28"/>
+        </w:rPr>
+        <w:drawing>
+          <wp:inline distT="0" distB="0" distL="0" distR="0" wp14:anchorId="32C08361" wp14:editId="53C6F1DA">
+            <wp:extent cx="5939790" cy="1241425"/>
+            <wp:effectExtent l="0" t="0" r="3810" b="3175"/>
+            <wp:docPr id="2018481804" name="Picture 8" descr="A diagram of a line with a dotted line&#10;&#10;AI-generated content may be incorrect."/>
+            <wp:cNvGraphicFramePr>
+              <a:graphicFrameLocks xmlns:a="http://schemas.openxmlformats.org/drawingml/2006/main" noChangeAspect="1"/>
+            </wp:cNvGraphicFramePr>
+            <a:graphic xmlns:a="http://schemas.openxmlformats.org/drawingml/2006/main">
+              <a:graphicData uri="http://schemas.openxmlformats.org/drawingml/2006/picture">
+                <pic:pic xmlns:pic="http://schemas.openxmlformats.org/drawingml/2006/picture">
+                  <pic:nvPicPr>
+                    <pic:cNvPr id="2018481804" name="Picture 8" descr="A diagram of a line with a dotted line&#10;&#10;AI-generated content may be incorrect."/>
+                    <pic:cNvPicPr/>
+                  </pic:nvPicPr>
+                  <pic:blipFill>
+                    <a:blip r:embed="rId11">
+                      <a:extLst>
+                        <a:ext uri="{28A0092B-C50C-407E-A947-70E740481C1C}">
+                          <a14:useLocalDpi xmlns:a14="http://schemas.microsoft.com/office/drawing/2010/main" val="0"/>
+                        </a:ext>
+                      </a:extLst>
+                    </a:blip>
+                    <a:stretch>
+                      <a:fillRect/>
+                    </a:stretch>
+                  </pic:blipFill>
+                  <pic:spPr>
+                    <a:xfrm>
+                      <a:off x="0" y="0"/>
+                      <a:ext cx="5939790" cy="1241425"/>
+                    </a:xfrm>
+                    <a:prstGeom prst="rect">
+                      <a:avLst/>
+                    </a:prstGeom>
+                  </pic:spPr>
+                </pic:pic>
+              </a:graphicData>
+            </a:graphic>
+          </wp:inline>
+        </w:drawing>
+      </w:r>
+    </w:p>
+    <w:p>
+      <w:pPr>
+        <w:spacing w:line="480" w:lineRule="auto"/>
+        <w:rPr>
+          <w:szCs w:val="28"/>
+          <w:lang w:val="en-US"/>
+        </w:rPr>
+      </w:pPr>
+      <w:r>
+        <w:rPr>
+          <w:noProof/>
+          <w:szCs w:val="28"/>
+          <w:lang w:val="en-US"/>
+        </w:rPr>
+        <mc:AlternateContent>
+          <mc:Choice Requires="wps">
+            <w:drawing>
+              <wp:anchor distT="0" distB="0" distL="114300" distR="114300" simplePos="0" relativeHeight="251664384" behindDoc="0" locked="0" layoutInCell="1" allowOverlap="1" wp14:anchorId="43C435E5" wp14:editId="54AE721E">
+                <wp:simplePos x="0" y="0"/>
+                <wp:positionH relativeFrom="column">
+                  <wp:posOffset>-94701</wp:posOffset>
+                </wp:positionH>
+                <wp:positionV relativeFrom="paragraph">
+                  <wp:posOffset>528732</wp:posOffset>
+                </wp:positionV>
+                <wp:extent cx="95782" cy="1266567"/>
+                <wp:effectExtent l="12700" t="12700" r="6350" b="16510"/>
+                <wp:wrapNone/>
+                <wp:docPr id="310859711" name="Left Bracket 9"/>
+                <wp:cNvGraphicFramePr/>
+                <a:graphic xmlns:a="http://schemas.openxmlformats.org/drawingml/2006/main">
+                  <a:graphicData uri="http://schemas.microsoft.com/office/word/2010/wordprocessingShape">
+                    <wps:wsp>
+                      <wps:cNvSpPr/>
+                      <wps:spPr>
+                        <a:xfrm>
+                          <a:off x="0" y="0"/>
+                          <a:ext cx="95782" cy="1266567"/>
+                        </a:xfrm>
+                        <a:prstGeom prst="leftBracket">
+                          <a:avLst/>
+                        </a:prstGeom>
+                        <a:ln w="19050">
+                          <a:solidFill>
+                            <a:schemeClr val="tx1"/>
+                          </a:solidFill>
+                        </a:ln>
+                      </wps:spPr>
+                      <wps:style>
+                        <a:lnRef idx="1">
+                          <a:schemeClr val="accent1"/>
+                        </a:lnRef>
+                        <a:fillRef idx="0">
+                          <a:schemeClr val="accent1"/>
+                        </a:fillRef>
+                        <a:effectRef idx="0">
+                          <a:schemeClr val="accent1"/>
+                        </a:effectRef>
+                        <a:fontRef idx="minor">
+                          <a:schemeClr val="tx1"/>
+                        </a:fontRef>
+                      </wps:style>
+                      <wps:bodyPr rot="0" spcFirstLastPara="0" vertOverflow="overflow" horzOverflow="overflow" vert="horz" wrap="square" lIns="91440" tIns="45720" rIns="91440" bIns="45720" numCol="1" spcCol="0" rtlCol="0" fromWordArt="0" anchor="ctr" anchorCtr="0" forceAA="0" compatLnSpc="1">
+                        <a:prstTxWarp prst="textNoShape">
+                          <a:avLst/>
+                        </a:prstTxWarp>
+                        <a:noAutofit/>
+                      </wps:bodyPr>
+                    </wps:wsp>
+                  </a:graphicData>
+                </a:graphic>
+              </wp:anchor>
+            </w:drawing>
+          </mc:Choice>
+          <mc:Fallback>
+            <w:pict>
+              <v:shapetype w14:anchorId="5281A06A" id="_x0000_t85" coordsize="21600,21600" o:spt="85" adj="1800" path="m21600,qx0@0l0@1qy21600,21600e" filled="f">
+                <v:formulas>
+                  <v:f eqn="val #0"/>
+                  <v:f eqn="sum 21600 0 #0"/>
+                  <v:f eqn="prod #0 9598 32768"/>
+                  <v:f eqn="sum 21600 0 @2"/>
+                </v:formulas>
+                <v:path arrowok="t" gradientshapeok="t" o:connecttype="custom" o:connectlocs="21600,0;0,10800;21600,21600" textboxrect="6326,@2,21600,@3"/>
+                <v:handles>
+                  <v:h position="topLeft,#0" yrange="0,10800"/>
+                </v:handles>
+              </v:shapetype>
+              <v:shape id="Left Bracket 9" o:spid="_x0000_s1026" type="#_x0000_t85" style="position:absolute;margin-left:-7.45pt;margin-top:41.65pt;width:7.55pt;height:99.75pt;z-index:251664384;visibility:visible;mso-wrap-style:square;mso-wrap-distance-left:9pt;mso-wrap-distance-top:0;mso-wrap-distance-right:9pt;mso-wrap-distance-bottom:0;mso-position-horizontal:absolute;mso-position-horizontal-relative:text;mso-position-vertical:absolute;mso-position-vertical-relative:text;v-text-anchor:middle" o:gfxdata="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" adj="136" strokecolor="black [3213]" strokeweight="1.5pt">
+                <v:stroke joinstyle="miter"/>
+              </v:shape>
+            </w:pict>
+          </mc:Fallback>
+        </mc:AlternateContent>
+      </w:r>
+      <w:r>
+        <w:rPr>
+          <w:szCs w:val="28"/>
+          <w:lang w:val="en-US"/>
+        </w:rPr>
+        <w:t>-</w:t>
+      </w:r>
+      <w:r>
+        <w:rPr>
+          <w:szCs w:val="28"/>
+          <w:lang w:val="en-US"/>
+        </w:rPr>
+        <w:t>2</w:t>
+      </w:r>
+      <w:r>
+        <w:rPr>
+          <w:szCs w:val="28"/>
+          <w:vertAlign w:val="superscript"/>
+          <w:lang w:val="en-US"/>
+        </w:rPr>
+        <w:t>1</w:t>
+      </w:r>
+      <w:r>
+        <w:rPr>
+          <w:szCs w:val="28"/>
+          <w:vertAlign w:val="superscript"/>
+          <w:lang w:val="en-US"/>
+        </w:rPr>
+        <w:t>5</w:t>
+      </w:r>
+      <w:r>
+        <w:rPr>
+          <w:szCs w:val="28"/>
+          <w:lang w:val="en-US"/>
+        </w:rPr>
+        <w:t xml:space="preserve"> ≤ D ≤ </w:t>
+      </w:r>
+      <w:r>
+        <w:rPr>
+          <w:szCs w:val="28"/>
+          <w:lang w:val="en-US"/>
+        </w:rPr>
+        <w:t>-</w:t>
+      </w:r>
+      <w:r>
+        <w:rPr>
+          <w:szCs w:val="28"/>
+          <w:lang w:val="en-US"/>
+        </w:rPr>
+        <w:t>2</w:t>
+      </w:r>
+      <w:r>
+        <w:rPr>
+          <w:szCs w:val="28"/>
+          <w:vertAlign w:val="superscript"/>
+          <w:lang w:val="en-US"/>
+        </w:rPr>
+        <w:t>1</w:t>
+      </w:r>
+      <w:r>
+        <w:rPr>
+          <w:szCs w:val="28"/>
+          <w:vertAlign w:val="superscript"/>
+          <w:lang w:val="en-US"/>
+        </w:rPr>
+        <w:t>4</w:t>
+      </w:r>
+      <w:r>
+        <w:rPr>
+          <w:szCs w:val="28"/>
+          <w:lang w:val="en-US"/>
+        </w:rPr>
+        <w:t xml:space="preserve"> – 1</w:t>
+      </w:r>
+    </w:p>
+    <w:p>
+      <w:pPr>
+        <w:spacing w:line="480" w:lineRule="auto"/>
+        <w:rPr>
+          <w:szCs w:val="28"/>
+          <w:lang w:val="en-US"/>
+        </w:rPr>
+      </w:pPr>
+      <w:r>
+        <w:rPr>
+          <w:szCs w:val="28"/>
+          <w:lang w:val="en-US"/>
+        </w:rPr>
+        <w:t>A</w:t>
+      </w:r>
+      <w:r>
+        <w:rPr>
+          <w:szCs w:val="28"/>
+          <w:vertAlign w:val="subscript"/>
+          <w:lang w:val="en-US"/>
+        </w:rPr>
+        <w:t>15</w:t>
+      </w:r>
+      <w:r>
+        <w:rPr>
+          <w:szCs w:val="28"/>
+          <w:lang w:val="en-US"/>
+        </w:rPr>
+        <w:t xml:space="preserve"> = </w:t>
+      </w:r>
+      <w:r>
+        <w:rPr>
+          <w:szCs w:val="28"/>
+          <w:lang w:val="en-US"/>
+        </w:rPr>
+        <w:t>0</w:t>
+      </w:r>
+      <w:r>
+        <w:rPr>
+          <w:szCs w:val="28"/>
+          <w:lang w:val="en-US"/>
+        </w:rPr>
+        <w:t>, B</w:t>
+      </w:r>
+      <w:r>
+        <w:rPr>
+          <w:szCs w:val="28"/>
+          <w:vertAlign w:val="subscript"/>
+          <w:lang w:val="en-US"/>
+        </w:rPr>
+        <w:t>15</w:t>
+      </w:r>
+      <w:r>
+        <w:rPr>
+          <w:szCs w:val="28"/>
+          <w:lang w:val="en-US"/>
+        </w:rPr>
+        <w:t xml:space="preserve"> = 1</w:t>
+      </w:r>
+    </w:p>
+    <w:p>
+      <w:pPr>
+        <w:spacing w:line="480" w:lineRule="auto"/>
+        <w:rPr>
+          <w:szCs w:val="28"/>
+          <w:lang w:val="en-US"/>
+        </w:rPr>
+      </w:pPr>
+      <w:r>
+        <w:rPr>
+          <w:szCs w:val="28"/>
+          <w:lang w:val="en-US"/>
+        </w:rPr>
+        <w:t>A</w:t>
+      </w:r>
+      <w:r>
+        <w:rPr>
+          <w:szCs w:val="28"/>
+          <w:vertAlign w:val="subscript"/>
+          <w:lang w:val="en-US"/>
+        </w:rPr>
+        <w:t>15</w:t>
+      </w:r>
+      <w:r>
+        <w:rPr>
+          <w:szCs w:val="28"/>
+          <w:lang w:val="en-US"/>
+        </w:rPr>
+        <w:t xml:space="preserve"> = 1, B</w:t>
+      </w:r>
+      <w:r>
+        <w:rPr>
+          <w:szCs w:val="28"/>
+          <w:vertAlign w:val="subscript"/>
+          <w:lang w:val="en-US"/>
+        </w:rPr>
+        <w:t>15</w:t>
+      </w:r>
+      <w:r>
+        <w:rPr>
+          <w:szCs w:val="28"/>
+          <w:lang w:val="en-US"/>
+        </w:rPr>
+        <w:t xml:space="preserve"> = </w:t>
+      </w:r>
+      <w:r>
+        <w:rPr>
+          <w:szCs w:val="28"/>
+          <w:lang w:val="en-US"/>
+        </w:rPr>
+        <w:t>0</w:t>
+      </w:r>
+    </w:p>
+    <w:p>
+      <w:pPr>
+        <w:spacing w:line="480" w:lineRule="auto"/>
+        <w:rPr>
+          <w:szCs w:val="28"/>
+          <w:lang w:val="en-US"/>
+        </w:rPr>
+      </w:pPr>
+      <w:r>
+        <w:rPr>
+          <w:szCs w:val="28"/>
+          <w:lang w:val="en-US"/>
+        </w:rPr>
+        <w:t>A</w:t>
+      </w:r>
+      <w:r>
+        <w:rPr>
+          <w:szCs w:val="28"/>
+          <w:vertAlign w:val="subscript"/>
+          <w:lang w:val="en-US"/>
+        </w:rPr>
+        <w:t>15</w:t>
+      </w:r>
+      <w:r>
+        <w:rPr>
+          <w:szCs w:val="28"/>
+          <w:lang w:val="en-US"/>
+        </w:rPr>
+        <w:t xml:space="preserve"> = </w:t>
+      </w:r>
+      <w:r>
+        <w:rPr>
+          <w:szCs w:val="28"/>
+          <w:lang w:val="en-US"/>
+        </w:rPr>
+        <w:t>0</w:t>
+      </w:r>
+      <w:r>
+        <w:rPr>
+          <w:szCs w:val="28"/>
+          <w:lang w:val="en-US"/>
+        </w:rPr>
+        <w:t>, B</w:t>
+      </w:r>
+      <w:r>
+        <w:rPr>
+          <w:szCs w:val="28"/>
+          <w:vertAlign w:val="subscript"/>
+          <w:lang w:val="en-US"/>
+        </w:rPr>
+        <w:t>15</w:t>
+      </w:r>
+      <w:r>
+        <w:rPr>
+          <w:szCs w:val="28"/>
+          <w:lang w:val="en-US"/>
+        </w:rPr>
+        <w:t xml:space="preserve"> = </w:t>
+      </w:r>
+      <w:r>
+        <w:rPr>
+          <w:szCs w:val="28"/>
+          <w:lang w:val="en-US"/>
+        </w:rPr>
+        <w:t>0</w:t>
+      </w:r>
+    </w:p>
+    <w:p>
+      <w:pPr>
+        <w:rPr>
+          <w:rFonts w:eastAsia="Times New Roman"/>
+          <w:kern w:val="0"/>
+          <w:lang w:val="en-RU" w:eastAsia="en-GB"/>
+          <w14:ligatures w14:val="none"/>
+        </w:rPr>
+      </w:pPr>
+      <w:r>
+        <w:rPr>
+          <w:rFonts w:eastAsia="Times New Roman"/>
+          <w:kern w:val="0"/>
+          <w:lang w:val="en-RU" w:eastAsia="en-GB"/>
+          <w14:ligatures w14:val="none"/>
+        </w:rPr>
+        <w:t>A</w:t>
+      </w:r>
+      <w:r>
+        <w:rPr>
+          <w:rFonts w:eastAsia="Times New Roman"/>
+          <w:kern w:val="0"/>
+          <w:vertAlign w:val="subscript"/>
+          <w:lang w:val="en-RU" w:eastAsia="en-GB"/>
+          <w14:ligatures w14:val="none"/>
+        </w:rPr>
+        <w:t>i</w:t>
+      </w:r>
+      <w:r>
+        <w:rPr>
+          <w:rFonts w:eastAsia="Times New Roman"/>
+          <w:kern w:val="0"/>
+          <w:lang w:val="en-RU" w:eastAsia="en-GB"/>
+          <w14:ligatures w14:val="none"/>
+        </w:rPr>
+        <w:t xml:space="preserve">, </w:t>
+      </w:r>
+      <w:r>
+        <w:rPr>
+          <w:rFonts w:eastAsia="Times New Roman"/>
+          <w:kern w:val="0"/>
+          <w:lang w:val="en-RU" w:eastAsia="en-GB"/>
+          <w14:ligatures w14:val="none"/>
+        </w:rPr>
+        <w:t>B</w:t>
+      </w:r>
+      <w:r>
+        <w:rPr>
+          <w:rFonts w:eastAsia="Times New Roman"/>
+          <w:kern w:val="0"/>
+          <w:vertAlign w:val="subscript"/>
+          <w:lang w:val="en-RU" w:eastAsia="en-GB"/>
+          <w14:ligatures w14:val="none"/>
+        </w:rPr>
+        <w:t>i</w:t>
+      </w:r>
+      <w:r>
+        <w:rPr>
+          <w:rFonts w:eastAsia="Times New Roman"/>
+          <w:kern w:val="0"/>
+          <w:lang w:val="en-RU" w:eastAsia="en-GB"/>
+          <w14:ligatures w14:val="none"/>
+        </w:rPr>
+        <w:t xml:space="preserve"> in {0,1}, 0 ≤ i ≤ 1</w:t>
+      </w:r>
+      <w:r>
+        <w:rPr>
+          <w:rFonts w:eastAsia="Times New Roman"/>
+          <w:kern w:val="0"/>
+          <w:lang w:val="en-RU" w:eastAsia="en-GB"/>
+          <w14:ligatures w14:val="none"/>
+        </w:rPr>
+        <w:t>4</w:t>
+      </w:r>
+    </w:p>
+    <w:p>
+      <w:pPr>
+        <w:spacing w:line="480" w:lineRule="auto"/>
+        <w:rPr>
+          <w:szCs w:val="28"/>
+          <w:lang w:val="en-RU"/>
+        </w:rPr>
+      </w:pPr>
+    </w:p>
+    <w:p>
+      <w:pPr>
+        <w:spacing w:line="480" w:lineRule="auto"/>
+        <w:rPr>
+          <w:szCs w:val="28"/>
+          <w:lang w:val="en-RU"/>
+        </w:rPr>
+      </w:pPr>
     </w:p>
     <w:p>
       <w:pPr>
@@ -2452,6 +3936,7 @@
         </w:rPr>
       </w:pPr>
       <w:r>
+        <w:lastRenderedPageBreak/>
         <w:t>Расположение в памяти БЭВМ</w:t>
       </w:r>
     </w:p>
@@ -2477,19 +3962,7 @@
         <w:rPr>
           <w:lang w:val="en-US"/>
         </w:rPr>
-        <w:t xml:space="preserve">142, 144-145 </w:t>
-      </w:r>
-      <w:r>
-        <w:rPr>
-          <w:lang w:val="en-US"/>
-        </w:rPr>
-        <w:t>–</w:t>
-      </w:r>
-      <w:r>
-        <w:rPr>
-          <w:lang w:val="en-US"/>
-        </w:rPr>
-        <w:t xml:space="preserve"> </w:t>
+        <w:t xml:space="preserve">142, 144-145 – </w:t>
       </w:r>
       <w:r>
         <w:t>исходные данные</w:t>
@@ -2520,19 +3993,7 @@
         <w:rPr>
           <w:lang w:val="en-US"/>
         </w:rPr>
-        <w:t xml:space="preserve">13A-141 </w:t>
-      </w:r>
-      <w:r>
-        <w:rPr>
-          <w:lang w:val="en-US"/>
-        </w:rPr>
-        <w:t>–</w:t>
-      </w:r>
-      <w:r>
-        <w:rPr>
-          <w:lang w:val="en-US"/>
-        </w:rPr>
-        <w:t xml:space="preserve"> </w:t>
+        <w:t xml:space="preserve">13A-141 – </w:t>
       </w:r>
       <w:r>
         <w:t>и</w:t>
@@ -2892,7 +4353,6 @@
               </w:rPr>
             </w:pPr>
             <w:r>
-              <w:lastRenderedPageBreak/>
               <w:t>13</w:t>
             </w:r>
             <w:r>
@@ -2994,13 +4454,7 @@
               <w:rPr>
                 <w:lang w:val="en-US"/>
               </w:rPr>
-              <w:t>13</w:t>
-            </w:r>
-            <w:r>
-              <w:rPr>
-                <w:lang w:val="en-US"/>
-              </w:rPr>
-              <w:t>C</w:t>
+              <w:t>13C</w:t>
             </w:r>
           </w:p>
         </w:tc>
@@ -3086,13 +4540,7 @@
               <w:rPr>
                 <w:lang w:val="en-US"/>
               </w:rPr>
-              <w:t>1</w:t>
-            </w:r>
-            <w:r>
-              <w:rPr>
-                <w:lang w:val="en-US"/>
-              </w:rPr>
-              <w:t>3D</w:t>
+              <w:t>13D</w:t>
             </w:r>
           </w:p>
         </w:tc>
@@ -3194,13 +4642,7 @@
               <w:rPr>
                 <w:lang w:val="en-US"/>
               </w:rPr>
-              <w:t>1</w:t>
-            </w:r>
-            <w:r>
-              <w:rPr>
-                <w:lang w:val="en-US"/>
-              </w:rPr>
-              <w:t>3E</w:t>
+              <w:t>13E</w:t>
             </w:r>
           </w:p>
         </w:tc>
@@ -3763,7 +5205,15 @@
                 <w:sz w:val="22"/>
                 <w:szCs w:val="22"/>
               </w:rPr>
-              <w:t>Ячейка, содержимое которой изменилось после новой выполнения команды</w:t>
+              <w:t xml:space="preserve">Ячейка, содержимое которой изменилось </w:t>
+            </w:r>
+            <w:r>
+              <w:rPr>
+                <w:sz w:val="22"/>
+                <w:szCs w:val="22"/>
+              </w:rPr>
+              <w:lastRenderedPageBreak/>
+              <w:t>после новой выполнения команды</w:t>
             </w:r>
           </w:p>
         </w:tc>
@@ -3786,6 +5236,7 @@
                 <w:sz w:val="22"/>
                 <w:szCs w:val="22"/>
               </w:rPr>
+              <w:lastRenderedPageBreak/>
               <w:t>Адрес</w:t>
             </w:r>
           </w:p>
@@ -6355,12 +7806,19 @@
       <w:r>
         <w:t xml:space="preserve">. – 2-е изд. – СПб.: Питер, 2011. – 688 с.: ил. – Режим доступа: </w:t>
       </w:r>
-      <w:hyperlink r:id="rId8" w:tgtFrame="_new" w:history="1">
+      <w:hyperlink r:id="rId12" w:tgtFrame="_new" w:history="1">
         <w:r>
           <w:rPr>
             <w:rStyle w:val="Hyperlink"/>
           </w:rPr>
-          <w:t>http://www.nicevt.ru/wp-content/uploads/2019/10/2.-%D0%A6%D0%B8%D0%BB%D1%8C%D0%BA%D0%B5%D1%80-%D0%91.%D0%AF.-%D0%9E%D1%80%D0%BB%D0%BE%D0%B2-%D0%A1.%D0%90.-%D0%9E%D1%80%D0%B3%D0%B0%D0%BD%D0%B8%D0%B7%D0%B0%D1%86%D0%B8%D1%8F-%D0%AD%D0%92%D0%9C-%D0%B8-%D1%81%D0%B8%D1%81%D1%82%D0%B5%D0%BC-%D0%A1%D0%9F%D0%91-%D0%9F%D0%B8%D1%82%D0%B5%D1%80-2011.pdf</w:t>
+          <w:t>http://www.nicevt.ru/wp-content/uploads/2019/10/2.-%D0%A6%D0%B8%D0%BB%D1%8C%D0%BA%D0%B5%D1%80-</w:t>
+        </w:r>
+        <w:r>
+          <w:rPr>
+            <w:rStyle w:val="Hyperlink"/>
+          </w:rPr>
+          <w:lastRenderedPageBreak/>
+          <w:t>%D0%91.%D0%AF.-%D0%9E%D1%80%D0%BB%D0%BE%D0%B2-%D0%A1.%D0%90.-%D0%9E%D1%80%D0%B3%D0%B0%D0%BD%D0%B8%D0%B7%D0%B0%D1%86%D0%B8%D1%8F-%D0%AD%D0%92%D0%9C-%D0%B8-%D1%81%D0%B8%D1%81%D1%82%D0%B5%D0%BC-%D0%A1%D0%9F%D0%91-%D0%9F%D0%B8%D1%82%D0%B5%D1%80-2011.pdf</w:t>
         </w:r>
       </w:hyperlink>
       <w:r>
@@ -6387,7 +7845,7 @@
       <w:r>
         <w:t xml:space="preserve"> [Электронный ресурс]. – Режим доступа: </w:t>
       </w:r>
-      <w:hyperlink r:id="rId9" w:tgtFrame="_new" w:history="1">
+      <w:hyperlink r:id="rId13" w:tgtFrame="_new" w:history="1">
         <w:r>
           <w:rPr>
             <w:rStyle w:val="Hyperlink"/>
@@ -6401,7 +7859,7 @@
     </w:p>
     <w:p/>
     <w:sectPr>
-      <w:footerReference w:type="default" r:id="rId10"/>
+      <w:footerReference w:type="default" r:id="rId14"/>
       <w:pgSz w:w="11906" w:h="16838" w:code="9"/>
       <w:pgMar w:top="1134" w:right="851" w:bottom="1134" w:left="1701" w:header="709" w:footer="709" w:gutter="0"/>
       <w:cols w:space="708"/>

</xml_diff>

<commit_message>
FOPA lab2: report fix
</commit_message>
<xml_diff>
--- a/fopa/lab2/report.docx
+++ b/fopa/lab2/report.docx
@@ -185,39 +185,24 @@
     <w:p>
       <w:pPr>
         <w:jc w:val="right"/>
-        <w:rPr>
-          <w:highlight w:val="yellow"/>
-        </w:rPr>
-      </w:pPr>
-      <w:r>
-        <w:rPr>
-          <w:highlight w:val="yellow"/>
-        </w:rPr>
-        <w:t>Доцент факультета ПИиКТ,</w:t>
-      </w:r>
-      <w:r>
-        <w:rPr>
-          <w:highlight w:val="yellow"/>
-        </w:rPr>
-        <w:t xml:space="preserve"> </w:t>
-      </w:r>
-      <w:r>
-        <w:rPr>
-          <w:highlight w:val="yellow"/>
-        </w:rPr>
-        <w:t>кандидат технических наук,</w:t>
-      </w:r>
-    </w:p>
-    <w:p>
-      <w:pPr>
-        <w:jc w:val="right"/>
-      </w:pPr>
-      <w:r>
-        <w:rPr>
-          <w:highlight w:val="yellow"/>
-        </w:rPr>
-        <w:t>Балакшин Павел Валерьевич</w:t>
-      </w:r>
+      </w:pPr>
+      <w:r>
+        <w:t>Препод</w:t>
+      </w:r>
+      <w:r>
+        <w:t>а</w:t>
+      </w:r>
+      <w:r>
+        <w:t>ватель</w:t>
+      </w:r>
+      <w:r>
+        <w:t xml:space="preserve"> Ермаков Михаил Константинович</w:t>
+      </w:r>
+    </w:p>
+    <w:p>
+      <w:pPr>
+        <w:jc w:val="center"/>
+      </w:pPr>
     </w:p>
     <w:p>
       <w:pPr>
@@ -644,6 +629,7 @@
         <w:rPr>
           <w:b/>
           <w:bCs/>
+          <w:lang w:val="en-US"/>
         </w:rPr>
       </w:pPr>
       <w:bookmarkStart w:id="0" w:name="_Toc209088592"/>
@@ -661,6 +647,52 @@
       <w:pPr>
         <w:jc w:val="both"/>
       </w:pPr>
+      <w:r>
+        <w:rPr>
+          <w:noProof/>
+        </w:rPr>
+        <w:drawing>
+          <wp:inline distT="0" distB="0" distL="0" distR="0" wp14:anchorId="7F479935" wp14:editId="025A2148">
+            <wp:extent cx="5939790" cy="2951480"/>
+            <wp:effectExtent l="0" t="0" r="3810" b="0"/>
+            <wp:docPr id="423477109" name="Picture 5" descr="A screenshot of a computer&#10;&#10;AI-generated content may be incorrect."/>
+            <wp:cNvGraphicFramePr>
+              <a:graphicFrameLocks xmlns:a="http://schemas.openxmlformats.org/drawingml/2006/main" noChangeAspect="1"/>
+            </wp:cNvGraphicFramePr>
+            <a:graphic xmlns:a="http://schemas.openxmlformats.org/drawingml/2006/main">
+              <a:graphicData uri="http://schemas.openxmlformats.org/drawingml/2006/picture">
+                <pic:pic xmlns:pic="http://schemas.openxmlformats.org/drawingml/2006/picture">
+                  <pic:nvPicPr>
+                    <pic:cNvPr id="423477109" name="Picture 5" descr="A screenshot of a computer&#10;&#10;AI-generated content may be incorrect."/>
+                    <pic:cNvPicPr/>
+                  </pic:nvPicPr>
+                  <pic:blipFill>
+                    <a:blip r:embed="rId8" cstate="print">
+                      <a:extLst>
+                        <a:ext uri="{28A0092B-C50C-407E-A947-70E740481C1C}">
+                          <a14:useLocalDpi xmlns:a14="http://schemas.microsoft.com/office/drawing/2010/main" val="0"/>
+                        </a:ext>
+                      </a:extLst>
+                    </a:blip>
+                    <a:stretch>
+                      <a:fillRect/>
+                    </a:stretch>
+                  </pic:blipFill>
+                  <pic:spPr>
+                    <a:xfrm>
+                      <a:off x="0" y="0"/>
+                      <a:ext cx="5939790" cy="2951480"/>
+                    </a:xfrm>
+                    <a:prstGeom prst="rect">
+                      <a:avLst/>
+                    </a:prstGeom>
+                  </pic:spPr>
+                </pic:pic>
+              </a:graphicData>
+            </a:graphic>
+          </wp:inline>
+        </w:drawing>
+      </w:r>
     </w:p>
     <w:p>
       <w:pPr>
@@ -695,62 +727,29 @@
     <w:p>
       <w:pPr>
         <w:jc w:val="both"/>
+        <w:rPr>
+          <w:lang w:val="en-US"/>
+        </w:rPr>
       </w:pPr>
     </w:p>
     <w:p>
       <w:pPr>
         <w:jc w:val="both"/>
+        <w:rPr>
+          <w:lang w:val="en-US"/>
+        </w:rPr>
       </w:pPr>
     </w:p>
     <w:p>
       <w:pPr>
         <w:jc w:val="both"/>
-      </w:pPr>
-    </w:p>
-    <w:p>
-      <w:pPr>
-        <w:jc w:val="both"/>
-      </w:pPr>
-    </w:p>
-    <w:p>
-      <w:pPr>
-        <w:jc w:val="both"/>
-      </w:pPr>
-    </w:p>
-    <w:p>
-      <w:pPr>
-        <w:jc w:val="both"/>
-      </w:pPr>
-    </w:p>
-    <w:p>
-      <w:pPr>
-        <w:jc w:val="both"/>
-      </w:pPr>
-    </w:p>
-    <w:p>
-      <w:pPr>
-        <w:jc w:val="both"/>
-      </w:pPr>
-    </w:p>
-    <w:p>
-      <w:pPr>
-        <w:jc w:val="both"/>
-      </w:pPr>
-    </w:p>
-    <w:p>
-      <w:pPr>
-        <w:jc w:val="both"/>
-      </w:pPr>
-    </w:p>
-    <w:p>
-      <w:pPr>
-        <w:jc w:val="both"/>
-      </w:pPr>
-    </w:p>
-    <w:p>
-      <w:pPr>
-        <w:jc w:val="both"/>
-      </w:pPr>
+        <w:rPr>
+          <w:lang w:val="en-US"/>
+        </w:rPr>
+      </w:pPr>
+      <w:r>
+        <w:tab/>
+      </w:r>
     </w:p>
     <w:p>
       <w:pPr>
@@ -2484,7 +2483,7 @@
           <w:szCs w:val="28"/>
         </w:rPr>
         <w:drawing>
-          <wp:inline distT="0" distB="0" distL="0" distR="0" wp14:anchorId="51AFD355" wp14:editId="612FD1CF">
+          <wp:inline distT="0" distB="0" distL="0" distR="0" wp14:anchorId="51AFD355" wp14:editId="230C6753">
             <wp:extent cx="5939790" cy="1408430"/>
             <wp:effectExtent l="0" t="0" r="3810" b="1270"/>
             <wp:docPr id="1771665743" name="Picture 1" descr="A close-up of a gauge&#10;&#10;AI-generated content may be incorrect."/>
@@ -2499,7 +2498,7 @@
                     <pic:cNvPicPr/>
                   </pic:nvPicPr>
                   <pic:blipFill>
-                    <a:blip r:embed="rId8" cstate="print">
+                    <a:blip r:embed="rId9" cstate="print">
                       <a:extLst>
                         <a:ext uri="{28A0092B-C50C-407E-A947-70E740481C1C}">
                           <a14:useLocalDpi xmlns:a14="http://schemas.microsoft.com/office/drawing/2010/main" val="0"/>
@@ -2673,7 +2672,7 @@
                     </pic:cNvPicPr>
                   </pic:nvPicPr>
                   <pic:blipFill>
-                    <a:blip r:embed="rId9">
+                    <a:blip r:embed="rId10">
                       <a:extLst>
                         <a:ext uri="{28A0092B-C50C-407E-A947-70E740481C1C}">
                           <a14:useLocalDpi xmlns:a14="http://schemas.microsoft.com/office/drawing/2010/main" val="0"/>
@@ -2988,13 +2987,13 @@
         <mc:AlternateContent>
           <mc:Choice Requires="wps">
             <w:drawing>
-              <wp:anchor distT="0" distB="0" distL="114300" distR="114300" simplePos="0" relativeHeight="251659264" behindDoc="0" locked="0" layoutInCell="1" allowOverlap="1" wp14:anchorId="4A0909C9" wp14:editId="35CE7468">
+              <wp:anchor distT="0" distB="0" distL="114300" distR="114300" simplePos="0" relativeHeight="251659264" behindDoc="0" locked="0" layoutInCell="1" allowOverlap="1" wp14:anchorId="4A0909C9" wp14:editId="0F4465D6">
                 <wp:simplePos x="0" y="0"/>
                 <wp:positionH relativeFrom="column">
-                  <wp:posOffset>-165392</wp:posOffset>
+                  <wp:posOffset>-174328</wp:posOffset>
                 </wp:positionH>
                 <wp:positionV relativeFrom="paragraph">
-                  <wp:posOffset>1871259</wp:posOffset>
+                  <wp:posOffset>1455074</wp:posOffset>
                 </wp:positionV>
                 <wp:extent cx="170121" cy="1395970"/>
                 <wp:effectExtent l="12700" t="12700" r="0" b="13970"/>
@@ -3050,7 +3049,28 @@
           </mc:Choice>
           <mc:Fallback>
             <w:pict>
-              <v:shape w14:anchorId="6AE223CD" id="Left Brace 4" o:spid="_x0000_s1026" type="#_x0000_t87" style="position:absolute;margin-left:-13pt;margin-top:147.35pt;width:13.4pt;height:109.9pt;z-index:251659264;visibility:visible;mso-wrap-style:square;mso-height-percent:0;mso-wrap-distance-left:9pt;mso-wrap-distance-top:0;mso-wrap-distance-right:9pt;mso-wrap-distance-bottom:0;mso-position-horizontal:absolute;mso-position-horizontal-relative:text;mso-position-vertical:absolute;mso-position-vertical-relative:text;mso-height-percent:0;mso-height-relative:margin;v-text-anchor:middle" o:gfxdata="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" adj="219" strokecolor="black [3213]" strokeweight="1.5pt">
+              <v:shapetype w14:anchorId="1C80D16C" id="_x0000_t87" coordsize="21600,21600" o:spt="87" adj="1800,10800" path="m21600,qx10800@0l10800@2qy0@11,10800@3l10800@1qy21600,21600e" filled="f">
+                <v:formulas>
+                  <v:f eqn="val #0"/>
+                  <v:f eqn="sum 21600 0 #0"/>
+                  <v:f eqn="sum #1 0 #0"/>
+                  <v:f eqn="sum #1 #0 0"/>
+                  <v:f eqn="prod #0 9598 32768"/>
+                  <v:f eqn="sum 21600 0 @4"/>
+                  <v:f eqn="sum 21600 0 #1"/>
+                  <v:f eqn="min #1 @6"/>
+                  <v:f eqn="prod @7 1 2"/>
+                  <v:f eqn="prod #0 2 1"/>
+                  <v:f eqn="sum 21600 0 @9"/>
+                  <v:f eqn="val #1"/>
+                </v:formulas>
+                <v:path arrowok="t" o:connecttype="custom" o:connectlocs="21600,0;0,10800;21600,21600" textboxrect="13963,@4,21600,@5"/>
+                <v:handles>
+                  <v:h position="center,#0" yrange="0,@8"/>
+                  <v:h position="topLeft,#1" yrange="@9,@10"/>
+                </v:handles>
+              </v:shapetype>
+              <v:shape id="Left Brace 4" o:spid="_x0000_s1026" type="#_x0000_t87" style="position:absolute;margin-left:-13.75pt;margin-top:114.55pt;width:13.4pt;height:109.9pt;z-index:251659264;visibility:visible;mso-wrap-style:square;mso-height-percent:0;mso-wrap-distance-left:9pt;mso-wrap-distance-top:0;mso-wrap-distance-right:9pt;mso-wrap-distance-bottom:0;mso-position-horizontal:absolute;mso-position-horizontal-relative:text;mso-position-vertical:absolute;mso-position-vertical-relative:text;mso-height-percent:0;mso-height-relative:margin;v-text-anchor:middle" o:gfxdata="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" adj="219" strokecolor="black [3213]" strokeweight="1.5pt">
                 <v:stroke joinstyle="miter"/>
               </v:shape>
             </w:pict>
@@ -3063,10 +3083,10 @@
           <w:szCs w:val="28"/>
         </w:rPr>
         <w:drawing>
-          <wp:inline distT="0" distB="0" distL="0" distR="0" wp14:anchorId="0D34CC53" wp14:editId="0CB2F72F">
-            <wp:extent cx="5939790" cy="1659890"/>
-            <wp:effectExtent l="0" t="0" r="3810" b="3810"/>
-            <wp:docPr id="806304535" name="Picture 7" descr="A diagram of a curve&#10;&#10;AI-generated content may be incorrect."/>
+          <wp:inline distT="0" distB="0" distL="0" distR="0" wp14:anchorId="59FE2008" wp14:editId="530591F0">
+            <wp:extent cx="5883910" cy="1226505"/>
+            <wp:effectExtent l="0" t="0" r="0" b="5715"/>
+            <wp:docPr id="687843015" name="Picture 5" descr="A diagram of a curve&#10;&#10;AI-generated content may be incorrect."/>
             <wp:cNvGraphicFramePr>
               <a:graphicFrameLocks xmlns:a="http://schemas.openxmlformats.org/drawingml/2006/main" noChangeAspect="1"/>
             </wp:cNvGraphicFramePr>
@@ -3074,11 +3094,11 @@
               <a:graphicData uri="http://schemas.openxmlformats.org/drawingml/2006/picture">
                 <pic:pic xmlns:pic="http://schemas.openxmlformats.org/drawingml/2006/picture">
                   <pic:nvPicPr>
-                    <pic:cNvPr id="806304535" name="Picture 7" descr="A diagram of a curve&#10;&#10;AI-generated content may be incorrect."/>
+                    <pic:cNvPr id="687843015" name="Picture 5" descr="A diagram of a curve&#10;&#10;AI-generated content may be incorrect."/>
                     <pic:cNvPicPr/>
                   </pic:nvPicPr>
                   <pic:blipFill>
-                    <a:blip r:embed="rId10">
+                    <a:blip r:embed="rId11">
                       <a:extLst>
                         <a:ext uri="{28A0092B-C50C-407E-A947-70E740481C1C}">
                           <a14:useLocalDpi xmlns:a14="http://schemas.microsoft.com/office/drawing/2010/main" val="0"/>
@@ -3092,7 +3112,7 @@
                   <pic:spPr>
                     <a:xfrm>
                       <a:off x="0" y="0"/>
-                      <a:ext cx="5939790" cy="1659890"/>
+                      <a:ext cx="6185048" cy="1289277"/>
                     </a:xfrm>
                     <a:prstGeom prst="rect">
                       <a:avLst/>
@@ -3202,7 +3222,7 @@
         <w:rPr>
           <w:rFonts w:eastAsia="Times New Roman"/>
           <w:kern w:val="0"/>
-          <w:lang w:val="en-RU" w:eastAsia="en-GB"/>
+          <w:lang w:eastAsia="en-GB"/>
           <w14:ligatures w14:val="none"/>
         </w:rPr>
       </w:pPr>
@@ -3271,6 +3291,16 @@
         </w:rPr>
         <w:t>4</w:t>
       </w:r>
+    </w:p>
+    <w:p>
+      <w:pPr>
+        <w:rPr>
+          <w:rFonts w:eastAsia="Times New Roman"/>
+          <w:kern w:val="0"/>
+          <w:lang w:eastAsia="en-GB"/>
+          <w14:ligatures w14:val="none"/>
+        </w:rPr>
+      </w:pPr>
     </w:p>
     <w:p>
       <w:pPr>
@@ -3436,12 +3466,13 @@
         <w:rPr>
           <w:noProof/>
           <w:szCs w:val="28"/>
+          <w:lang w:val="en-US"/>
         </w:rPr>
         <w:drawing>
-          <wp:inline distT="0" distB="0" distL="0" distR="0" wp14:anchorId="32C08361" wp14:editId="53C6F1DA">
-            <wp:extent cx="5939790" cy="1241425"/>
-            <wp:effectExtent l="0" t="0" r="3810" b="3175"/>
-            <wp:docPr id="2018481804" name="Picture 8" descr="A diagram of a line with a dotted line&#10;&#10;AI-generated content may be incorrect."/>
+          <wp:inline distT="0" distB="0" distL="0" distR="0" wp14:anchorId="09BC85DA" wp14:editId="2067C2DB">
+            <wp:extent cx="4521200" cy="1219200"/>
+            <wp:effectExtent l="0" t="0" r="0" b="0"/>
+            <wp:docPr id="1296082042" name="Picture 6" descr="A black and white diagram&#10;&#10;AI-generated content may be incorrect."/>
             <wp:cNvGraphicFramePr>
               <a:graphicFrameLocks xmlns:a="http://schemas.openxmlformats.org/drawingml/2006/main" noChangeAspect="1"/>
             </wp:cNvGraphicFramePr>
@@ -3449,11 +3480,11 @@
               <a:graphicData uri="http://schemas.openxmlformats.org/drawingml/2006/picture">
                 <pic:pic xmlns:pic="http://schemas.openxmlformats.org/drawingml/2006/picture">
                   <pic:nvPicPr>
-                    <pic:cNvPr id="2018481804" name="Picture 8" descr="A diagram of a line with a dotted line&#10;&#10;AI-generated content may be incorrect."/>
+                    <pic:cNvPr id="1296082042" name="Picture 6" descr="A black and white diagram&#10;&#10;AI-generated content may be incorrect."/>
                     <pic:cNvPicPr/>
                   </pic:nvPicPr>
                   <pic:blipFill>
-                    <a:blip r:embed="rId11">
+                    <a:blip r:embed="rId12">
                       <a:extLst>
                         <a:ext uri="{28A0092B-C50C-407E-A947-70E740481C1C}">
                           <a14:useLocalDpi xmlns:a14="http://schemas.microsoft.com/office/drawing/2010/main" val="0"/>
@@ -3467,7 +3498,7 @@
                   <pic:spPr>
                     <a:xfrm>
                       <a:off x="0" y="0"/>
-                      <a:ext cx="5939790" cy="1241425"/>
+                      <a:ext cx="4521200" cy="1219200"/>
                     </a:xfrm>
                     <a:prstGeom prst="rect">
                       <a:avLst/>
@@ -3595,7 +3626,14 @@
           <w:vertAlign w:val="superscript"/>
           <w:lang w:val="en-US"/>
         </w:rPr>
-        <w:t>1</w:t>
+        <w:t>15</w:t>
+      </w:r>
+      <w:r>
+        <w:rPr>
+          <w:szCs w:val="28"/>
+          <w:lang w:val="en-US"/>
+        </w:rPr>
+        <w:t xml:space="preserve"> ≤ D ≤ -2</w:t>
       </w:r>
       <w:r>
         <w:rPr>
@@ -3603,44 +3641,7 @@
           <w:vertAlign w:val="superscript"/>
           <w:lang w:val="en-US"/>
         </w:rPr>
-        <w:t>5</w:t>
-      </w:r>
-      <w:r>
-        <w:rPr>
-          <w:szCs w:val="28"/>
-          <w:lang w:val="en-US"/>
-        </w:rPr>
-        <w:t xml:space="preserve"> ≤ D ≤ </w:t>
-      </w:r>
-      <w:r>
-        <w:rPr>
-          <w:szCs w:val="28"/>
-          <w:lang w:val="en-US"/>
-        </w:rPr>
-        <w:t>-</w:t>
-      </w:r>
-      <w:r>
-        <w:rPr>
-          <w:szCs w:val="28"/>
-          <w:lang w:val="en-US"/>
-        </w:rPr>
-        <w:t>2</w:t>
-      </w:r>
-      <w:r>
-        <w:rPr>
-          <w:szCs w:val="28"/>
-          <w:vertAlign w:val="superscript"/>
-          <w:lang w:val="en-US"/>
-        </w:rPr>
-        <w:t>1</w:t>
-      </w:r>
-      <w:r>
-        <w:rPr>
-          <w:szCs w:val="28"/>
-          <w:vertAlign w:val="superscript"/>
-          <w:lang w:val="en-US"/>
-        </w:rPr>
-        <w:t>4</w:t>
+        <w:t>14</w:t>
       </w:r>
       <w:r>
         <w:rPr>
@@ -3678,21 +3679,7 @@
           <w:szCs w:val="28"/>
           <w:lang w:val="en-US"/>
         </w:rPr>
-        <w:t xml:space="preserve"> = </w:t>
-      </w:r>
-      <w:r>
-        <w:rPr>
-          <w:szCs w:val="28"/>
-          <w:lang w:val="en-US"/>
-        </w:rPr>
-        <w:t>0</w:t>
-      </w:r>
-      <w:r>
-        <w:rPr>
-          <w:szCs w:val="28"/>
-          <w:lang w:val="en-US"/>
-        </w:rPr>
-        <w:t>, B</w:t>
+        <w:t xml:space="preserve"> = 0, B</w:t>
       </w:r>
       <w:r>
         <w:rPr>
@@ -3753,14 +3740,7 @@
           <w:szCs w:val="28"/>
           <w:lang w:val="en-US"/>
         </w:rPr>
-        <w:t xml:space="preserve"> = </w:t>
-      </w:r>
-      <w:r>
-        <w:rPr>
-          <w:szCs w:val="28"/>
-          <w:lang w:val="en-US"/>
-        </w:rPr>
-        <w:t>0</w:t>
+        <w:t xml:space="preserve"> = 0</w:t>
       </w:r>
     </w:p>
     <w:p>
@@ -3791,21 +3771,7 @@
           <w:szCs w:val="28"/>
           <w:lang w:val="en-US"/>
         </w:rPr>
-        <w:t xml:space="preserve"> = </w:t>
-      </w:r>
-      <w:r>
-        <w:rPr>
-          <w:szCs w:val="28"/>
-          <w:lang w:val="en-US"/>
-        </w:rPr>
-        <w:t>0</w:t>
-      </w:r>
-      <w:r>
-        <w:rPr>
-          <w:szCs w:val="28"/>
-          <w:lang w:val="en-US"/>
-        </w:rPr>
-        <w:t>, B</w:t>
+        <w:t xml:space="preserve"> = 0, B</w:t>
       </w:r>
       <w:r>
         <w:rPr>
@@ -3820,14 +3786,7 @@
           <w:szCs w:val="28"/>
           <w:lang w:val="en-US"/>
         </w:rPr>
-        <w:t xml:space="preserve"> = </w:t>
-      </w:r>
-      <w:r>
-        <w:rPr>
-          <w:szCs w:val="28"/>
-          <w:lang w:val="en-US"/>
-        </w:rPr>
-        <w:t>0</w:t>
+        <w:t xml:space="preserve"> = 0</w:t>
       </w:r>
     </w:p>
     <w:p>
@@ -4130,21 +4089,9 @@
     <w:p>
       <w:pPr>
         <w:jc w:val="both"/>
-      </w:pPr>
-    </w:p>
-    <w:p>
-      <w:pPr>
-        <w:jc w:val="both"/>
-      </w:pPr>
-    </w:p>
-    <w:p>
-      <w:pPr>
-        <w:jc w:val="both"/>
-      </w:pPr>
-    </w:p>
-    <w:p>
-      <w:pPr>
-        <w:jc w:val="both"/>
+        <w:rPr>
+          <w:lang w:val="en-US"/>
+        </w:rPr>
       </w:pPr>
     </w:p>
     <w:p>
@@ -4987,36 +4934,6 @@
         </w:tc>
       </w:tr>
     </w:tbl>
-    <w:p>
-      <w:pPr>
-        <w:jc w:val="both"/>
-      </w:pPr>
-    </w:p>
-    <w:p>
-      <w:pPr>
-        <w:jc w:val="both"/>
-      </w:pPr>
-    </w:p>
-    <w:p>
-      <w:pPr>
-        <w:jc w:val="both"/>
-      </w:pPr>
-    </w:p>
-    <w:p>
-      <w:pPr>
-        <w:jc w:val="both"/>
-      </w:pPr>
-    </w:p>
-    <w:p>
-      <w:pPr>
-        <w:jc w:val="both"/>
-      </w:pPr>
-    </w:p>
-    <w:p>
-      <w:pPr>
-        <w:jc w:val="both"/>
-      </w:pPr>
-    </w:p>
     <w:p>
       <w:pPr>
         <w:jc w:val="both"/>
@@ -5205,15 +5122,7 @@
                 <w:sz w:val="22"/>
                 <w:szCs w:val="22"/>
               </w:rPr>
-              <w:t xml:space="preserve">Ячейка, содержимое которой изменилось </w:t>
-            </w:r>
-            <w:r>
-              <w:rPr>
-                <w:sz w:val="22"/>
-                <w:szCs w:val="22"/>
-              </w:rPr>
-              <w:lastRenderedPageBreak/>
-              <w:t>после новой выполнения команды</w:t>
+              <w:t>Ячейка, содержимое которой изменилось после новой выполнения команды</w:t>
             </w:r>
           </w:p>
         </w:tc>
@@ -5236,7 +5145,6 @@
                 <w:sz w:val="22"/>
                 <w:szCs w:val="22"/>
               </w:rPr>
-              <w:lastRenderedPageBreak/>
               <w:t>Адрес</w:t>
             </w:r>
           </w:p>
@@ -5433,7 +5341,6 @@
               <w:rPr>
                 <w:sz w:val="22"/>
                 <w:szCs w:val="22"/>
-                <w:lang w:val="en-US"/>
               </w:rPr>
             </w:pPr>
             <w:r>
@@ -6416,7 +6323,22 @@
                 <w:szCs w:val="22"/>
                 <w:lang w:val="en-US"/>
               </w:rPr>
-              <w:t>0100</w:t>
+              <w:t>0</w:t>
+            </w:r>
+            <w:r>
+              <w:rPr>
+                <w:sz w:val="22"/>
+                <w:szCs w:val="22"/>
+              </w:rPr>
+              <w:t>2</w:t>
+            </w:r>
+            <w:r>
+              <w:rPr>
+                <w:sz w:val="22"/>
+                <w:szCs w:val="22"/>
+                <w:lang w:val="en-US"/>
+              </w:rPr>
+              <w:t>00</w:t>
             </w:r>
           </w:p>
         </w:tc>
@@ -6672,7 +6594,22 @@
                 <w:szCs w:val="22"/>
                 <w:lang w:val="en-US"/>
               </w:rPr>
-              <w:t>0100</w:t>
+              <w:t>0</w:t>
+            </w:r>
+            <w:r>
+              <w:rPr>
+                <w:sz w:val="22"/>
+                <w:szCs w:val="22"/>
+              </w:rPr>
+              <w:t>2</w:t>
+            </w:r>
+            <w:r>
+              <w:rPr>
+                <w:sz w:val="22"/>
+                <w:szCs w:val="22"/>
+                <w:lang w:val="en-US"/>
+              </w:rPr>
+              <w:t>00</w:t>
             </w:r>
           </w:p>
         </w:tc>
@@ -7806,19 +7743,12 @@
       <w:r>
         <w:t xml:space="preserve">. – 2-е изд. – СПб.: Питер, 2011. – 688 с.: ил. – Режим доступа: </w:t>
       </w:r>
-      <w:hyperlink r:id="rId12" w:tgtFrame="_new" w:history="1">
+      <w:hyperlink r:id="rId13" w:tgtFrame="_new" w:history="1">
         <w:r>
           <w:rPr>
             <w:rStyle w:val="Hyperlink"/>
           </w:rPr>
-          <w:t>http://www.nicevt.ru/wp-content/uploads/2019/10/2.-%D0%A6%D0%B8%D0%BB%D1%8C%D0%BA%D0%B5%D1%80-</w:t>
-        </w:r>
-        <w:r>
-          <w:rPr>
-            <w:rStyle w:val="Hyperlink"/>
-          </w:rPr>
-          <w:lastRenderedPageBreak/>
-          <w:t>%D0%91.%D0%AF.-%D0%9E%D1%80%D0%BB%D0%BE%D0%B2-%D0%A1.%D0%90.-%D0%9E%D1%80%D0%B3%D0%B0%D0%BD%D0%B8%D0%B7%D0%B0%D1%86%D0%B8%D1%8F-%D0%AD%D0%92%D0%9C-%D0%B8-%D1%81%D0%B8%D1%81%D1%82%D0%B5%D0%BC-%D0%A1%D0%9F%D0%91-%D0%9F%D0%B8%D1%82%D0%B5%D1%80-2011.pdf</w:t>
+          <w:t>http://www.nicevt.ru/wp-content/uploads/2019/10/2.-%D0%A6%D0%B8%D0%BB%D1%8C%D0%BA%D0%B5%D1%80-%D0%91.%D0%AF.-%D0%9E%D1%80%D0%BB%D0%BE%D0%B2-%D0%A1.%D0%90.-%D0%9E%D1%80%D0%B3%D0%B0%D0%BD%D0%B8%D0%B7%D0%B0%D1%86%D0%B8%D1%8F-%D0%AD%D0%92%D0%9C-%D0%B8-%D1%81%D0%B8%D1%81%D1%82%D0%B5%D0%BC-%D0%A1%D0%9F%D0%91-%D0%9F%D0%B8%D1%82%D0%B5%D1%80-2011.pdf</w:t>
         </w:r>
       </w:hyperlink>
       <w:r>
@@ -7845,7 +7775,7 @@
       <w:r>
         <w:t xml:space="preserve"> [Электронный ресурс]. – Режим доступа: </w:t>
       </w:r>
-      <w:hyperlink r:id="rId13" w:tgtFrame="_new" w:history="1">
+      <w:hyperlink r:id="rId14" w:tgtFrame="_new" w:history="1">
         <w:r>
           <w:rPr>
             <w:rStyle w:val="Hyperlink"/>
@@ -7859,7 +7789,7 @@
     </w:p>
     <w:p/>
     <w:sectPr>
-      <w:footerReference w:type="default" r:id="rId14"/>
+      <w:footerReference w:type="default" r:id="rId15"/>
       <w:pgSz w:w="11906" w:h="16838" w:code="9"/>
       <w:pgMar w:top="1134" w:right="851" w:bottom="1134" w:left="1701" w:header="709" w:footer="709" w:gutter="0"/>
       <w:cols w:space="708"/>

</xml_diff>

<commit_message>
FOPA lab2: report done
</commit_message>
<xml_diff>
--- a/fopa/lab2/report.docx
+++ b/fopa/lab2/report.docx
@@ -9,6 +9,18 @@
           <w:szCs w:val="28"/>
         </w:rPr>
       </w:pPr>
+      <w:r>
+        <w:rPr>
+          <w:szCs w:val="28"/>
+        </w:rPr>
+        <w:t xml:space="preserve"> </w:t>
+      </w:r>
+      <w:r>
+        <w:rPr>
+          <w:szCs w:val="28"/>
+        </w:rPr>
+        <w:tab/>
+      </w:r>
       <w:r>
         <w:rPr>
           <w:szCs w:val="28"/>
@@ -300,7 +312,7 @@
           <w:r>
             <w:fldChar w:fldCharType="separate"/>
           </w:r>
-          <w:hyperlink w:anchor="_Toc209088592" w:history="1">
+          <w:hyperlink w:anchor="_Toc214023228" w:history="1">
             <w:r>
               <w:rPr>
                 <w:rStyle w:val="Hyperlink"/>
@@ -329,7 +341,7 @@
                 <w:noProof/>
                 <w:webHidden/>
               </w:rPr>
-              <w:instrText xml:space="preserve"> PAGEREF _Toc209088592 \h </w:instrText>
+              <w:instrText xml:space="preserve"> PAGEREF _Toc214023228 \h </w:instrText>
             </w:r>
             <w:r>
               <w:rPr>
@@ -373,7 +385,7 @@
               <w:lang w:val="en-RU" w:eastAsia="en-GB"/>
             </w:rPr>
           </w:pPr>
-          <w:hyperlink w:anchor="_Toc209088593" w:history="1">
+          <w:hyperlink w:anchor="_Toc214023229" w:history="1">
             <w:r>
               <w:rPr>
                 <w:rStyle w:val="Hyperlink"/>
@@ -402,7 +414,7 @@
                 <w:noProof/>
                 <w:webHidden/>
               </w:rPr>
-              <w:instrText xml:space="preserve"> PAGEREF _Toc209088593 \h </w:instrText>
+              <w:instrText xml:space="preserve"> PAGEREF _Toc214023229 \h </w:instrText>
             </w:r>
             <w:r>
               <w:rPr>
@@ -423,6 +435,290 @@
                 <w:webHidden/>
               </w:rPr>
               <w:t>4</w:t>
+            </w:r>
+            <w:r>
+              <w:rPr>
+                <w:noProof/>
+                <w:webHidden/>
+              </w:rPr>
+              <w:fldChar w:fldCharType="end"/>
+            </w:r>
+          </w:hyperlink>
+        </w:p>
+        <w:p>
+          <w:pPr>
+            <w:pStyle w:val="TOC2"/>
+            <w:tabs>
+              <w:tab w:val="right" w:leader="dot" w:pos="9344"/>
+            </w:tabs>
+            <w:rPr>
+              <w:rFonts w:asciiTheme="minorHAnsi" w:eastAsiaTheme="minorEastAsia" w:hAnsiTheme="minorHAnsi"/>
+              <w:noProof/>
+              <w:sz w:val="24"/>
+              <w:lang w:val="en-RU" w:eastAsia="en-GB"/>
+            </w:rPr>
+          </w:pPr>
+          <w:hyperlink w:anchor="_Toc214023230" w:history="1">
+            <w:r>
+              <w:rPr>
+                <w:rStyle w:val="Hyperlink"/>
+                <w:noProof/>
+              </w:rPr>
+              <w:t>Текст исходной программы</w:t>
+            </w:r>
+            <w:r>
+              <w:rPr>
+                <w:noProof/>
+                <w:webHidden/>
+              </w:rPr>
+              <w:tab/>
+            </w:r>
+            <w:r>
+              <w:rPr>
+                <w:noProof/>
+                <w:webHidden/>
+              </w:rPr>
+              <w:fldChar w:fldCharType="begin"/>
+            </w:r>
+            <w:r>
+              <w:rPr>
+                <w:noProof/>
+                <w:webHidden/>
+              </w:rPr>
+              <w:instrText xml:space="preserve"> PAGEREF _Toc214023230 \h </w:instrText>
+            </w:r>
+            <w:r>
+              <w:rPr>
+                <w:noProof/>
+                <w:webHidden/>
+              </w:rPr>
+            </w:r>
+            <w:r>
+              <w:rPr>
+                <w:noProof/>
+                <w:webHidden/>
+              </w:rPr>
+              <w:fldChar w:fldCharType="separate"/>
+            </w:r>
+            <w:r>
+              <w:rPr>
+                <w:noProof/>
+                <w:webHidden/>
+              </w:rPr>
+              <w:t>4</w:t>
+            </w:r>
+            <w:r>
+              <w:rPr>
+                <w:noProof/>
+                <w:webHidden/>
+              </w:rPr>
+              <w:fldChar w:fldCharType="end"/>
+            </w:r>
+          </w:hyperlink>
+        </w:p>
+        <w:p>
+          <w:pPr>
+            <w:pStyle w:val="TOC2"/>
+            <w:tabs>
+              <w:tab w:val="right" w:leader="dot" w:pos="9344"/>
+            </w:tabs>
+            <w:rPr>
+              <w:rFonts w:asciiTheme="minorHAnsi" w:eastAsiaTheme="minorEastAsia" w:hAnsiTheme="minorHAnsi"/>
+              <w:noProof/>
+              <w:sz w:val="24"/>
+              <w:lang w:val="en-RU" w:eastAsia="en-GB"/>
+            </w:rPr>
+          </w:pPr>
+          <w:hyperlink w:anchor="_Toc214023231" w:history="1">
+            <w:r>
+              <w:rPr>
+                <w:rStyle w:val="Hyperlink"/>
+                <w:noProof/>
+              </w:rPr>
+              <w:t>Описание программы</w:t>
+            </w:r>
+            <w:r>
+              <w:rPr>
+                <w:noProof/>
+                <w:webHidden/>
+              </w:rPr>
+              <w:tab/>
+            </w:r>
+            <w:r>
+              <w:rPr>
+                <w:noProof/>
+                <w:webHidden/>
+              </w:rPr>
+              <w:fldChar w:fldCharType="begin"/>
+            </w:r>
+            <w:r>
+              <w:rPr>
+                <w:noProof/>
+                <w:webHidden/>
+              </w:rPr>
+              <w:instrText xml:space="preserve"> PAGEREF _Toc214023231 \h </w:instrText>
+            </w:r>
+            <w:r>
+              <w:rPr>
+                <w:noProof/>
+                <w:webHidden/>
+              </w:rPr>
+            </w:r>
+            <w:r>
+              <w:rPr>
+                <w:noProof/>
+                <w:webHidden/>
+              </w:rPr>
+              <w:fldChar w:fldCharType="separate"/>
+            </w:r>
+            <w:r>
+              <w:rPr>
+                <w:noProof/>
+                <w:webHidden/>
+              </w:rPr>
+              <w:t>5</w:t>
+            </w:r>
+            <w:r>
+              <w:rPr>
+                <w:noProof/>
+                <w:webHidden/>
+              </w:rPr>
+              <w:fldChar w:fldCharType="end"/>
+            </w:r>
+          </w:hyperlink>
+        </w:p>
+        <w:p>
+          <w:pPr>
+            <w:pStyle w:val="TOC2"/>
+            <w:tabs>
+              <w:tab w:val="right" w:leader="dot" w:pos="9344"/>
+            </w:tabs>
+            <w:rPr>
+              <w:rFonts w:asciiTheme="minorHAnsi" w:eastAsiaTheme="minorEastAsia" w:hAnsiTheme="minorHAnsi"/>
+              <w:noProof/>
+              <w:sz w:val="24"/>
+              <w:lang w:val="en-RU" w:eastAsia="en-GB"/>
+            </w:rPr>
+          </w:pPr>
+          <w:hyperlink w:anchor="_Toc214023232" w:history="1">
+            <w:r>
+              <w:rPr>
+                <w:rStyle w:val="Hyperlink"/>
+                <w:noProof/>
+              </w:rPr>
+              <w:t>Таблица трассировки</w:t>
+            </w:r>
+            <w:r>
+              <w:rPr>
+                <w:noProof/>
+                <w:webHidden/>
+              </w:rPr>
+              <w:tab/>
+            </w:r>
+            <w:r>
+              <w:rPr>
+                <w:noProof/>
+                <w:webHidden/>
+              </w:rPr>
+              <w:fldChar w:fldCharType="begin"/>
+            </w:r>
+            <w:r>
+              <w:rPr>
+                <w:noProof/>
+                <w:webHidden/>
+              </w:rPr>
+              <w:instrText xml:space="preserve"> PAGEREF _Toc214023232 \h </w:instrText>
+            </w:r>
+            <w:r>
+              <w:rPr>
+                <w:noProof/>
+                <w:webHidden/>
+              </w:rPr>
+            </w:r>
+            <w:r>
+              <w:rPr>
+                <w:noProof/>
+                <w:webHidden/>
+              </w:rPr>
+              <w:fldChar w:fldCharType="separate"/>
+            </w:r>
+            <w:r>
+              <w:rPr>
+                <w:noProof/>
+                <w:webHidden/>
+              </w:rPr>
+              <w:t>8</w:t>
+            </w:r>
+            <w:r>
+              <w:rPr>
+                <w:noProof/>
+                <w:webHidden/>
+              </w:rPr>
+              <w:fldChar w:fldCharType="end"/>
+            </w:r>
+          </w:hyperlink>
+        </w:p>
+        <w:p>
+          <w:pPr>
+            <w:pStyle w:val="TOC2"/>
+            <w:tabs>
+              <w:tab w:val="right" w:leader="dot" w:pos="9344"/>
+            </w:tabs>
+            <w:rPr>
+              <w:rFonts w:asciiTheme="minorHAnsi" w:eastAsiaTheme="minorEastAsia" w:hAnsiTheme="minorHAnsi"/>
+              <w:noProof/>
+              <w:sz w:val="24"/>
+              <w:lang w:val="en-RU" w:eastAsia="en-GB"/>
+            </w:rPr>
+          </w:pPr>
+          <w:hyperlink w:anchor="_Toc214023233" w:history="1">
+            <w:r>
+              <w:rPr>
+                <w:rStyle w:val="Hyperlink"/>
+                <w:noProof/>
+              </w:rPr>
+              <w:t>Вариант с меньшим числом команд</w:t>
+            </w:r>
+            <w:r>
+              <w:rPr>
+                <w:noProof/>
+                <w:webHidden/>
+              </w:rPr>
+              <w:tab/>
+            </w:r>
+            <w:r>
+              <w:rPr>
+                <w:noProof/>
+                <w:webHidden/>
+              </w:rPr>
+              <w:fldChar w:fldCharType="begin"/>
+            </w:r>
+            <w:r>
+              <w:rPr>
+                <w:noProof/>
+                <w:webHidden/>
+              </w:rPr>
+              <w:instrText xml:space="preserve"> PAGEREF _Toc214023233 \h </w:instrText>
+            </w:r>
+            <w:r>
+              <w:rPr>
+                <w:noProof/>
+                <w:webHidden/>
+              </w:rPr>
+            </w:r>
+            <w:r>
+              <w:rPr>
+                <w:noProof/>
+                <w:webHidden/>
+              </w:rPr>
+              <w:fldChar w:fldCharType="separate"/>
+            </w:r>
+            <w:r>
+              <w:rPr>
+                <w:noProof/>
+                <w:webHidden/>
+              </w:rPr>
+              <w:t>9</w:t>
             </w:r>
             <w:r>
               <w:rPr>
@@ -446,7 +742,7 @@
               <w:lang w:val="en-RU" w:eastAsia="en-GB"/>
             </w:rPr>
           </w:pPr>
-          <w:hyperlink w:anchor="_Toc209088594" w:history="1">
+          <w:hyperlink w:anchor="_Toc214023234" w:history="1">
             <w:r>
               <w:rPr>
                 <w:rStyle w:val="Hyperlink"/>
@@ -475,7 +771,7 @@
                 <w:noProof/>
                 <w:webHidden/>
               </w:rPr>
-              <w:instrText xml:space="preserve"> PAGEREF _Toc209088594 \h </w:instrText>
+              <w:instrText xml:space="preserve"> PAGEREF _Toc214023234 \h </w:instrText>
             </w:r>
             <w:r>
               <w:rPr>
@@ -495,7 +791,7 @@
                 <w:noProof/>
                 <w:webHidden/>
               </w:rPr>
-              <w:t>5</w:t>
+              <w:t>10</w:t>
             </w:r>
             <w:r>
               <w:rPr>
@@ -519,7 +815,7 @@
               <w:lang w:val="en-RU" w:eastAsia="en-GB"/>
             </w:rPr>
           </w:pPr>
-          <w:hyperlink w:anchor="_Toc209088595" w:history="1">
+          <w:hyperlink w:anchor="_Toc214023235" w:history="1">
             <w:r>
               <w:rPr>
                 <w:rStyle w:val="Hyperlink"/>
@@ -548,7 +844,7 @@
                 <w:noProof/>
                 <w:webHidden/>
               </w:rPr>
-              <w:instrText xml:space="preserve"> PAGEREF _Toc209088595 \h </w:instrText>
+              <w:instrText xml:space="preserve"> PAGEREF _Toc214023235 \h </w:instrText>
             </w:r>
             <w:r>
               <w:rPr>
@@ -568,7 +864,7 @@
                 <w:noProof/>
                 <w:webHidden/>
               </w:rPr>
-              <w:t>6</w:t>
+              <w:t>11</w:t>
             </w:r>
             <w:r>
               <w:rPr>
@@ -619,9 +915,13 @@
         </w:rPr>
       </w:pPr>
     </w:p>
-    <w:p/>
-    <w:p/>
-    <w:p/>
+    <w:p>
+      <w:pPr>
+        <w:rPr>
+          <w:lang w:val="en-US"/>
+        </w:rPr>
+      </w:pPr>
+    </w:p>
     <w:p>
       <w:pPr>
         <w:pStyle w:val="Heading1"/>
@@ -632,7 +932,7 @@
           <w:lang w:val="en-US"/>
         </w:rPr>
       </w:pPr>
-      <w:bookmarkStart w:id="0" w:name="_Toc209088592"/>
+      <w:bookmarkStart w:id="0" w:name="_Toc214023228"/>
       <w:r>
         <w:rPr>
           <w:b/>
@@ -770,7 +1070,7 @@
           <w:bCs/>
         </w:rPr>
       </w:pPr>
-      <w:bookmarkStart w:id="1" w:name="_Toc209088593"/>
+      <w:bookmarkStart w:id="1" w:name="_Toc214023229"/>
       <w:r>
         <w:rPr>
           <w:b/>
@@ -793,9 +1093,11 @@
         <w:pStyle w:val="Heading2"/>
         <w:jc w:val="center"/>
       </w:pPr>
+      <w:bookmarkStart w:id="2" w:name="_Toc214023230"/>
       <w:r>
         <w:t>Текст исходной программы</w:t>
       </w:r>
+      <w:bookmarkEnd w:id="2"/>
     </w:p>
     <w:tbl>
       <w:tblPr>
@@ -2051,10 +2353,12 @@
         <w:pStyle w:val="Heading2"/>
         <w:jc w:val="center"/>
       </w:pPr>
+      <w:bookmarkStart w:id="3" w:name="_Toc214023231"/>
       <w:r>
         <w:lastRenderedPageBreak/>
         <w:t>Описание программы</w:t>
       </w:r>
+      <w:bookmarkEnd w:id="3"/>
     </w:p>
     <w:p>
       <w:pPr>
@@ -2483,7 +2787,7 @@
           <w:szCs w:val="28"/>
         </w:rPr>
         <w:drawing>
-          <wp:inline distT="0" distB="0" distL="0" distR="0" wp14:anchorId="51AFD355" wp14:editId="230C6753">
+          <wp:inline distT="0" distB="0" distL="0" distR="0" wp14:anchorId="51AFD355" wp14:editId="35144A3F">
             <wp:extent cx="5939790" cy="1408430"/>
             <wp:effectExtent l="0" t="0" r="3810" b="1270"/>
             <wp:docPr id="1771665743" name="Picture 1" descr="A close-up of a gauge&#10;&#10;AI-generated content may be incorrect."/>
@@ -3222,7 +3526,7 @@
         <w:rPr>
           <w:rFonts w:eastAsia="Times New Roman"/>
           <w:kern w:val="0"/>
-          <w:lang w:eastAsia="en-GB"/>
+          <w:lang w:val="en-US" w:eastAsia="en-GB"/>
           <w14:ligatures w14:val="none"/>
         </w:rPr>
       </w:pPr>
@@ -3297,7 +3601,7 @@
         <w:rPr>
           <w:rFonts w:eastAsia="Times New Roman"/>
           <w:kern w:val="0"/>
-          <w:lang w:eastAsia="en-GB"/>
+          <w:lang w:val="en-US" w:eastAsia="en-GB"/>
           <w14:ligatures w14:val="none"/>
         </w:rPr>
       </w:pPr>
@@ -4088,956 +4392,15 @@
     </w:p>
     <w:p>
       <w:pPr>
-        <w:jc w:val="both"/>
-        <w:rPr>
-          <w:lang w:val="en-US"/>
-        </w:rPr>
-      </w:pPr>
-    </w:p>
-    <w:p>
-      <w:pPr>
-        <w:jc w:val="both"/>
-      </w:pPr>
-    </w:p>
-    <w:p>
-      <w:pPr>
-        <w:jc w:val="both"/>
-      </w:pPr>
-    </w:p>
-    <w:tbl>
-      <w:tblPr>
-        <w:tblStyle w:val="TableGrid"/>
-        <w:tblW w:w="0" w:type="auto"/>
-        <w:tblLook w:val="04A0" w:firstRow="1" w:lastRow="0" w:firstColumn="1" w:lastColumn="0" w:noHBand="0" w:noVBand="1"/>
-      </w:tblPr>
-      <w:tblGrid>
-        <w:gridCol w:w="2021"/>
-        <w:gridCol w:w="2065"/>
-        <w:gridCol w:w="1613"/>
-        <w:gridCol w:w="3645"/>
-      </w:tblGrid>
-      <w:tr>
-        <w:tc>
-          <w:tcPr>
-            <w:tcW w:w="2021" w:type="dxa"/>
-          </w:tcPr>
-          <w:p>
-            <w:pPr>
-              <w:jc w:val="both"/>
-              <w:rPr>
-                <w:lang w:val="en-US"/>
-              </w:rPr>
-            </w:pPr>
-            <w:r>
-              <w:t>Ячейка памяти</w:t>
-            </w:r>
-          </w:p>
-        </w:tc>
-        <w:tc>
-          <w:tcPr>
-            <w:tcW w:w="2065" w:type="dxa"/>
-          </w:tcPr>
-          <w:p>
-            <w:pPr>
-              <w:jc w:val="both"/>
-              <w:rPr>
-                <w:lang w:val="en-US"/>
-              </w:rPr>
-            </w:pPr>
-            <w:r>
-              <w:t>Код</w:t>
-            </w:r>
-            <w:r>
-              <w:rPr>
-                <w:lang w:val="en-US"/>
-              </w:rPr>
-              <w:t xml:space="preserve"> </w:t>
-            </w:r>
-            <w:r>
-              <w:t>команды</w:t>
-            </w:r>
-          </w:p>
-        </w:tc>
-        <w:tc>
-          <w:tcPr>
-            <w:tcW w:w="1613" w:type="dxa"/>
-          </w:tcPr>
-          <w:p>
-            <w:pPr>
-              <w:jc w:val="both"/>
-              <w:rPr>
-                <w:lang w:val="en-US"/>
-              </w:rPr>
-            </w:pPr>
-            <w:r>
-              <w:t>Мнемоника</w:t>
-            </w:r>
-          </w:p>
-        </w:tc>
-        <w:tc>
-          <w:tcPr>
-            <w:tcW w:w="3645" w:type="dxa"/>
-          </w:tcPr>
-          <w:p>
-            <w:pPr>
-              <w:jc w:val="both"/>
-              <w:rPr>
-                <w:lang w:val="en-US"/>
-              </w:rPr>
-            </w:pPr>
-            <w:r>
-              <w:t>Комментарии</w:t>
-            </w:r>
-          </w:p>
-        </w:tc>
-      </w:tr>
-      <w:tr>
-        <w:tc>
-          <w:tcPr>
-            <w:tcW w:w="2021" w:type="dxa"/>
-            <w:shd w:val="clear" w:color="auto" w:fill="92D050"/>
-          </w:tcPr>
-          <w:p>
-            <w:pPr>
-              <w:jc w:val="both"/>
-              <w:rPr>
-                <w:lang w:val="en-US"/>
-              </w:rPr>
-            </w:pPr>
-            <w:r>
-              <w:rPr>
-                <w:lang w:val="en-US"/>
-              </w:rPr>
-              <w:t>13A</w:t>
-            </w:r>
-          </w:p>
-        </w:tc>
-        <w:tc>
-          <w:tcPr>
-            <w:tcW w:w="2065" w:type="dxa"/>
-            <w:shd w:val="clear" w:color="auto" w:fill="92D050"/>
-          </w:tcPr>
-          <w:p>
-            <w:pPr>
-              <w:jc w:val="both"/>
-              <w:rPr>
-                <w:lang w:val="en-US"/>
-              </w:rPr>
-            </w:pPr>
-            <w:r>
-              <w:rPr>
-                <w:lang w:val="en-US"/>
-              </w:rPr>
-              <w:t>A144</w:t>
-            </w:r>
-          </w:p>
-        </w:tc>
-        <w:tc>
-          <w:tcPr>
-            <w:tcW w:w="1613" w:type="dxa"/>
-            <w:shd w:val="clear" w:color="auto" w:fill="92D050"/>
-          </w:tcPr>
-          <w:p>
-            <w:pPr>
-              <w:jc w:val="both"/>
-              <w:rPr>
-                <w:lang w:val="en-US"/>
-              </w:rPr>
-            </w:pPr>
-            <w:r>
-              <w:rPr>
-                <w:lang w:val="en-US"/>
-              </w:rPr>
-              <w:t>LD 144</w:t>
-            </w:r>
-          </w:p>
-        </w:tc>
-        <w:tc>
-          <w:tcPr>
-            <w:tcW w:w="3645" w:type="dxa"/>
-            <w:shd w:val="clear" w:color="auto" w:fill="92D050"/>
-          </w:tcPr>
-          <w:p>
-            <w:pPr>
-              <w:jc w:val="center"/>
-            </w:pPr>
-            <w:r>
-              <w:t>Загрузить содержимое ячейки 144 в аккумулятор</w:t>
-            </w:r>
-          </w:p>
-          <w:p>
-            <w:pPr>
-              <w:jc w:val="center"/>
-            </w:pPr>
-            <w:r>
-              <w:t xml:space="preserve">(144) </w:t>
-            </w:r>
-            <w:r>
-              <w:sym w:font="Symbol" w:char="F0DE"/>
-            </w:r>
-            <w:r>
-              <w:t xml:space="preserve"> </w:t>
-            </w:r>
-            <w:r>
-              <w:rPr>
-                <w:lang w:val="en-US"/>
-              </w:rPr>
-              <w:t>AC</w:t>
-            </w:r>
-          </w:p>
-        </w:tc>
-      </w:tr>
-      <w:tr>
-        <w:tc>
-          <w:tcPr>
-            <w:tcW w:w="2021" w:type="dxa"/>
-          </w:tcPr>
-          <w:p>
-            <w:pPr>
-              <w:jc w:val="both"/>
-              <w:rPr>
-                <w:lang w:val="en-US"/>
-              </w:rPr>
-            </w:pPr>
-            <w:r>
-              <w:t>13</w:t>
-            </w:r>
-            <w:r>
-              <w:rPr>
-                <w:lang w:val="en-US"/>
-              </w:rPr>
-              <w:t>B</w:t>
-            </w:r>
-          </w:p>
-        </w:tc>
-        <w:tc>
-          <w:tcPr>
-            <w:tcW w:w="2065" w:type="dxa"/>
-          </w:tcPr>
-          <w:p>
-            <w:pPr>
-              <w:jc w:val="both"/>
-            </w:pPr>
-            <w:r>
-              <w:rPr>
-                <w:lang w:val="en-US"/>
-              </w:rPr>
-              <w:t>2142</w:t>
-            </w:r>
-          </w:p>
-        </w:tc>
-        <w:tc>
-          <w:tcPr>
-            <w:tcW w:w="1613" w:type="dxa"/>
-          </w:tcPr>
-          <w:p>
-            <w:pPr>
-              <w:jc w:val="both"/>
-            </w:pPr>
-            <w:r>
-              <w:rPr>
-                <w:lang w:val="en-US"/>
-              </w:rPr>
-              <w:t>AND 142</w:t>
-            </w:r>
-          </w:p>
-        </w:tc>
-        <w:tc>
-          <w:tcPr>
-            <w:tcW w:w="3645" w:type="dxa"/>
-          </w:tcPr>
-          <w:p>
-            <w:pPr>
-              <w:jc w:val="center"/>
-            </w:pPr>
-            <w:r>
-              <w:t>Результат операции логического «И» ячейки памяти 142 с аккумулятором записать в аккумулятор</w:t>
-            </w:r>
-          </w:p>
-          <w:p>
-            <w:pPr>
-              <w:jc w:val="center"/>
-            </w:pPr>
-            <w:r>
-              <w:rPr>
-                <w:lang w:val="en-US"/>
-              </w:rPr>
-              <w:t>AC</w:t>
-            </w:r>
-            <w:r>
-              <w:t xml:space="preserve"> &amp; (142)</w:t>
-            </w:r>
-            <w:r>
-              <w:t xml:space="preserve"> </w:t>
-            </w:r>
-            <w:r>
-              <w:sym w:font="Symbol" w:char="F0DE"/>
-            </w:r>
-            <w:r>
-              <w:t xml:space="preserve"> </w:t>
-            </w:r>
-            <w:r>
-              <w:rPr>
-                <w:lang w:val="en-US"/>
-              </w:rPr>
-              <w:t>AC</w:t>
-            </w:r>
-          </w:p>
-        </w:tc>
-      </w:tr>
-      <w:tr>
-        <w:tc>
-          <w:tcPr>
-            <w:tcW w:w="2021" w:type="dxa"/>
-          </w:tcPr>
-          <w:p>
-            <w:pPr>
-              <w:jc w:val="both"/>
-              <w:rPr>
-                <w:lang w:val="en-US"/>
-              </w:rPr>
-            </w:pPr>
-            <w:r>
-              <w:rPr>
-                <w:lang w:val="en-US"/>
-              </w:rPr>
-              <w:t>13C</w:t>
-            </w:r>
-          </w:p>
-        </w:tc>
-        <w:tc>
-          <w:tcPr>
-            <w:tcW w:w="2065" w:type="dxa"/>
-          </w:tcPr>
-          <w:p>
-            <w:pPr>
-              <w:jc w:val="both"/>
-            </w:pPr>
-            <w:r>
-              <w:rPr>
-                <w:lang w:val="en-US"/>
-              </w:rPr>
-              <w:t>6145</w:t>
-            </w:r>
-          </w:p>
-        </w:tc>
-        <w:tc>
-          <w:tcPr>
-            <w:tcW w:w="1613" w:type="dxa"/>
-          </w:tcPr>
-          <w:p>
-            <w:pPr>
-              <w:jc w:val="both"/>
-            </w:pPr>
-            <w:r>
-              <w:rPr>
-                <w:lang w:val="en-US"/>
-              </w:rPr>
-              <w:t>SUB 145</w:t>
-            </w:r>
-          </w:p>
-        </w:tc>
-        <w:tc>
-          <w:tcPr>
-            <w:tcW w:w="3645" w:type="dxa"/>
-          </w:tcPr>
-          <w:p>
-            <w:pPr>
-              <w:jc w:val="center"/>
-            </w:pPr>
-            <w:r>
-              <w:t>Результат вычитания ячейки 145 из аккумулятора записать в аккумулятор</w:t>
-            </w:r>
-          </w:p>
-          <w:p>
-            <w:pPr>
-              <w:jc w:val="center"/>
-            </w:pPr>
-            <w:r>
-              <w:rPr>
-                <w:lang w:val="en-US"/>
-              </w:rPr>
-              <w:t xml:space="preserve">AC – (145) </w:t>
-            </w:r>
-            <w:r>
-              <w:sym w:font="Symbol" w:char="F0DE"/>
-            </w:r>
-            <w:r>
-              <w:rPr>
-                <w:lang w:val="en-US"/>
-              </w:rPr>
-              <w:t xml:space="preserve"> AC</w:t>
-            </w:r>
-          </w:p>
-        </w:tc>
-      </w:tr>
-      <w:tr>
-        <w:tc>
-          <w:tcPr>
-            <w:tcW w:w="2021" w:type="dxa"/>
-          </w:tcPr>
-          <w:p>
-            <w:pPr>
-              <w:jc w:val="both"/>
-              <w:rPr>
-                <w:lang w:val="en-US"/>
-              </w:rPr>
-            </w:pPr>
-            <w:r>
-              <w:rPr>
-                <w:lang w:val="en-US"/>
-              </w:rPr>
-              <w:t>13D</w:t>
-            </w:r>
-          </w:p>
-        </w:tc>
-        <w:tc>
-          <w:tcPr>
-            <w:tcW w:w="2065" w:type="dxa"/>
-          </w:tcPr>
-          <w:p>
-            <w:pPr>
-              <w:jc w:val="both"/>
-            </w:pPr>
-            <w:r>
-              <w:rPr>
-                <w:lang w:val="en-US"/>
-              </w:rPr>
-              <w:t>E143</w:t>
-            </w:r>
-          </w:p>
-        </w:tc>
-        <w:tc>
-          <w:tcPr>
-            <w:tcW w:w="1613" w:type="dxa"/>
-          </w:tcPr>
-          <w:p>
-            <w:pPr>
-              <w:jc w:val="both"/>
-            </w:pPr>
-            <w:r>
-              <w:rPr>
-                <w:lang w:val="en-US"/>
-              </w:rPr>
-              <w:t>ST 143</w:t>
-            </w:r>
-          </w:p>
-        </w:tc>
-        <w:tc>
-          <w:tcPr>
-            <w:tcW w:w="3645" w:type="dxa"/>
-          </w:tcPr>
-          <w:p>
-            <w:pPr>
-              <w:jc w:val="center"/>
-            </w:pPr>
-            <w:r>
-              <w:t>Загрузить содержимое аккумулятора в ячейку 1</w:t>
-            </w:r>
-            <w:r>
-              <w:t>43</w:t>
-            </w:r>
-          </w:p>
-          <w:p>
-            <w:pPr>
-              <w:jc w:val="center"/>
-            </w:pPr>
-            <w:r>
-              <w:rPr>
-                <w:lang w:val="en-US"/>
-              </w:rPr>
-              <w:t>AC</w:t>
-            </w:r>
-            <w:r>
-              <w:t xml:space="preserve"> </w:t>
-            </w:r>
-            <w:r>
-              <w:sym w:font="Symbol" w:char="F0DE"/>
-            </w:r>
-            <w:r>
-              <w:t xml:space="preserve"> </w:t>
-            </w:r>
-            <w:r>
-              <w:t>(</w:t>
-            </w:r>
-            <w:r>
-              <w:rPr>
-                <w:lang w:val="en-US"/>
-              </w:rPr>
-              <w:t>143</w:t>
-            </w:r>
-            <w:r>
-              <w:t>)</w:t>
-            </w:r>
-          </w:p>
-        </w:tc>
-      </w:tr>
-      <w:tr>
-        <w:tc>
-          <w:tcPr>
-            <w:tcW w:w="2021" w:type="dxa"/>
-            <w:shd w:val="clear" w:color="auto" w:fill="FFC000"/>
-          </w:tcPr>
-          <w:p>
-            <w:pPr>
-              <w:jc w:val="both"/>
-              <w:rPr>
-                <w:lang w:val="en-US"/>
-              </w:rPr>
-            </w:pPr>
-            <w:r>
-              <w:rPr>
-                <w:lang w:val="en-US"/>
-              </w:rPr>
-              <w:t>13E</w:t>
-            </w:r>
-          </w:p>
-        </w:tc>
-        <w:tc>
-          <w:tcPr>
-            <w:tcW w:w="2065" w:type="dxa"/>
-            <w:shd w:val="clear" w:color="auto" w:fill="FFC000"/>
-          </w:tcPr>
-          <w:p>
-            <w:pPr>
-              <w:jc w:val="both"/>
-            </w:pPr>
-            <w:r>
-              <w:rPr>
-                <w:lang w:val="en-US"/>
-              </w:rPr>
-              <w:t>0100</w:t>
-            </w:r>
-          </w:p>
-        </w:tc>
-        <w:tc>
-          <w:tcPr>
-            <w:tcW w:w="1613" w:type="dxa"/>
-            <w:shd w:val="clear" w:color="auto" w:fill="FFC000"/>
-          </w:tcPr>
-          <w:p>
-            <w:pPr>
-              <w:jc w:val="both"/>
-            </w:pPr>
-            <w:r>
-              <w:rPr>
-                <w:lang w:val="en-US"/>
-              </w:rPr>
-              <w:t>HLT</w:t>
-            </w:r>
-          </w:p>
-        </w:tc>
-        <w:tc>
-          <w:tcPr>
-            <w:tcW w:w="3645" w:type="dxa"/>
-            <w:shd w:val="clear" w:color="auto" w:fill="FFC000"/>
-          </w:tcPr>
-          <w:p>
-            <w:pPr>
-              <w:jc w:val="center"/>
-              <w:rPr>
-                <w:lang w:val="en-US"/>
-              </w:rPr>
-            </w:pPr>
-            <w:r>
-              <w:t>Остановка программы</w:t>
-            </w:r>
-          </w:p>
-        </w:tc>
-      </w:tr>
-      <w:tr>
-        <w:tc>
-          <w:tcPr>
-            <w:tcW w:w="2021" w:type="dxa"/>
-          </w:tcPr>
-          <w:p>
-            <w:pPr>
-              <w:jc w:val="both"/>
-              <w:rPr>
-                <w:lang w:val="en-US"/>
-              </w:rPr>
-            </w:pPr>
-            <w:r>
-              <w:rPr>
-                <w:lang w:val="en-US"/>
-              </w:rPr>
-              <w:t>142</w:t>
-            </w:r>
-          </w:p>
-        </w:tc>
-        <w:tc>
-          <w:tcPr>
-            <w:tcW w:w="2065" w:type="dxa"/>
-          </w:tcPr>
-          <w:p>
-            <w:pPr>
-              <w:jc w:val="both"/>
-              <w:rPr>
-                <w:lang w:val="en-US"/>
-              </w:rPr>
-            </w:pPr>
-            <w:r>
-              <w:rPr>
-                <w:lang w:val="en-US"/>
-              </w:rPr>
-              <w:t>E139</w:t>
-            </w:r>
-          </w:p>
-        </w:tc>
-        <w:tc>
-          <w:tcPr>
-            <w:tcW w:w="1613" w:type="dxa"/>
-          </w:tcPr>
-          <w:p>
-            <w:pPr>
-              <w:jc w:val="both"/>
-              <w:rPr>
-                <w:lang w:val="en-US"/>
-              </w:rPr>
-            </w:pPr>
-            <w:r>
-              <w:t>-</w:t>
-            </w:r>
-          </w:p>
-        </w:tc>
-        <w:tc>
-          <w:tcPr>
-            <w:tcW w:w="3645" w:type="dxa"/>
-          </w:tcPr>
-          <w:p>
-            <w:pPr>
-              <w:jc w:val="center"/>
-            </w:pPr>
-            <w:r>
-              <w:rPr>
-                <w:lang w:val="en-US"/>
-              </w:rPr>
-              <w:t>B</w:t>
-            </w:r>
-          </w:p>
-        </w:tc>
-      </w:tr>
-      <w:tr>
-        <w:tc>
-          <w:tcPr>
-            <w:tcW w:w="2021" w:type="dxa"/>
-          </w:tcPr>
-          <w:p>
-            <w:pPr>
-              <w:jc w:val="both"/>
-              <w:rPr>
-                <w:lang w:val="en-US"/>
-              </w:rPr>
-            </w:pPr>
-            <w:r>
-              <w:rPr>
-                <w:lang w:val="en-US"/>
-              </w:rPr>
-              <w:t>143</w:t>
-            </w:r>
-          </w:p>
-        </w:tc>
-        <w:tc>
-          <w:tcPr>
-            <w:tcW w:w="2065" w:type="dxa"/>
-          </w:tcPr>
-          <w:p>
-            <w:pPr>
-              <w:jc w:val="both"/>
-              <w:rPr>
-                <w:lang w:val="en-US"/>
-              </w:rPr>
-            </w:pPr>
-            <w:r>
-              <w:rPr>
-                <w:lang w:val="en-US"/>
-              </w:rPr>
-              <w:t>0200</w:t>
-            </w:r>
-          </w:p>
-        </w:tc>
-        <w:tc>
-          <w:tcPr>
-            <w:tcW w:w="1613" w:type="dxa"/>
-          </w:tcPr>
-          <w:p>
-            <w:pPr>
-              <w:jc w:val="both"/>
-            </w:pPr>
-            <w:r>
-              <w:t>-</w:t>
-            </w:r>
-          </w:p>
-        </w:tc>
-        <w:tc>
-          <w:tcPr>
-            <w:tcW w:w="3645" w:type="dxa"/>
-          </w:tcPr>
-          <w:p>
-            <w:pPr>
-              <w:jc w:val="center"/>
-              <w:rPr>
-                <w:lang w:val="en-US"/>
-              </w:rPr>
-            </w:pPr>
-            <w:r>
-              <w:rPr>
-                <w:lang w:val="en-US"/>
-              </w:rPr>
-              <w:t>R</w:t>
-            </w:r>
-          </w:p>
-        </w:tc>
-      </w:tr>
-      <w:tr>
-        <w:tc>
-          <w:tcPr>
-            <w:tcW w:w="2021" w:type="dxa"/>
-          </w:tcPr>
-          <w:p>
-            <w:pPr>
-              <w:jc w:val="both"/>
-              <w:rPr>
-                <w:lang w:val="en-US"/>
-              </w:rPr>
-            </w:pPr>
-            <w:r>
-              <w:rPr>
-                <w:lang w:val="en-US"/>
-              </w:rPr>
-              <w:t>144</w:t>
-            </w:r>
-          </w:p>
-        </w:tc>
-        <w:tc>
-          <w:tcPr>
-            <w:tcW w:w="2065" w:type="dxa"/>
-          </w:tcPr>
-          <w:p>
-            <w:pPr>
-              <w:jc w:val="both"/>
-              <w:rPr>
-                <w:lang w:val="en-US"/>
-              </w:rPr>
-            </w:pPr>
-            <w:r>
-              <w:rPr>
-                <w:lang w:val="en-US"/>
-              </w:rPr>
-              <w:t>E143</w:t>
-            </w:r>
-          </w:p>
-        </w:tc>
-        <w:tc>
-          <w:tcPr>
-            <w:tcW w:w="1613" w:type="dxa"/>
-          </w:tcPr>
-          <w:p>
-            <w:pPr>
-              <w:jc w:val="both"/>
-            </w:pPr>
-            <w:r>
-              <w:t>-</w:t>
-            </w:r>
-          </w:p>
-        </w:tc>
-        <w:tc>
-          <w:tcPr>
-            <w:tcW w:w="3645" w:type="dxa"/>
-          </w:tcPr>
-          <w:p>
-            <w:pPr>
-              <w:jc w:val="center"/>
-              <w:rPr>
-                <w:lang w:val="en-US"/>
-              </w:rPr>
-            </w:pPr>
-            <w:r>
-              <w:rPr>
-                <w:lang w:val="en-US"/>
-              </w:rPr>
-              <w:t>A</w:t>
-            </w:r>
-          </w:p>
-        </w:tc>
-      </w:tr>
-      <w:tr>
-        <w:tc>
-          <w:tcPr>
-            <w:tcW w:w="2021" w:type="dxa"/>
-          </w:tcPr>
-          <w:p>
-            <w:pPr>
-              <w:jc w:val="both"/>
-              <w:rPr>
-                <w:lang w:val="en-US"/>
-              </w:rPr>
-            </w:pPr>
-            <w:r>
-              <w:rPr>
-                <w:lang w:val="en-US"/>
-              </w:rPr>
-              <w:t>145</w:t>
-            </w:r>
-          </w:p>
-        </w:tc>
-        <w:tc>
-          <w:tcPr>
-            <w:tcW w:w="2065" w:type="dxa"/>
-          </w:tcPr>
-          <w:p>
-            <w:pPr>
-              <w:jc w:val="both"/>
-              <w:rPr>
-                <w:lang w:val="en-US"/>
-              </w:rPr>
-            </w:pPr>
-            <w:r>
-              <w:rPr>
-                <w:lang w:val="en-US"/>
-              </w:rPr>
-              <w:t>0200</w:t>
-            </w:r>
-          </w:p>
-        </w:tc>
-        <w:tc>
-          <w:tcPr>
-            <w:tcW w:w="1613" w:type="dxa"/>
-          </w:tcPr>
-          <w:p>
-            <w:pPr>
-              <w:jc w:val="both"/>
-            </w:pPr>
-            <w:r>
-              <w:t>-</w:t>
-            </w:r>
-          </w:p>
-        </w:tc>
-        <w:tc>
-          <w:tcPr>
-            <w:tcW w:w="3645" w:type="dxa"/>
-          </w:tcPr>
-          <w:p>
-            <w:pPr>
-              <w:jc w:val="center"/>
-              <w:rPr>
-                <w:lang w:val="en-US"/>
-              </w:rPr>
-            </w:pPr>
-            <w:r>
-              <w:rPr>
-                <w:lang w:val="en-US"/>
-              </w:rPr>
-              <w:t>D</w:t>
-            </w:r>
-          </w:p>
-        </w:tc>
-      </w:tr>
-    </w:tbl>
-    <w:p>
-      <w:pPr>
-        <w:jc w:val="both"/>
-      </w:pPr>
-    </w:p>
-    <w:p>
-      <w:pPr>
-        <w:jc w:val="both"/>
-      </w:pPr>
-    </w:p>
-    <w:p>
-      <w:pPr>
-        <w:jc w:val="both"/>
-      </w:pPr>
-    </w:p>
-    <w:p>
-      <w:pPr>
-        <w:jc w:val="both"/>
-      </w:pPr>
-    </w:p>
-    <w:p>
-      <w:pPr>
-        <w:jc w:val="both"/>
-      </w:pPr>
-    </w:p>
-    <w:p>
-      <w:pPr>
-        <w:jc w:val="both"/>
-      </w:pPr>
-    </w:p>
-    <w:p>
-      <w:pPr>
-        <w:jc w:val="both"/>
-      </w:pPr>
-    </w:p>
-    <w:p>
-      <w:pPr>
-        <w:jc w:val="both"/>
-      </w:pPr>
-    </w:p>
-    <w:p>
-      <w:pPr>
-        <w:jc w:val="both"/>
-      </w:pPr>
-    </w:p>
-    <w:p>
-      <w:pPr>
-        <w:jc w:val="both"/>
-      </w:pPr>
-    </w:p>
-    <w:p>
-      <w:pPr>
-        <w:jc w:val="both"/>
-      </w:pPr>
-    </w:p>
-    <w:p>
-      <w:pPr>
-        <w:jc w:val="both"/>
-      </w:pPr>
-    </w:p>
-    <w:p>
-      <w:pPr>
-        <w:jc w:val="both"/>
-      </w:pPr>
-    </w:p>
-    <w:p>
-      <w:pPr>
-        <w:jc w:val="both"/>
-      </w:pPr>
-    </w:p>
-    <w:p>
-      <w:pPr>
-        <w:jc w:val="both"/>
-      </w:pPr>
-    </w:p>
-    <w:p>
-      <w:pPr>
-        <w:jc w:val="both"/>
-      </w:pPr>
-    </w:p>
-    <w:p>
-      <w:pPr>
-        <w:jc w:val="both"/>
-      </w:pPr>
-    </w:p>
-    <w:p>
-      <w:pPr>
-        <w:jc w:val="both"/>
-      </w:pPr>
-    </w:p>
-    <w:p>
-      <w:pPr>
-        <w:jc w:val="both"/>
-      </w:pPr>
-    </w:p>
-    <w:p>
-      <w:pPr>
-        <w:jc w:val="both"/>
-      </w:pPr>
-    </w:p>
-    <w:p>
-      <w:pPr>
-        <w:jc w:val="both"/>
-      </w:pPr>
+        <w:pStyle w:val="Heading2"/>
+        <w:jc w:val="center"/>
+      </w:pPr>
+      <w:bookmarkStart w:id="4" w:name="_Toc214023232"/>
+      <w:r>
+        <w:lastRenderedPageBreak/>
+        <w:t>Таблица трассировки</w:t>
+      </w:r>
+      <w:bookmarkEnd w:id="4"/>
     </w:p>
     <w:tbl>
       <w:tblPr>
@@ -7587,7 +6950,6 @@
           <w:bCs/>
         </w:rPr>
       </w:pPr>
-      <w:bookmarkStart w:id="2" w:name="_Toc209088594"/>
     </w:p>
     <w:p>
       <w:pPr>
@@ -7618,6 +6980,922 @@
     </w:p>
     <w:p>
       <w:pPr>
+        <w:jc w:val="both"/>
+        <w:rPr>
+          <w:b/>
+          <w:bCs/>
+        </w:rPr>
+      </w:pPr>
+    </w:p>
+    <w:p>
+      <w:pPr>
+        <w:jc w:val="both"/>
+        <w:rPr>
+          <w:b/>
+          <w:bCs/>
+        </w:rPr>
+      </w:pPr>
+    </w:p>
+    <w:p>
+      <w:pPr>
+        <w:jc w:val="both"/>
+        <w:rPr>
+          <w:b/>
+          <w:bCs/>
+        </w:rPr>
+      </w:pPr>
+    </w:p>
+    <w:p>
+      <w:pPr>
+        <w:jc w:val="both"/>
+        <w:rPr>
+          <w:b/>
+          <w:bCs/>
+        </w:rPr>
+      </w:pPr>
+    </w:p>
+    <w:p>
+      <w:pPr>
+        <w:pStyle w:val="Heading2"/>
+        <w:jc w:val="center"/>
+      </w:pPr>
+      <w:bookmarkStart w:id="5" w:name="_Toc214023233"/>
+      <w:r>
+        <w:lastRenderedPageBreak/>
+        <w:t>Вариант с меньшим числом команд</w:t>
+      </w:r>
+      <w:bookmarkEnd w:id="5"/>
+    </w:p>
+    <w:p/>
+    <w:tbl>
+      <w:tblPr>
+        <w:tblStyle w:val="TableGrid"/>
+        <w:tblW w:w="0" w:type="auto"/>
+        <w:tblLook w:val="04A0" w:firstRow="1" w:lastRow="0" w:firstColumn="1" w:lastColumn="0" w:noHBand="0" w:noVBand="1"/>
+      </w:tblPr>
+      <w:tblGrid>
+        <w:gridCol w:w="2021"/>
+        <w:gridCol w:w="2065"/>
+        <w:gridCol w:w="1613"/>
+        <w:gridCol w:w="3645"/>
+      </w:tblGrid>
+      <w:tr>
+        <w:tc>
+          <w:tcPr>
+            <w:tcW w:w="2021" w:type="dxa"/>
+          </w:tcPr>
+          <w:p>
+            <w:pPr>
+              <w:jc w:val="both"/>
+              <w:rPr>
+                <w:lang w:val="en-US"/>
+              </w:rPr>
+            </w:pPr>
+            <w:r>
+              <w:t>Ячейка памяти</w:t>
+            </w:r>
+          </w:p>
+        </w:tc>
+        <w:tc>
+          <w:tcPr>
+            <w:tcW w:w="2065" w:type="dxa"/>
+          </w:tcPr>
+          <w:p>
+            <w:pPr>
+              <w:jc w:val="both"/>
+              <w:rPr>
+                <w:lang w:val="en-US"/>
+              </w:rPr>
+            </w:pPr>
+            <w:r>
+              <w:t>Код</w:t>
+            </w:r>
+            <w:r>
+              <w:rPr>
+                <w:lang w:val="en-US"/>
+              </w:rPr>
+              <w:t xml:space="preserve"> </w:t>
+            </w:r>
+            <w:r>
+              <w:t>команды</w:t>
+            </w:r>
+          </w:p>
+        </w:tc>
+        <w:tc>
+          <w:tcPr>
+            <w:tcW w:w="1613" w:type="dxa"/>
+          </w:tcPr>
+          <w:p>
+            <w:pPr>
+              <w:jc w:val="both"/>
+              <w:rPr>
+                <w:lang w:val="en-US"/>
+              </w:rPr>
+            </w:pPr>
+            <w:r>
+              <w:t>Мнемоника</w:t>
+            </w:r>
+          </w:p>
+        </w:tc>
+        <w:tc>
+          <w:tcPr>
+            <w:tcW w:w="3645" w:type="dxa"/>
+          </w:tcPr>
+          <w:p>
+            <w:pPr>
+              <w:jc w:val="both"/>
+              <w:rPr>
+                <w:lang w:val="en-US"/>
+              </w:rPr>
+            </w:pPr>
+            <w:r>
+              <w:t>Комментарии</w:t>
+            </w:r>
+          </w:p>
+        </w:tc>
+      </w:tr>
+      <w:tr>
+        <w:tc>
+          <w:tcPr>
+            <w:tcW w:w="2021" w:type="dxa"/>
+            <w:shd w:val="clear" w:color="auto" w:fill="92D050"/>
+          </w:tcPr>
+          <w:p>
+            <w:pPr>
+              <w:jc w:val="both"/>
+              <w:rPr>
+                <w:lang w:val="en-US"/>
+              </w:rPr>
+            </w:pPr>
+            <w:r>
+              <w:rPr>
+                <w:lang w:val="en-US"/>
+              </w:rPr>
+              <w:t>13A</w:t>
+            </w:r>
+          </w:p>
+        </w:tc>
+        <w:tc>
+          <w:tcPr>
+            <w:tcW w:w="2065" w:type="dxa"/>
+            <w:shd w:val="clear" w:color="auto" w:fill="92D050"/>
+          </w:tcPr>
+          <w:p>
+            <w:pPr>
+              <w:jc w:val="both"/>
+              <w:rPr>
+                <w:lang w:val="en-US"/>
+              </w:rPr>
+            </w:pPr>
+            <w:r>
+              <w:rPr>
+                <w:lang w:val="en-US"/>
+              </w:rPr>
+              <w:t>A144</w:t>
+            </w:r>
+          </w:p>
+        </w:tc>
+        <w:tc>
+          <w:tcPr>
+            <w:tcW w:w="1613" w:type="dxa"/>
+            <w:shd w:val="clear" w:color="auto" w:fill="92D050"/>
+          </w:tcPr>
+          <w:p>
+            <w:pPr>
+              <w:jc w:val="both"/>
+              <w:rPr>
+                <w:lang w:val="en-US"/>
+              </w:rPr>
+            </w:pPr>
+            <w:r>
+              <w:rPr>
+                <w:lang w:val="en-US"/>
+              </w:rPr>
+              <w:t>LD 144</w:t>
+            </w:r>
+          </w:p>
+        </w:tc>
+        <w:tc>
+          <w:tcPr>
+            <w:tcW w:w="3645" w:type="dxa"/>
+            <w:shd w:val="clear" w:color="auto" w:fill="92D050"/>
+          </w:tcPr>
+          <w:p>
+            <w:pPr>
+              <w:jc w:val="center"/>
+            </w:pPr>
+            <w:r>
+              <w:t>Загрузить содержимое ячейки 144 в аккумулятор</w:t>
+            </w:r>
+          </w:p>
+          <w:p>
+            <w:pPr>
+              <w:jc w:val="center"/>
+            </w:pPr>
+            <w:r>
+              <w:t xml:space="preserve">(144) </w:t>
+            </w:r>
+            <w:r>
+              <w:sym w:font="Symbol" w:char="F0DE"/>
+            </w:r>
+            <w:r>
+              <w:t xml:space="preserve"> </w:t>
+            </w:r>
+            <w:r>
+              <w:rPr>
+                <w:lang w:val="en-US"/>
+              </w:rPr>
+              <w:t>AC</w:t>
+            </w:r>
+          </w:p>
+        </w:tc>
+      </w:tr>
+      <w:tr>
+        <w:tc>
+          <w:tcPr>
+            <w:tcW w:w="2021" w:type="dxa"/>
+          </w:tcPr>
+          <w:p>
+            <w:pPr>
+              <w:jc w:val="both"/>
+              <w:rPr>
+                <w:lang w:val="en-US"/>
+              </w:rPr>
+            </w:pPr>
+            <w:r>
+              <w:t>13</w:t>
+            </w:r>
+            <w:r>
+              <w:rPr>
+                <w:lang w:val="en-US"/>
+              </w:rPr>
+              <w:t>B</w:t>
+            </w:r>
+          </w:p>
+        </w:tc>
+        <w:tc>
+          <w:tcPr>
+            <w:tcW w:w="2065" w:type="dxa"/>
+          </w:tcPr>
+          <w:p>
+            <w:pPr>
+              <w:jc w:val="both"/>
+            </w:pPr>
+            <w:r>
+              <w:rPr>
+                <w:lang w:val="en-US"/>
+              </w:rPr>
+              <w:t>2142</w:t>
+            </w:r>
+          </w:p>
+        </w:tc>
+        <w:tc>
+          <w:tcPr>
+            <w:tcW w:w="1613" w:type="dxa"/>
+          </w:tcPr>
+          <w:p>
+            <w:pPr>
+              <w:jc w:val="both"/>
+            </w:pPr>
+            <w:r>
+              <w:rPr>
+                <w:lang w:val="en-US"/>
+              </w:rPr>
+              <w:t>AND 142</w:t>
+            </w:r>
+          </w:p>
+        </w:tc>
+        <w:tc>
+          <w:tcPr>
+            <w:tcW w:w="3645" w:type="dxa"/>
+          </w:tcPr>
+          <w:p>
+            <w:pPr>
+              <w:jc w:val="center"/>
+            </w:pPr>
+            <w:r>
+              <w:t>Результат операции логического «И» ячейки памяти 142 с аккумулятором записать в аккумулятор</w:t>
+            </w:r>
+          </w:p>
+          <w:p>
+            <w:pPr>
+              <w:jc w:val="center"/>
+            </w:pPr>
+            <w:r>
+              <w:rPr>
+                <w:lang w:val="en-US"/>
+              </w:rPr>
+              <w:t>AC</w:t>
+            </w:r>
+            <w:r>
+              <w:t xml:space="preserve"> &amp; (142)</w:t>
+            </w:r>
+            <w:r>
+              <w:t xml:space="preserve"> </w:t>
+            </w:r>
+            <w:r>
+              <w:sym w:font="Symbol" w:char="F0DE"/>
+            </w:r>
+            <w:r>
+              <w:t xml:space="preserve"> </w:t>
+            </w:r>
+            <w:r>
+              <w:rPr>
+                <w:lang w:val="en-US"/>
+              </w:rPr>
+              <w:t>AC</w:t>
+            </w:r>
+          </w:p>
+        </w:tc>
+      </w:tr>
+      <w:tr>
+        <w:tc>
+          <w:tcPr>
+            <w:tcW w:w="2021" w:type="dxa"/>
+          </w:tcPr>
+          <w:p>
+            <w:pPr>
+              <w:jc w:val="both"/>
+              <w:rPr>
+                <w:lang w:val="en-US"/>
+              </w:rPr>
+            </w:pPr>
+            <w:r>
+              <w:rPr>
+                <w:lang w:val="en-US"/>
+              </w:rPr>
+              <w:t>13C</w:t>
+            </w:r>
+          </w:p>
+        </w:tc>
+        <w:tc>
+          <w:tcPr>
+            <w:tcW w:w="2065" w:type="dxa"/>
+          </w:tcPr>
+          <w:p>
+            <w:pPr>
+              <w:jc w:val="both"/>
+            </w:pPr>
+            <w:r>
+              <w:rPr>
+                <w:lang w:val="en-US"/>
+              </w:rPr>
+              <w:t>6145</w:t>
+            </w:r>
+          </w:p>
+        </w:tc>
+        <w:tc>
+          <w:tcPr>
+            <w:tcW w:w="1613" w:type="dxa"/>
+          </w:tcPr>
+          <w:p>
+            <w:pPr>
+              <w:jc w:val="both"/>
+            </w:pPr>
+            <w:r>
+              <w:rPr>
+                <w:lang w:val="en-US"/>
+              </w:rPr>
+              <w:t>SUB 145</w:t>
+            </w:r>
+          </w:p>
+        </w:tc>
+        <w:tc>
+          <w:tcPr>
+            <w:tcW w:w="3645" w:type="dxa"/>
+          </w:tcPr>
+          <w:p>
+            <w:pPr>
+              <w:jc w:val="center"/>
+            </w:pPr>
+            <w:r>
+              <w:t>Результат вычитания ячейки 145 из аккумулятора записать в аккумулятор</w:t>
+            </w:r>
+          </w:p>
+          <w:p>
+            <w:pPr>
+              <w:jc w:val="center"/>
+            </w:pPr>
+            <w:r>
+              <w:rPr>
+                <w:lang w:val="en-US"/>
+              </w:rPr>
+              <w:t xml:space="preserve">AC – (145) </w:t>
+            </w:r>
+            <w:r>
+              <w:sym w:font="Symbol" w:char="F0DE"/>
+            </w:r>
+            <w:r>
+              <w:rPr>
+                <w:lang w:val="en-US"/>
+              </w:rPr>
+              <w:t xml:space="preserve"> AC</w:t>
+            </w:r>
+          </w:p>
+        </w:tc>
+      </w:tr>
+      <w:tr>
+        <w:tc>
+          <w:tcPr>
+            <w:tcW w:w="2021" w:type="dxa"/>
+          </w:tcPr>
+          <w:p>
+            <w:pPr>
+              <w:jc w:val="both"/>
+              <w:rPr>
+                <w:lang w:val="en-US"/>
+              </w:rPr>
+            </w:pPr>
+            <w:r>
+              <w:rPr>
+                <w:lang w:val="en-US"/>
+              </w:rPr>
+              <w:t>13D</w:t>
+            </w:r>
+          </w:p>
+        </w:tc>
+        <w:tc>
+          <w:tcPr>
+            <w:tcW w:w="2065" w:type="dxa"/>
+          </w:tcPr>
+          <w:p>
+            <w:pPr>
+              <w:jc w:val="both"/>
+            </w:pPr>
+            <w:r>
+              <w:rPr>
+                <w:lang w:val="en-US"/>
+              </w:rPr>
+              <w:t>E143</w:t>
+            </w:r>
+          </w:p>
+        </w:tc>
+        <w:tc>
+          <w:tcPr>
+            <w:tcW w:w="1613" w:type="dxa"/>
+          </w:tcPr>
+          <w:p>
+            <w:pPr>
+              <w:jc w:val="both"/>
+            </w:pPr>
+            <w:r>
+              <w:rPr>
+                <w:lang w:val="en-US"/>
+              </w:rPr>
+              <w:t>ST 143</w:t>
+            </w:r>
+          </w:p>
+        </w:tc>
+        <w:tc>
+          <w:tcPr>
+            <w:tcW w:w="3645" w:type="dxa"/>
+          </w:tcPr>
+          <w:p>
+            <w:pPr>
+              <w:jc w:val="center"/>
+            </w:pPr>
+            <w:r>
+              <w:t>Загрузить содержимое аккумулятора в ячейку 1</w:t>
+            </w:r>
+            <w:r>
+              <w:t>43</w:t>
+            </w:r>
+          </w:p>
+          <w:p>
+            <w:pPr>
+              <w:jc w:val="center"/>
+            </w:pPr>
+            <w:r>
+              <w:rPr>
+                <w:lang w:val="en-US"/>
+              </w:rPr>
+              <w:t>AC</w:t>
+            </w:r>
+            <w:r>
+              <w:t xml:space="preserve"> </w:t>
+            </w:r>
+            <w:r>
+              <w:sym w:font="Symbol" w:char="F0DE"/>
+            </w:r>
+            <w:r>
+              <w:t xml:space="preserve"> </w:t>
+            </w:r>
+            <w:r>
+              <w:t>(</w:t>
+            </w:r>
+            <w:r>
+              <w:rPr>
+                <w:lang w:val="en-US"/>
+              </w:rPr>
+              <w:t>143</w:t>
+            </w:r>
+            <w:r>
+              <w:t>)</w:t>
+            </w:r>
+          </w:p>
+        </w:tc>
+      </w:tr>
+      <w:tr>
+        <w:tc>
+          <w:tcPr>
+            <w:tcW w:w="2021" w:type="dxa"/>
+            <w:shd w:val="clear" w:color="auto" w:fill="FFC000"/>
+          </w:tcPr>
+          <w:p>
+            <w:pPr>
+              <w:jc w:val="both"/>
+              <w:rPr>
+                <w:lang w:val="en-US"/>
+              </w:rPr>
+            </w:pPr>
+            <w:r>
+              <w:rPr>
+                <w:lang w:val="en-US"/>
+              </w:rPr>
+              <w:t>13E</w:t>
+            </w:r>
+          </w:p>
+        </w:tc>
+        <w:tc>
+          <w:tcPr>
+            <w:tcW w:w="2065" w:type="dxa"/>
+            <w:shd w:val="clear" w:color="auto" w:fill="FFC000"/>
+          </w:tcPr>
+          <w:p>
+            <w:pPr>
+              <w:jc w:val="both"/>
+            </w:pPr>
+            <w:r>
+              <w:rPr>
+                <w:lang w:val="en-US"/>
+              </w:rPr>
+              <w:t>0100</w:t>
+            </w:r>
+          </w:p>
+        </w:tc>
+        <w:tc>
+          <w:tcPr>
+            <w:tcW w:w="1613" w:type="dxa"/>
+            <w:shd w:val="clear" w:color="auto" w:fill="FFC000"/>
+          </w:tcPr>
+          <w:p>
+            <w:pPr>
+              <w:jc w:val="both"/>
+            </w:pPr>
+            <w:r>
+              <w:rPr>
+                <w:lang w:val="en-US"/>
+              </w:rPr>
+              <w:t>HLT</w:t>
+            </w:r>
+          </w:p>
+        </w:tc>
+        <w:tc>
+          <w:tcPr>
+            <w:tcW w:w="3645" w:type="dxa"/>
+            <w:shd w:val="clear" w:color="auto" w:fill="FFC000"/>
+          </w:tcPr>
+          <w:p>
+            <w:pPr>
+              <w:jc w:val="center"/>
+              <w:rPr>
+                <w:lang w:val="en-US"/>
+              </w:rPr>
+            </w:pPr>
+            <w:r>
+              <w:t>Остановка программы</w:t>
+            </w:r>
+          </w:p>
+        </w:tc>
+      </w:tr>
+      <w:tr>
+        <w:tc>
+          <w:tcPr>
+            <w:tcW w:w="2021" w:type="dxa"/>
+          </w:tcPr>
+          <w:p>
+            <w:pPr>
+              <w:jc w:val="both"/>
+              <w:rPr>
+                <w:lang w:val="en-US"/>
+              </w:rPr>
+            </w:pPr>
+            <w:r>
+              <w:rPr>
+                <w:lang w:val="en-US"/>
+              </w:rPr>
+              <w:t>142</w:t>
+            </w:r>
+          </w:p>
+        </w:tc>
+        <w:tc>
+          <w:tcPr>
+            <w:tcW w:w="2065" w:type="dxa"/>
+          </w:tcPr>
+          <w:p>
+            <w:pPr>
+              <w:jc w:val="both"/>
+              <w:rPr>
+                <w:lang w:val="en-US"/>
+              </w:rPr>
+            </w:pPr>
+            <w:r>
+              <w:rPr>
+                <w:lang w:val="en-US"/>
+              </w:rPr>
+              <w:t>E139</w:t>
+            </w:r>
+          </w:p>
+        </w:tc>
+        <w:tc>
+          <w:tcPr>
+            <w:tcW w:w="1613" w:type="dxa"/>
+          </w:tcPr>
+          <w:p>
+            <w:pPr>
+              <w:jc w:val="both"/>
+              <w:rPr>
+                <w:lang w:val="en-US"/>
+              </w:rPr>
+            </w:pPr>
+            <w:r>
+              <w:t>-</w:t>
+            </w:r>
+          </w:p>
+        </w:tc>
+        <w:tc>
+          <w:tcPr>
+            <w:tcW w:w="3645" w:type="dxa"/>
+          </w:tcPr>
+          <w:p>
+            <w:pPr>
+              <w:jc w:val="center"/>
+            </w:pPr>
+            <w:r>
+              <w:rPr>
+                <w:lang w:val="en-US"/>
+              </w:rPr>
+              <w:t>B</w:t>
+            </w:r>
+          </w:p>
+        </w:tc>
+      </w:tr>
+      <w:tr>
+        <w:tc>
+          <w:tcPr>
+            <w:tcW w:w="2021" w:type="dxa"/>
+          </w:tcPr>
+          <w:p>
+            <w:pPr>
+              <w:jc w:val="both"/>
+              <w:rPr>
+                <w:lang w:val="en-US"/>
+              </w:rPr>
+            </w:pPr>
+            <w:r>
+              <w:rPr>
+                <w:lang w:val="en-US"/>
+              </w:rPr>
+              <w:t>143</w:t>
+            </w:r>
+          </w:p>
+        </w:tc>
+        <w:tc>
+          <w:tcPr>
+            <w:tcW w:w="2065" w:type="dxa"/>
+          </w:tcPr>
+          <w:p>
+            <w:pPr>
+              <w:jc w:val="both"/>
+              <w:rPr>
+                <w:lang w:val="en-US"/>
+              </w:rPr>
+            </w:pPr>
+            <w:r>
+              <w:rPr>
+                <w:lang w:val="en-US"/>
+              </w:rPr>
+              <w:t>0200</w:t>
+            </w:r>
+          </w:p>
+        </w:tc>
+        <w:tc>
+          <w:tcPr>
+            <w:tcW w:w="1613" w:type="dxa"/>
+          </w:tcPr>
+          <w:p>
+            <w:pPr>
+              <w:jc w:val="both"/>
+            </w:pPr>
+            <w:r>
+              <w:t>-</w:t>
+            </w:r>
+          </w:p>
+        </w:tc>
+        <w:tc>
+          <w:tcPr>
+            <w:tcW w:w="3645" w:type="dxa"/>
+          </w:tcPr>
+          <w:p>
+            <w:pPr>
+              <w:jc w:val="center"/>
+              <w:rPr>
+                <w:lang w:val="en-US"/>
+              </w:rPr>
+            </w:pPr>
+            <w:r>
+              <w:rPr>
+                <w:lang w:val="en-US"/>
+              </w:rPr>
+              <w:t>R</w:t>
+            </w:r>
+          </w:p>
+        </w:tc>
+      </w:tr>
+      <w:tr>
+        <w:tc>
+          <w:tcPr>
+            <w:tcW w:w="2021" w:type="dxa"/>
+          </w:tcPr>
+          <w:p>
+            <w:pPr>
+              <w:jc w:val="both"/>
+              <w:rPr>
+                <w:lang w:val="en-US"/>
+              </w:rPr>
+            </w:pPr>
+            <w:r>
+              <w:rPr>
+                <w:lang w:val="en-US"/>
+              </w:rPr>
+              <w:t>144</w:t>
+            </w:r>
+          </w:p>
+        </w:tc>
+        <w:tc>
+          <w:tcPr>
+            <w:tcW w:w="2065" w:type="dxa"/>
+          </w:tcPr>
+          <w:p>
+            <w:pPr>
+              <w:jc w:val="both"/>
+              <w:rPr>
+                <w:lang w:val="en-US"/>
+              </w:rPr>
+            </w:pPr>
+            <w:r>
+              <w:rPr>
+                <w:lang w:val="en-US"/>
+              </w:rPr>
+              <w:t>E143</w:t>
+            </w:r>
+          </w:p>
+        </w:tc>
+        <w:tc>
+          <w:tcPr>
+            <w:tcW w:w="1613" w:type="dxa"/>
+          </w:tcPr>
+          <w:p>
+            <w:pPr>
+              <w:jc w:val="both"/>
+            </w:pPr>
+            <w:r>
+              <w:t>-</w:t>
+            </w:r>
+          </w:p>
+        </w:tc>
+        <w:tc>
+          <w:tcPr>
+            <w:tcW w:w="3645" w:type="dxa"/>
+          </w:tcPr>
+          <w:p>
+            <w:pPr>
+              <w:jc w:val="center"/>
+              <w:rPr>
+                <w:lang w:val="en-US"/>
+              </w:rPr>
+            </w:pPr>
+            <w:r>
+              <w:rPr>
+                <w:lang w:val="en-US"/>
+              </w:rPr>
+              <w:t>A</w:t>
+            </w:r>
+          </w:p>
+        </w:tc>
+      </w:tr>
+      <w:tr>
+        <w:tc>
+          <w:tcPr>
+            <w:tcW w:w="2021" w:type="dxa"/>
+          </w:tcPr>
+          <w:p>
+            <w:pPr>
+              <w:jc w:val="both"/>
+              <w:rPr>
+                <w:lang w:val="en-US"/>
+              </w:rPr>
+            </w:pPr>
+            <w:r>
+              <w:rPr>
+                <w:lang w:val="en-US"/>
+              </w:rPr>
+              <w:t>145</w:t>
+            </w:r>
+          </w:p>
+        </w:tc>
+        <w:tc>
+          <w:tcPr>
+            <w:tcW w:w="2065" w:type="dxa"/>
+          </w:tcPr>
+          <w:p>
+            <w:pPr>
+              <w:jc w:val="both"/>
+              <w:rPr>
+                <w:lang w:val="en-US"/>
+              </w:rPr>
+            </w:pPr>
+            <w:r>
+              <w:rPr>
+                <w:lang w:val="en-US"/>
+              </w:rPr>
+              <w:t>0200</w:t>
+            </w:r>
+          </w:p>
+        </w:tc>
+        <w:tc>
+          <w:tcPr>
+            <w:tcW w:w="1613" w:type="dxa"/>
+          </w:tcPr>
+          <w:p>
+            <w:pPr>
+              <w:jc w:val="both"/>
+            </w:pPr>
+            <w:r>
+              <w:t>-</w:t>
+            </w:r>
+          </w:p>
+        </w:tc>
+        <w:tc>
+          <w:tcPr>
+            <w:tcW w:w="3645" w:type="dxa"/>
+          </w:tcPr>
+          <w:p>
+            <w:pPr>
+              <w:jc w:val="center"/>
+              <w:rPr>
+                <w:lang w:val="en-US"/>
+              </w:rPr>
+            </w:pPr>
+            <w:r>
+              <w:rPr>
+                <w:lang w:val="en-US"/>
+              </w:rPr>
+              <w:t>D</w:t>
+            </w:r>
+          </w:p>
+        </w:tc>
+      </w:tr>
+    </w:tbl>
+    <w:p>
+      <w:pPr>
+        <w:jc w:val="both"/>
+      </w:pPr>
+    </w:p>
+    <w:p>
+      <w:pPr>
+        <w:jc w:val="both"/>
+      </w:pPr>
+    </w:p>
+    <w:p>
+      <w:pPr>
+        <w:jc w:val="both"/>
+        <w:rPr>
+          <w:b/>
+          <w:bCs/>
+        </w:rPr>
+      </w:pPr>
+    </w:p>
+    <w:p>
+      <w:pPr>
+        <w:jc w:val="both"/>
+        <w:rPr>
+          <w:b/>
+          <w:bCs/>
+        </w:rPr>
+      </w:pPr>
+    </w:p>
+    <w:p>
+      <w:pPr>
+        <w:jc w:val="both"/>
+        <w:rPr>
+          <w:b/>
+          <w:bCs/>
+        </w:rPr>
+      </w:pPr>
+    </w:p>
+    <w:p>
+      <w:pPr>
         <w:pStyle w:val="Heading1"/>
         <w:jc w:val="both"/>
         <w:rPr>
@@ -7646,14 +7924,16 @@
           <w:bCs/>
         </w:rPr>
       </w:pPr>
+      <w:bookmarkStart w:id="6" w:name="_Toc214023234"/>
       <w:r>
         <w:rPr>
           <w:b/>
           <w:bCs/>
         </w:rPr>
+        <w:lastRenderedPageBreak/>
         <w:t>Заключение</w:t>
       </w:r>
-      <w:bookmarkEnd w:id="2"/>
+      <w:bookmarkEnd w:id="6"/>
     </w:p>
     <w:p>
       <w:pPr>
@@ -7665,6 +7945,42 @@
       </w:r>
       <w:r>
         <w:t>время выполнения лабораторной работы я</w:t>
+      </w:r>
+      <w:r>
+        <w:t xml:space="preserve"> познакомился со структурой БЭВМ</w:t>
+      </w:r>
+      <w:r>
+        <w:t xml:space="preserve">, </w:t>
+      </w:r>
+      <w:r>
+        <w:t>узнал как она устроена</w:t>
+      </w:r>
+      <w:r>
+        <w:t xml:space="preserve">, </w:t>
+      </w:r>
+      <w:r>
+        <w:t>научился определять ОДЗ</w:t>
+      </w:r>
+      <w:r>
+        <w:t xml:space="preserve">, </w:t>
+      </w:r>
+      <w:r>
+        <w:t>узнал виды команд</w:t>
+      </w:r>
+      <w:r>
+        <w:t>,</w:t>
+      </w:r>
+      <w:r>
+        <w:t xml:space="preserve"> а также</w:t>
+      </w:r>
+      <w:r>
+        <w:t xml:space="preserve">, </w:t>
+      </w:r>
+      <w:r>
+        <w:t>то как устроены данные в памяти БЭВМ</w:t>
+      </w:r>
+      <w:r>
+        <w:t>.</w:t>
       </w:r>
     </w:p>
     <w:p/>
@@ -7698,12 +8014,13 @@
           <w:bCs/>
         </w:rPr>
       </w:pPr>
-      <w:bookmarkStart w:id="3" w:name="_Toc209088595"/>
+      <w:bookmarkStart w:id="7" w:name="_Toc214023235"/>
       <w:r>
         <w:rPr>
           <w:b/>
           <w:bCs/>
         </w:rPr>
+        <w:lastRenderedPageBreak/>
         <w:t xml:space="preserve">Список </w:t>
       </w:r>
       <w:r>
@@ -7713,79 +8030,113 @@
         </w:rPr>
         <w:t>источников</w:t>
       </w:r>
-      <w:bookmarkEnd w:id="3"/>
-    </w:p>
-    <w:p>
-      <w:r>
-        <w:t xml:space="preserve">1. </w:t>
-      </w:r>
-      <w:r>
-        <w:t xml:space="preserve">Орлов С. А., </w:t>
-      </w:r>
-      <w:proofErr w:type="spellStart"/>
-      <w:r>
-        <w:t>Цилькер</w:t>
-      </w:r>
-      <w:proofErr w:type="spellEnd"/>
-      <w:r>
-        <w:t xml:space="preserve"> Б. Я.</w:t>
-      </w:r>
-      <w:r>
-        <w:br/>
-      </w:r>
-      <w:r>
-        <w:rPr>
-          <w:b/>
-          <w:bCs/>
-        </w:rPr>
-        <w:t>Организация ЭВМ и систем: учебник для вузов</w:t>
-      </w:r>
-      <w:r>
-        <w:t xml:space="preserve">. – 2-е изд. – СПб.: Питер, 2011. – 688 с.: ил. – Режим доступа: </w:t>
-      </w:r>
-      <w:hyperlink r:id="rId13" w:tgtFrame="_new" w:history="1">
+      <w:bookmarkEnd w:id="7"/>
+    </w:p>
+    <w:p>
+      <w:pPr>
+        <w:pStyle w:val="ListParagraph"/>
+        <w:numPr>
+          <w:ilvl w:val="0"/>
+          <w:numId w:val="6"/>
+        </w:numPr>
+        <w:rPr>
+          <w:lang w:val="en-RU"/>
+        </w:rPr>
+      </w:pPr>
+      <w:r>
+        <w:rPr>
+          <w:lang w:val="en-RU"/>
+        </w:rPr>
+        <w:t>Кириллов В. В., Приблуда А. А., Клименков С. В., Афанасьев Д. Б.</w:t>
+      </w:r>
+    </w:p>
+    <w:p>
+      <w:pPr>
+        <w:rPr>
+          <w:lang w:val="en-RU"/>
+        </w:rPr>
+      </w:pPr>
+      <w:r>
+        <w:rPr>
+          <w:lang w:val="en-RU"/>
+        </w:rPr>
+        <w:t xml:space="preserve">Методические указания к лабораторным работам по курсу «Основы профессиональной деятельности» / В. В. Кириллов, А. А. Приблуда, С. В. Клименков, Д. Б. Афанасьев. — Санкт-Петербург, 2019. — Версия 1.41. — Электронный ресурс. — Режим доступа: </w:t>
+      </w:r>
+      <w:hyperlink r:id="rId13" w:history="1">
         <w:r>
           <w:rPr>
             <w:rStyle w:val="Hyperlink"/>
+            <w:lang w:val="en-RU"/>
           </w:rPr>
-          <w:t>http://www.nicevt.ru/wp-content/uploads/2019/10/2.-%D0%A6%D0%B8%D0%BB%D1%8C%D0%BA%D0%B5%D1%80-%D0%91.%D0%AF.-%D0%9E%D1%80%D0%BB%D0%BE%D0%B2-%D0%A1.%D0%90.-%D0%9E%D1%80%D0%B3%D0%B0%D0%BD%D0%B8%D0%B7%D0%B0%D1%86%D0%B8%D1%8F-%D0%AD%D0%92%D0%9C-%D0%B8-%D1%81%D0%B8%D1%81%D1%82%D0%B5%D0%BC-%D0%A1%D0%9F%D0%91-%D0%9F%D0%B8%D1%82%D0%B5%D1%80-2011.pdf</w:t>
+          <w:t>https://se.ifmo.ru/documents/10180/38002/%D0%9C%D0%B5%D1%82%D0%BE%D0%B4%D0%B8%D1%87%D0%B5%D1%81%D0%BA%D0%B8%D0%B5+%D1%83%D0%BA%D0%B0%D0%B7%D0%B0%D0%BD%D0%B8%D1%8F+%D0%BA+%D0%B2%D1%8B%D0%BF%D0%BE%D0%BB%D0%BD%D0%B5%D0%BD%D0%B8%D1%8E+%D0%BB%D0%B0%D0%B1%D0%BE</w:t>
         </w:r>
       </w:hyperlink>
       <w:r>
-        <w:t xml:space="preserve"> (дата обращения: 13.09.2025).</w:t>
-      </w:r>
-    </w:p>
-    <w:p>
-      <w:r>
-        <w:t xml:space="preserve">2. </w:t>
-      </w:r>
-      <w:r>
-        <w:t>Алексеев Е. Г., Богатырев С. Д.</w:t>
-      </w:r>
-      <w:r>
-        <w:br/>
-      </w:r>
-      <w:r>
-        <w:rPr>
-          <w:b/>
-          <w:bCs/>
-        </w:rPr>
-        <w:t>Информатика. Мультимедийный электронный учебник</w:t>
-      </w:r>
-      <w:r>
-        <w:t xml:space="preserve"> [Электронный ресурс]. – Режим доступа: </w:t>
-      </w:r>
-      <w:hyperlink r:id="rId14" w:tgtFrame="_new" w:history="1">
+        <w:rPr>
+          <w:lang w:val="en-RU"/>
+        </w:rPr>
+        <w:t>(дата обращения: 04.10.2025).</w:t>
+      </w:r>
+    </w:p>
+    <w:p>
+      <w:pPr>
+        <w:rPr>
+          <w:lang w:val="en-RU"/>
+        </w:rPr>
+      </w:pPr>
+    </w:p>
+    <w:p>
+      <w:pPr>
+        <w:pStyle w:val="ListParagraph"/>
+        <w:numPr>
+          <w:ilvl w:val="0"/>
+          <w:numId w:val="6"/>
+        </w:numPr>
+        <w:rPr>
+          <w:lang w:val="en-RU"/>
+        </w:rPr>
+      </w:pPr>
+      <w:r>
+        <w:rPr>
+          <w:lang w:val="en-RU"/>
+        </w:rPr>
+        <w:t>Клименков С. В.</w:t>
+      </w:r>
+    </w:p>
+    <w:p>
+      <w:pPr>
+        <w:rPr>
+          <w:lang w:val="en-RU"/>
+        </w:rPr>
+      </w:pPr>
+      <w:r>
+        <w:rPr>
+          <w:lang w:val="en-RU"/>
+        </w:rPr>
+        <w:t xml:space="preserve">Основы профессиональной деятельности. Часть первая. Презентация. — 2018–2019 уч. год. — v. 1.45.09 от 31.05.2022. — Электронный ресурс. — 98 с. — Режим доступа: </w:t>
+      </w:r>
+      <w:hyperlink r:id="rId14" w:history="1">
         <w:r>
           <w:rPr>
             <w:rStyle w:val="Hyperlink"/>
+            <w:lang w:val="en-RU"/>
           </w:rPr>
-          <w:t>http://inf.ealekseev.ru/text/toc.html</w:t>
+          <w:t>https://se.ifmo.ru/documents/10180/640663/%D0%9F%D1%80%D0%B5%D0%B7%D0%B5%D0%BD%D1%82%D0%B0%D1%86%D0%B8%D1%8F+%D0%BB%D0%B5%D0%BA%D1%86%D0%B8%D0%B9+2019+%D1%87%D0%B0%D1%81%D1%82%D1%8C+1.pdf/78199c82-17be-49a1-970d-f81f69fa983e</w:t>
         </w:r>
       </w:hyperlink>
       <w:r>
-        <w:t xml:space="preserve"> (дата обращения: 13.09.2025).</w:t>
-      </w:r>
+        <w:rPr>
+          <w:lang w:val="en-RU"/>
+        </w:rPr>
+        <w:t xml:space="preserve"> (дата обращения: 04.10.2025).</w:t>
+      </w:r>
+    </w:p>
+    <w:p>
+      <w:pPr>
+        <w:rPr>
+          <w:lang w:val="en-RU"/>
+        </w:rPr>
+      </w:pPr>
     </w:p>
     <w:p/>
     <w:sectPr>
@@ -7979,6 +8330,95 @@
     </w:lvl>
   </w:abstractNum>
   <w:abstractNum w:abstractNumId="1" w15:restartNumberingAfterBreak="0">
+    <w:nsid w:val="33126A5D"/>
+    <w:multiLevelType w:val="hybridMultilevel"/>
+    <w:tmpl w:val="8E6C4EE4"/>
+    <w:lvl w:ilvl="0" w:tplc="0809000F">
+      <w:start w:val="1"/>
+      <w:numFmt w:val="decimal"/>
+      <w:lvlText w:val="%1."/>
+      <w:lvlJc w:val="left"/>
+      <w:pPr>
+        <w:ind w:left="720" w:hanging="360"/>
+      </w:pPr>
+      <w:rPr>
+        <w:rFonts w:hint="default"/>
+      </w:rPr>
+    </w:lvl>
+    <w:lvl w:ilvl="1" w:tplc="08090019" w:tentative="1">
+      <w:start w:val="1"/>
+      <w:numFmt w:val="lowerLetter"/>
+      <w:lvlText w:val="%2."/>
+      <w:lvlJc w:val="left"/>
+      <w:pPr>
+        <w:ind w:left="1440" w:hanging="360"/>
+      </w:pPr>
+    </w:lvl>
+    <w:lvl w:ilvl="2" w:tplc="0809001B" w:tentative="1">
+      <w:start w:val="1"/>
+      <w:numFmt w:val="lowerRoman"/>
+      <w:lvlText w:val="%3."/>
+      <w:lvlJc w:val="right"/>
+      <w:pPr>
+        <w:ind w:left="2160" w:hanging="180"/>
+      </w:pPr>
+    </w:lvl>
+    <w:lvl w:ilvl="3" w:tplc="0809000F" w:tentative="1">
+      <w:start w:val="1"/>
+      <w:numFmt w:val="decimal"/>
+      <w:lvlText w:val="%4."/>
+      <w:lvlJc w:val="left"/>
+      <w:pPr>
+        <w:ind w:left="2880" w:hanging="360"/>
+      </w:pPr>
+    </w:lvl>
+    <w:lvl w:ilvl="4" w:tplc="08090019" w:tentative="1">
+      <w:start w:val="1"/>
+      <w:numFmt w:val="lowerLetter"/>
+      <w:lvlText w:val="%5."/>
+      <w:lvlJc w:val="left"/>
+      <w:pPr>
+        <w:ind w:left="3600" w:hanging="360"/>
+      </w:pPr>
+    </w:lvl>
+    <w:lvl w:ilvl="5" w:tplc="0809001B" w:tentative="1">
+      <w:start w:val="1"/>
+      <w:numFmt w:val="lowerRoman"/>
+      <w:lvlText w:val="%6."/>
+      <w:lvlJc w:val="right"/>
+      <w:pPr>
+        <w:ind w:left="4320" w:hanging="180"/>
+      </w:pPr>
+    </w:lvl>
+    <w:lvl w:ilvl="6" w:tplc="0809000F" w:tentative="1">
+      <w:start w:val="1"/>
+      <w:numFmt w:val="decimal"/>
+      <w:lvlText w:val="%7."/>
+      <w:lvlJc w:val="left"/>
+      <w:pPr>
+        <w:ind w:left="5040" w:hanging="360"/>
+      </w:pPr>
+    </w:lvl>
+    <w:lvl w:ilvl="7" w:tplc="08090019" w:tentative="1">
+      <w:start w:val="1"/>
+      <w:numFmt w:val="lowerLetter"/>
+      <w:lvlText w:val="%8."/>
+      <w:lvlJc w:val="left"/>
+      <w:pPr>
+        <w:ind w:left="5760" w:hanging="360"/>
+      </w:pPr>
+    </w:lvl>
+    <w:lvl w:ilvl="8" w:tplc="0809001B" w:tentative="1">
+      <w:start w:val="1"/>
+      <w:numFmt w:val="lowerRoman"/>
+      <w:lvlText w:val="%9."/>
+      <w:lvlJc w:val="right"/>
+      <w:pPr>
+        <w:ind w:left="6480" w:hanging="180"/>
+      </w:pPr>
+    </w:lvl>
+  </w:abstractNum>
+  <w:abstractNum w:abstractNumId="2" w15:restartNumberingAfterBreak="0">
     <w:nsid w:val="549A720B"/>
     <w:multiLevelType w:val="hybridMultilevel"/>
     <w:tmpl w:val="71843932"/>
@@ -8067,7 +8507,7 @@
       </w:pPr>
     </w:lvl>
   </w:abstractNum>
-  <w:abstractNum w:abstractNumId="2" w15:restartNumberingAfterBreak="0">
+  <w:abstractNum w:abstractNumId="3" w15:restartNumberingAfterBreak="0">
     <w:nsid w:val="68485FBB"/>
     <w:multiLevelType w:val="hybridMultilevel"/>
     <w:tmpl w:val="BFD498BE"/>
@@ -8156,7 +8596,7 @@
       </w:pPr>
     </w:lvl>
   </w:abstractNum>
-  <w:abstractNum w:abstractNumId="3" w15:restartNumberingAfterBreak="0">
+  <w:abstractNum w:abstractNumId="4" w15:restartNumberingAfterBreak="0">
     <w:nsid w:val="70943128"/>
     <w:multiLevelType w:val="hybridMultilevel"/>
     <w:tmpl w:val="45A0603E"/>
@@ -8245,7 +8685,7 @@
       </w:pPr>
     </w:lvl>
   </w:abstractNum>
-  <w:abstractNum w:abstractNumId="4" w15:restartNumberingAfterBreak="0">
+  <w:abstractNum w:abstractNumId="5" w15:restartNumberingAfterBreak="0">
     <w:nsid w:val="733C0BE0"/>
     <w:multiLevelType w:val="hybridMultilevel"/>
     <w:tmpl w:val="95186468"/>
@@ -8332,19 +8772,22 @@
     </w:lvl>
   </w:abstractNum>
   <w:num w:numId="1" w16cid:durableId="1067338956">
+    <w:abstractNumId w:val="5"/>
+  </w:num>
+  <w:num w:numId="2" w16cid:durableId="590284260">
+    <w:abstractNumId w:val="2"/>
+  </w:num>
+  <w:num w:numId="3" w16cid:durableId="294259356">
     <w:abstractNumId w:val="4"/>
   </w:num>
-  <w:num w:numId="2" w16cid:durableId="590284260">
-    <w:abstractNumId w:val="1"/>
-  </w:num>
-  <w:num w:numId="3" w16cid:durableId="294259356">
+  <w:num w:numId="4" w16cid:durableId="170342946">
     <w:abstractNumId w:val="3"/>
-  </w:num>
-  <w:num w:numId="4" w16cid:durableId="170342946">
-    <w:abstractNumId w:val="2"/>
   </w:num>
   <w:num w:numId="5" w16cid:durableId="483355893">
     <w:abstractNumId w:val="0"/>
+  </w:num>
+  <w:num w:numId="6" w16cid:durableId="1692028487">
+    <w:abstractNumId w:val="1"/>
   </w:num>
 </w:numbering>
 </file>

</xml_diff>

<commit_message>
FOPA lab2: report defended & additional task completed
</commit_message>
<xml_diff>
--- a/fopa/lab2/report.docx
+++ b/fopa/lab2/report.docx
@@ -312,7 +312,7 @@
           <w:r>
             <w:fldChar w:fldCharType="separate"/>
           </w:r>
-          <w:hyperlink w:anchor="_Toc214023228" w:history="1">
+          <w:hyperlink w:anchor="_Toc214222703" w:history="1">
             <w:r>
               <w:rPr>
                 <w:rStyle w:val="Hyperlink"/>
@@ -341,7 +341,7 @@
                 <w:noProof/>
                 <w:webHidden/>
               </w:rPr>
-              <w:instrText xml:space="preserve"> PAGEREF _Toc214023228 \h </w:instrText>
+              <w:instrText xml:space="preserve"> PAGEREF _Toc214222703 \h </w:instrText>
             </w:r>
             <w:r>
               <w:rPr>
@@ -385,7 +385,7 @@
               <w:lang w:val="en-RU" w:eastAsia="en-GB"/>
             </w:rPr>
           </w:pPr>
-          <w:hyperlink w:anchor="_Toc214023229" w:history="1">
+          <w:hyperlink w:anchor="_Toc214222704" w:history="1">
             <w:r>
               <w:rPr>
                 <w:rStyle w:val="Hyperlink"/>
@@ -414,7 +414,7 @@
                 <w:noProof/>
                 <w:webHidden/>
               </w:rPr>
-              <w:instrText xml:space="preserve"> PAGEREF _Toc214023229 \h </w:instrText>
+              <w:instrText xml:space="preserve"> PAGEREF _Toc214222704 \h </w:instrText>
             </w:r>
             <w:r>
               <w:rPr>
@@ -458,7 +458,7 @@
               <w:lang w:val="en-RU" w:eastAsia="en-GB"/>
             </w:rPr>
           </w:pPr>
-          <w:hyperlink w:anchor="_Toc214023230" w:history="1">
+          <w:hyperlink w:anchor="_Toc214222705" w:history="1">
             <w:r>
               <w:rPr>
                 <w:rStyle w:val="Hyperlink"/>
@@ -485,7 +485,7 @@
                 <w:noProof/>
                 <w:webHidden/>
               </w:rPr>
-              <w:instrText xml:space="preserve"> PAGEREF _Toc214023230 \h </w:instrText>
+              <w:instrText xml:space="preserve"> PAGEREF _Toc214222705 \h </w:instrText>
             </w:r>
             <w:r>
               <w:rPr>
@@ -529,7 +529,7 @@
               <w:lang w:val="en-RU" w:eastAsia="en-GB"/>
             </w:rPr>
           </w:pPr>
-          <w:hyperlink w:anchor="_Toc214023231" w:history="1">
+          <w:hyperlink w:anchor="_Toc214222706" w:history="1">
             <w:r>
               <w:rPr>
                 <w:rStyle w:val="Hyperlink"/>
@@ -556,7 +556,7 @@
                 <w:noProof/>
                 <w:webHidden/>
               </w:rPr>
-              <w:instrText xml:space="preserve"> PAGEREF _Toc214023231 \h </w:instrText>
+              <w:instrText xml:space="preserve"> PAGEREF _Toc214222706 \h </w:instrText>
             </w:r>
             <w:r>
               <w:rPr>
@@ -600,7 +600,7 @@
               <w:lang w:val="en-RU" w:eastAsia="en-GB"/>
             </w:rPr>
           </w:pPr>
-          <w:hyperlink w:anchor="_Toc214023232" w:history="1">
+          <w:hyperlink w:anchor="_Toc214222707" w:history="1">
             <w:r>
               <w:rPr>
                 <w:rStyle w:val="Hyperlink"/>
@@ -627,7 +627,7 @@
                 <w:noProof/>
                 <w:webHidden/>
               </w:rPr>
-              <w:instrText xml:space="preserve"> PAGEREF _Toc214023232 \h </w:instrText>
+              <w:instrText xml:space="preserve"> PAGEREF _Toc214222707 \h </w:instrText>
             </w:r>
             <w:r>
               <w:rPr>
@@ -671,7 +671,7 @@
               <w:lang w:val="en-RU" w:eastAsia="en-GB"/>
             </w:rPr>
           </w:pPr>
-          <w:hyperlink w:anchor="_Toc214023233" w:history="1">
+          <w:hyperlink w:anchor="_Toc214222708" w:history="1">
             <w:r>
               <w:rPr>
                 <w:rStyle w:val="Hyperlink"/>
@@ -698,7 +698,7 @@
                 <w:noProof/>
                 <w:webHidden/>
               </w:rPr>
-              <w:instrText xml:space="preserve"> PAGEREF _Toc214023233 \h </w:instrText>
+              <w:instrText xml:space="preserve"> PAGEREF _Toc214222708 \h </w:instrText>
             </w:r>
             <w:r>
               <w:rPr>
@@ -742,15 +742,13 @@
               <w:lang w:val="en-RU" w:eastAsia="en-GB"/>
             </w:rPr>
           </w:pPr>
-          <w:hyperlink w:anchor="_Toc214023234" w:history="1">
+          <w:hyperlink w:anchor="_Toc214222709" w:history="1">
             <w:r>
               <w:rPr>
                 <w:rStyle w:val="Hyperlink"/>
-                <w:b/>
-                <w:bCs/>
                 <w:noProof/>
               </w:rPr>
-              <w:t>Заключение</w:t>
+              <w:t>Дополнительное задание</w:t>
             </w:r>
             <w:r>
               <w:rPr>
@@ -771,7 +769,7 @@
                 <w:noProof/>
                 <w:webHidden/>
               </w:rPr>
-              <w:instrText xml:space="preserve"> PAGEREF _Toc214023234 \h </w:instrText>
+              <w:instrText xml:space="preserve"> PAGEREF _Toc214222709 \h </w:instrText>
             </w:r>
             <w:r>
               <w:rPr>
@@ -815,7 +813,7 @@
               <w:lang w:val="en-RU" w:eastAsia="en-GB"/>
             </w:rPr>
           </w:pPr>
-          <w:hyperlink w:anchor="_Toc214023235" w:history="1">
+          <w:hyperlink w:anchor="_Toc214222710" w:history="1">
             <w:r>
               <w:rPr>
                 <w:rStyle w:val="Hyperlink"/>
@@ -823,7 +821,7 @@
                 <w:bCs/>
                 <w:noProof/>
               </w:rPr>
-              <w:t>Список источников</w:t>
+              <w:t>Заключение</w:t>
             </w:r>
             <w:r>
               <w:rPr>
@@ -844,7 +842,7 @@
                 <w:noProof/>
                 <w:webHidden/>
               </w:rPr>
-              <w:instrText xml:space="preserve"> PAGEREF _Toc214023235 \h </w:instrText>
+              <w:instrText xml:space="preserve"> PAGEREF _Toc214222710 \h </w:instrText>
             </w:r>
             <w:r>
               <w:rPr>
@@ -865,6 +863,79 @@
                 <w:webHidden/>
               </w:rPr>
               <w:t>11</w:t>
+            </w:r>
+            <w:r>
+              <w:rPr>
+                <w:noProof/>
+                <w:webHidden/>
+              </w:rPr>
+              <w:fldChar w:fldCharType="end"/>
+            </w:r>
+          </w:hyperlink>
+        </w:p>
+        <w:p>
+          <w:pPr>
+            <w:pStyle w:val="TOC1"/>
+            <w:tabs>
+              <w:tab w:val="right" w:leader="dot" w:pos="9344"/>
+            </w:tabs>
+            <w:rPr>
+              <w:rFonts w:asciiTheme="minorHAnsi" w:eastAsiaTheme="minorEastAsia" w:hAnsiTheme="minorHAnsi"/>
+              <w:noProof/>
+              <w:sz w:val="24"/>
+              <w:lang w:val="en-RU" w:eastAsia="en-GB"/>
+            </w:rPr>
+          </w:pPr>
+          <w:hyperlink w:anchor="_Toc214222711" w:history="1">
+            <w:r>
+              <w:rPr>
+                <w:rStyle w:val="Hyperlink"/>
+                <w:b/>
+                <w:bCs/>
+                <w:noProof/>
+              </w:rPr>
+              <w:t>Список источников</w:t>
+            </w:r>
+            <w:r>
+              <w:rPr>
+                <w:noProof/>
+                <w:webHidden/>
+              </w:rPr>
+              <w:tab/>
+            </w:r>
+            <w:r>
+              <w:rPr>
+                <w:noProof/>
+                <w:webHidden/>
+              </w:rPr>
+              <w:fldChar w:fldCharType="begin"/>
+            </w:r>
+            <w:r>
+              <w:rPr>
+                <w:noProof/>
+                <w:webHidden/>
+              </w:rPr>
+              <w:instrText xml:space="preserve"> PAGEREF _Toc214222711 \h </w:instrText>
+            </w:r>
+            <w:r>
+              <w:rPr>
+                <w:noProof/>
+                <w:webHidden/>
+              </w:rPr>
+            </w:r>
+            <w:r>
+              <w:rPr>
+                <w:noProof/>
+                <w:webHidden/>
+              </w:rPr>
+              <w:fldChar w:fldCharType="separate"/>
+            </w:r>
+            <w:r>
+              <w:rPr>
+                <w:noProof/>
+                <w:webHidden/>
+              </w:rPr>
+              <w:t>12</w:t>
             </w:r>
             <w:r>
               <w:rPr>
@@ -886,6 +957,13 @@
         </w:p>
       </w:sdtContent>
     </w:sdt>
+    <w:p>
+      <w:pPr>
+        <w:rPr>
+          <w:lang w:val="en-US"/>
+        </w:rPr>
+      </w:pPr>
+    </w:p>
     <w:p/>
     <w:p/>
     <w:p/>
@@ -893,35 +971,21 @@
     <w:p/>
     <w:p/>
     <w:p/>
+    <w:p>
+      <w:pPr>
+        <w:rPr>
+          <w:lang w:val="en-US"/>
+        </w:rPr>
+      </w:pPr>
+    </w:p>
+    <w:p>
+      <w:pPr>
+        <w:rPr>
+          <w:lang w:val="en-US"/>
+        </w:rPr>
+      </w:pPr>
+    </w:p>
     <w:p/>
-    <w:p>
-      <w:pPr>
-        <w:rPr>
-          <w:lang w:val="en-US"/>
-        </w:rPr>
-      </w:pPr>
-    </w:p>
-    <w:p>
-      <w:pPr>
-        <w:rPr>
-          <w:lang w:val="en-US"/>
-        </w:rPr>
-      </w:pPr>
-    </w:p>
-    <w:p>
-      <w:pPr>
-        <w:rPr>
-          <w:lang w:val="en-US"/>
-        </w:rPr>
-      </w:pPr>
-    </w:p>
-    <w:p>
-      <w:pPr>
-        <w:rPr>
-          <w:lang w:val="en-US"/>
-        </w:rPr>
-      </w:pPr>
-    </w:p>
     <w:p>
       <w:pPr>
         <w:pStyle w:val="Heading1"/>
@@ -932,7 +996,7 @@
           <w:lang w:val="en-US"/>
         </w:rPr>
       </w:pPr>
-      <w:bookmarkStart w:id="0" w:name="_Toc214023228"/>
+      <w:bookmarkStart w:id="0" w:name="_Toc214222703"/>
       <w:r>
         <w:rPr>
           <w:b/>
@@ -1027,38 +1091,32 @@
     <w:p>
       <w:pPr>
         <w:jc w:val="both"/>
-        <w:rPr>
-          <w:lang w:val="en-US"/>
-        </w:rPr>
       </w:pPr>
     </w:p>
     <w:p>
       <w:pPr>
         <w:jc w:val="both"/>
-        <w:rPr>
-          <w:lang w:val="en-US"/>
-        </w:rPr>
       </w:pPr>
     </w:p>
     <w:p>
       <w:pPr>
         <w:jc w:val="both"/>
-        <w:rPr>
-          <w:lang w:val="en-US"/>
-        </w:rPr>
-      </w:pPr>
-      <w:r>
-        <w:tab/>
-      </w:r>
+      </w:pPr>
     </w:p>
     <w:p>
       <w:pPr>
         <w:jc w:val="both"/>
+        <w:rPr>
+          <w:lang w:val="en-US"/>
+        </w:rPr>
       </w:pPr>
     </w:p>
     <w:p>
       <w:pPr>
         <w:jc w:val="both"/>
+        <w:rPr>
+          <w:lang w:val="en-US"/>
+        </w:rPr>
       </w:pPr>
     </w:p>
     <w:p>
@@ -1070,7 +1128,7 @@
           <w:bCs/>
         </w:rPr>
       </w:pPr>
-      <w:bookmarkStart w:id="1" w:name="_Toc214023229"/>
+      <w:bookmarkStart w:id="1" w:name="_Toc214222704"/>
       <w:r>
         <w:rPr>
           <w:b/>
@@ -1093,7 +1151,7 @@
         <w:pStyle w:val="Heading2"/>
         <w:jc w:val="center"/>
       </w:pPr>
-      <w:bookmarkStart w:id="2" w:name="_Toc214023230"/>
+      <w:bookmarkStart w:id="2" w:name="_Toc214222705"/>
       <w:r>
         <w:t>Текст исходной программы</w:t>
       </w:r>
@@ -2353,7 +2411,7 @@
         <w:pStyle w:val="Heading2"/>
         <w:jc w:val="center"/>
       </w:pPr>
-      <w:bookmarkStart w:id="3" w:name="_Toc214023231"/>
+      <w:bookmarkStart w:id="3" w:name="_Toc214222706"/>
       <w:r>
         <w:lastRenderedPageBreak/>
         <w:t>Описание программы</w:t>
@@ -2787,7 +2845,7 @@
           <w:szCs w:val="28"/>
         </w:rPr>
         <w:drawing>
-          <wp:inline distT="0" distB="0" distL="0" distR="0" wp14:anchorId="51AFD355" wp14:editId="35144A3F">
+          <wp:inline distT="0" distB="0" distL="0" distR="0" wp14:anchorId="51AFD355" wp14:editId="714B5929">
             <wp:extent cx="5939790" cy="1408430"/>
             <wp:effectExtent l="0" t="0" r="3810" b="1270"/>
             <wp:docPr id="1771665743" name="Picture 1" descr="A close-up of a gauge&#10;&#10;AI-generated content may be incorrect."/>
@@ -2878,7 +2936,7 @@
         <w:rPr>
           <w:lang w:val="en-US"/>
         </w:rPr>
-        <w:t>-2</w:t>
+        <w:t>2</w:t>
       </w:r>
       <w:r>
         <w:rPr>
@@ -2891,7 +2949,13 @@
         <w:rPr>
           <w:lang w:val="en-US"/>
         </w:rPr>
-        <w:t xml:space="preserve">≤ </w:t>
+        <w:t>≥</w:t>
+      </w:r>
+      <w:r>
+        <w:rPr>
+          <w:lang w:val="en-US"/>
+        </w:rPr>
+        <w:t xml:space="preserve"> </w:t>
       </w:r>
       <w:r>
         <w:rPr>
@@ -2903,7 +2967,31 @@
         <w:rPr>
           <w:lang w:val="en-US"/>
         </w:rPr>
-        <w:t xml:space="preserve"> ≤ 2</w:t>
+        <w:t xml:space="preserve"> </w:t>
+      </w:r>
+      <w:r>
+        <w:rPr>
+          <w:lang w:val="en-US"/>
+        </w:rPr>
+        <w:t>≥</w:t>
+      </w:r>
+      <w:r>
+        <w:rPr>
+          <w:lang w:val="en-US"/>
+        </w:rPr>
+        <w:t xml:space="preserve"> </w:t>
+      </w:r>
+      <w:r>
+        <w:rPr>
+          <w:lang w:val="en-US"/>
+        </w:rPr>
+        <w:t>-</w:t>
+      </w:r>
+      <w:r>
+        <w:rPr>
+          <w:lang w:val="en-US"/>
+        </w:rPr>
+        <w:t>2</w:t>
       </w:r>
       <w:r>
         <w:rPr>
@@ -2916,7 +3004,7 @@
         <w:rPr>
           <w:lang w:val="en-US"/>
         </w:rPr>
-        <w:t>–</w:t>
+        <w:t>+</w:t>
       </w:r>
       <w:r>
         <w:rPr>
@@ -3236,7 +3324,21 @@
           <w:szCs w:val="28"/>
           <w:lang w:val="en-US"/>
         </w:rPr>
-        <w:t xml:space="preserve"> ≤ D ≤ </w:t>
+        <w:t xml:space="preserve"> ≤ </w:t>
+      </w:r>
+      <w:r>
+        <w:rPr>
+          <w:szCs w:val="28"/>
+          <w:lang w:val="en-US"/>
+        </w:rPr>
+        <w:t>-</w:t>
+      </w:r>
+      <w:r>
+        <w:rPr>
+          <w:szCs w:val="28"/>
+          <w:lang w:val="en-US"/>
+        </w:rPr>
+        <w:t xml:space="preserve">D ≤ </w:t>
       </w:r>
       <w:r>
         <w:rPr>
@@ -3442,6 +3544,13 @@
           <w:szCs w:val="28"/>
           <w:lang w:val="en-US"/>
         </w:rPr>
+        <w:t>-</w:t>
+      </w:r>
+      <w:r>
+        <w:rPr>
+          <w:szCs w:val="28"/>
+          <w:lang w:val="en-US"/>
+        </w:rPr>
         <w:t>2</w:t>
       </w:r>
       <w:r>
@@ -3457,7 +3566,49 @@
           <w:szCs w:val="28"/>
           <w:lang w:val="en-US"/>
         </w:rPr>
-        <w:t xml:space="preserve"> ≤ D ≤ 2</w:t>
+        <w:t xml:space="preserve"> </w:t>
+      </w:r>
+      <w:r>
+        <w:rPr>
+          <w:szCs w:val="28"/>
+          <w:lang w:val="en-US"/>
+        </w:rPr>
+        <w:t>≥</w:t>
+      </w:r>
+      <w:r>
+        <w:rPr>
+          <w:szCs w:val="28"/>
+          <w:lang w:val="en-US"/>
+        </w:rPr>
+        <w:t xml:space="preserve"> D </w:t>
+      </w:r>
+      <w:r>
+        <w:rPr>
+          <w:szCs w:val="28"/>
+          <w:lang w:val="en-US"/>
+        </w:rPr>
+        <w:t>≥</w:t>
+      </w:r>
+      <w:r>
+        <w:rPr>
+          <w:szCs w:val="28"/>
+          <w:lang w:val="en-US"/>
+        </w:rPr>
+        <w:t xml:space="preserve"> </w:t>
+      </w:r>
+      <w:r>
+        <w:rPr>
+          <w:szCs w:val="28"/>
+          <w:lang w:val="en-US"/>
+        </w:rPr>
+        <w:t>-</w:t>
+      </w:r>
+      <w:r>
+        <w:rPr>
+          <w:szCs w:val="28"/>
+          <w:lang w:val="en-US"/>
+        </w:rPr>
+        <w:t>2</w:t>
       </w:r>
       <w:r>
         <w:rPr>
@@ -3472,7 +3623,21 @@
           <w:szCs w:val="28"/>
           <w:lang w:val="en-US"/>
         </w:rPr>
-        <w:t xml:space="preserve"> – 1</w:t>
+        <w:t xml:space="preserve"> </w:t>
+      </w:r>
+      <w:r>
+        <w:rPr>
+          <w:szCs w:val="28"/>
+          <w:lang w:val="en-US"/>
+        </w:rPr>
+        <w:t>+</w:t>
+      </w:r>
+      <w:r>
+        <w:rPr>
+          <w:szCs w:val="28"/>
+          <w:lang w:val="en-US"/>
+        </w:rPr>
+        <w:t xml:space="preserve"> 1</w:t>
       </w:r>
     </w:p>
     <w:p>
@@ -3659,7 +3824,25 @@
           <w:lang w:val="en-US" w:eastAsia="en-GB"/>
           <w14:ligatures w14:val="none"/>
         </w:rPr>
-        <w:t xml:space="preserve"> ≤ D ≤ -2</w:t>
+        <w:t xml:space="preserve"> ≤ </w:t>
+      </w:r>
+      <w:r>
+        <w:rPr>
+          <w:rFonts w:eastAsia="Times New Roman"/>
+          <w:kern w:val="0"/>
+          <w:lang w:val="en-US" w:eastAsia="en-GB"/>
+          <w14:ligatures w14:val="none"/>
+        </w:rPr>
+        <w:t>-</w:t>
+      </w:r>
+      <w:r>
+        <w:rPr>
+          <w:rFonts w:eastAsia="Times New Roman"/>
+          <w:kern w:val="0"/>
+          <w:lang w:val="en-US" w:eastAsia="en-GB"/>
+          <w14:ligatures w14:val="none"/>
+        </w:rPr>
+        <w:t>D ≤ -2</w:t>
       </w:r>
       <w:r>
         <w:rPr>
@@ -3915,13 +4098,6 @@
           <w:szCs w:val="28"/>
           <w:lang w:val="en-US"/>
         </w:rPr>
-        <w:t>-</w:t>
-      </w:r>
-      <w:r>
-        <w:rPr>
-          <w:szCs w:val="28"/>
-          <w:lang w:val="en-US"/>
-        </w:rPr>
         <w:t>2</w:t>
       </w:r>
       <w:r>
@@ -3937,7 +4113,35 @@
           <w:szCs w:val="28"/>
           <w:lang w:val="en-US"/>
         </w:rPr>
-        <w:t xml:space="preserve"> ≤ D ≤ -2</w:t>
+        <w:t xml:space="preserve"> </w:t>
+      </w:r>
+      <w:r>
+        <w:rPr>
+          <w:szCs w:val="28"/>
+          <w:lang w:val="en-US"/>
+        </w:rPr>
+        <w:t>≥</w:t>
+      </w:r>
+      <w:r>
+        <w:rPr>
+          <w:szCs w:val="28"/>
+          <w:lang w:val="en-US"/>
+        </w:rPr>
+        <w:t xml:space="preserve"> D </w:t>
+      </w:r>
+      <w:r>
+        <w:rPr>
+          <w:szCs w:val="28"/>
+          <w:lang w:val="en-US"/>
+        </w:rPr>
+        <w:t>≥</w:t>
+      </w:r>
+      <w:r>
+        <w:rPr>
+          <w:szCs w:val="28"/>
+          <w:lang w:val="en-US"/>
+        </w:rPr>
+        <w:t xml:space="preserve"> 2</w:t>
       </w:r>
       <w:r>
         <w:rPr>
@@ -3952,7 +4156,21 @@
           <w:szCs w:val="28"/>
           <w:lang w:val="en-US"/>
         </w:rPr>
-        <w:t xml:space="preserve"> – 1</w:t>
+        <w:t xml:space="preserve"> </w:t>
+      </w:r>
+      <w:r>
+        <w:rPr>
+          <w:szCs w:val="28"/>
+          <w:lang w:val="en-US"/>
+        </w:rPr>
+        <w:t>+</w:t>
+      </w:r>
+      <w:r>
+        <w:rPr>
+          <w:szCs w:val="28"/>
+          <w:lang w:val="en-US"/>
+        </w:rPr>
+        <w:t xml:space="preserve"> 1</w:t>
       </w:r>
     </w:p>
     <w:p>
@@ -4395,7 +4613,7 @@
         <w:pStyle w:val="Heading2"/>
         <w:jc w:val="center"/>
       </w:pPr>
-      <w:bookmarkStart w:id="4" w:name="_Toc214023232"/>
+      <w:bookmarkStart w:id="4" w:name="_Toc214222707"/>
       <w:r>
         <w:lastRenderedPageBreak/>
         <w:t>Таблица трассировки</w:t>
@@ -7019,7 +7237,7 @@
         <w:pStyle w:val="Heading2"/>
         <w:jc w:val="center"/>
       </w:pPr>
-      <w:bookmarkStart w:id="5" w:name="_Toc214023233"/>
+      <w:bookmarkStart w:id="5" w:name="_Toc214222708"/>
       <w:r>
         <w:lastRenderedPageBreak/>
         <w:t>Вариант с меньшим числом команд</w:t>
@@ -7914,17 +8132,275 @@
         </w:rPr>
       </w:pPr>
     </w:p>
-    <w:p/>
+    <w:p>
+      <w:pPr>
+        <w:rPr>
+          <w:lang w:val="en-US"/>
+        </w:rPr>
+      </w:pPr>
+    </w:p>
+    <w:p>
+      <w:pPr>
+        <w:rPr>
+          <w:lang w:val="en-US"/>
+        </w:rPr>
+      </w:pPr>
+    </w:p>
     <w:p>
       <w:pPr>
         <w:pStyle w:val="Heading1"/>
         <w:jc w:val="center"/>
+      </w:pPr>
+      <w:bookmarkStart w:id="6" w:name="_Toc214222709"/>
+      <w:r>
+        <w:lastRenderedPageBreak/>
+        <w:t>Дополнительное задание</w:t>
+      </w:r>
+      <w:bookmarkEnd w:id="6"/>
+    </w:p>
+    <w:p>
+      <w:pPr>
+        <w:jc w:val="both"/>
+        <w:rPr>
+          <w:lang w:val="en-US"/>
+        </w:rPr>
+      </w:pPr>
+      <w:r>
+        <w:t>Формула</w:t>
+      </w:r>
+      <w:r>
+        <w:rPr>
+          <w:lang w:val="en-US"/>
+        </w:rPr>
+        <w:t>:</w:t>
+      </w:r>
+      <w:r>
+        <w:rPr>
+          <w:lang w:val="en-US"/>
+        </w:rPr>
+        <w:t xml:space="preserve"> </w:t>
+      </w:r>
+      <w:r>
+        <w:rPr>
+          <w:lang w:val="en-US"/>
+        </w:rPr>
+        <w:t>R = ((A&amp;B)-D)</w:t>
+      </w:r>
+      <w:r>
+        <w:rPr>
+          <w:lang w:val="en-US"/>
+        </w:rPr>
+        <w:t>&amp;</w:t>
+      </w:r>
+      <w:r>
+        <w:rPr>
+          <w:lang w:val="en-US"/>
+        </w:rPr>
+        <w:t>(B-A)</w:t>
+      </w:r>
+    </w:p>
+    <w:p>
+      <w:pPr>
+        <w:rPr>
+          <w:lang w:val="en-US"/>
+        </w:rPr>
+      </w:pPr>
+      <w:r>
+        <w:t>Программа</w:t>
+      </w:r>
+      <w:r>
+        <w:rPr>
+          <w:lang w:val="en-US"/>
+        </w:rPr>
+        <w:t>:</w:t>
+      </w:r>
+    </w:p>
+    <w:p>
+      <w:pPr>
+        <w:rPr>
+          <w:lang w:val="en-US"/>
+        </w:rPr>
+      </w:pPr>
+      <w:r>
+        <w:rPr>
+          <w:noProof/>
+        </w:rPr>
+        <w:drawing>
+          <wp:inline distT="0" distB="0" distL="0" distR="0" wp14:anchorId="77B472E3" wp14:editId="22160B69">
+            <wp:extent cx="5505355" cy="3608962"/>
+            <wp:effectExtent l="0" t="0" r="0" b="0"/>
+            <wp:docPr id="1647316978" name="Picture 5" descr="A screenshot of a computer&#10;&#10;AI-generated content may be incorrect."/>
+            <wp:cNvGraphicFramePr>
+              <a:graphicFrameLocks xmlns:a="http://schemas.openxmlformats.org/drawingml/2006/main" noChangeAspect="1"/>
+            </wp:cNvGraphicFramePr>
+            <a:graphic xmlns:a="http://schemas.openxmlformats.org/drawingml/2006/main">
+              <a:graphicData uri="http://schemas.openxmlformats.org/drawingml/2006/picture">
+                <pic:pic xmlns:pic="http://schemas.openxmlformats.org/drawingml/2006/picture">
+                  <pic:nvPicPr>
+                    <pic:cNvPr id="1647316978" name="Picture 5" descr="A screenshot of a computer&#10;&#10;AI-generated content may be incorrect."/>
+                    <pic:cNvPicPr/>
+                  </pic:nvPicPr>
+                  <pic:blipFill rotWithShape="1">
+                    <a:blip r:embed="rId13" cstate="print">
+                      <a:extLst>
+                        <a:ext uri="{28A0092B-C50C-407E-A947-70E740481C1C}">
+                          <a14:useLocalDpi xmlns:a14="http://schemas.microsoft.com/office/drawing/2010/main" val="0"/>
+                        </a:ext>
+                      </a:extLst>
+                    </a:blip>
+                    <a:srcRect l="15394" t="4534" r="17459" b="27780"/>
+                    <a:stretch>
+                      <a:fillRect/>
+                    </a:stretch>
+                  </pic:blipFill>
+                  <pic:spPr bwMode="auto">
+                    <a:xfrm>
+                      <a:off x="0" y="0"/>
+                      <a:ext cx="5516726" cy="3616416"/>
+                    </a:xfrm>
+                    <a:prstGeom prst="rect">
+                      <a:avLst/>
+                    </a:prstGeom>
+                    <a:ln>
+                      <a:noFill/>
+                    </a:ln>
+                    <a:extLst>
+                      <a:ext uri="{53640926-AAD7-44D8-BBD7-CCE9431645EC}">
+                        <a14:shadowObscured xmlns:a14="http://schemas.microsoft.com/office/drawing/2010/main"/>
+                      </a:ext>
+                    </a:extLst>
+                  </pic:spPr>
+                </pic:pic>
+              </a:graphicData>
+            </a:graphic>
+          </wp:inline>
+        </w:drawing>
+      </w:r>
+    </w:p>
+    <w:p>
+      <w:pPr>
+        <w:rPr>
+          <w:lang w:val="en-US"/>
+        </w:rPr>
+      </w:pPr>
+      <w:r>
+        <w:t xml:space="preserve">Дополнительное </w:t>
+      </w:r>
+      <w:r>
+        <w:t>ОДЗ</w:t>
+      </w:r>
+      <w:r>
+        <w:rPr>
+          <w:lang w:val="en-US"/>
+        </w:rPr>
+        <w:t xml:space="preserve">: </w:t>
+      </w:r>
+      <w:r>
+        <w:rPr>
+          <w:lang w:val="en-US"/>
+        </w:rPr>
+        <w:t>-2</w:t>
+      </w:r>
+      <w:r>
+        <w:rPr>
+          <w:vertAlign w:val="superscript"/>
+          <w:lang w:val="en-US"/>
+        </w:rPr>
+        <w:t>14</w:t>
+      </w:r>
+      <w:r>
+        <w:rPr>
+          <w:lang w:val="en-US"/>
+        </w:rPr>
+        <w:t xml:space="preserve"> ≤ </w:t>
+      </w:r>
+      <w:r>
+        <w:rPr>
+          <w:lang w:val="en-US"/>
+        </w:rPr>
+        <w:t>A,B ≤ 2</w:t>
+      </w:r>
+      <w:r>
+        <w:rPr>
+          <w:vertAlign w:val="superscript"/>
+          <w:lang w:val="en-US"/>
+        </w:rPr>
+        <w:t>14</w:t>
+      </w:r>
+      <w:r>
+        <w:rPr>
+          <w:vertAlign w:val="superscript"/>
+          <w:lang w:val="en-US"/>
+        </w:rPr>
+        <w:t xml:space="preserve"> </w:t>
+      </w:r>
+      <w:r>
+        <w:rPr>
+          <w:lang w:val="en-US"/>
+        </w:rPr>
+        <w:t>- 1</w:t>
+      </w:r>
+    </w:p>
+    <w:p>
+      <w:pPr>
+        <w:rPr>
+          <w:lang w:val="en-US"/>
+        </w:rPr>
+      </w:pPr>
+    </w:p>
+    <w:p>
+      <w:pPr>
+        <w:rPr>
+          <w:lang w:val="en-US"/>
+        </w:rPr>
+      </w:pPr>
+    </w:p>
+    <w:p>
+      <w:pPr>
+        <w:rPr>
+          <w:lang w:val="en-US"/>
+        </w:rPr>
+      </w:pPr>
+    </w:p>
+    <w:p>
+      <w:pPr>
+        <w:rPr>
+          <w:lang w:val="en-US"/>
+        </w:rPr>
+      </w:pPr>
+    </w:p>
+    <w:p>
+      <w:pPr>
+        <w:rPr>
+          <w:lang w:val="en-US"/>
+        </w:rPr>
+      </w:pPr>
+    </w:p>
+    <w:p>
+      <w:pPr>
+        <w:rPr>
+          <w:lang w:val="en-US"/>
+        </w:rPr>
+      </w:pPr>
+    </w:p>
+    <w:p>
+      <w:pPr>
+        <w:rPr>
+          <w:lang w:val="en-US"/>
+        </w:rPr>
+      </w:pPr>
+    </w:p>
+    <w:p>
+      <w:pPr>
+        <w:pStyle w:val="Heading1"/>
+        <w:jc w:val="center"/>
         <w:rPr>
           <w:b/>
           <w:bCs/>
-        </w:rPr>
-      </w:pPr>
-      <w:bookmarkStart w:id="6" w:name="_Toc214023234"/>
+          <w:lang w:val="en-US"/>
+        </w:rPr>
+      </w:pPr>
+      <w:bookmarkStart w:id="7" w:name="_Toc214222710"/>
       <w:r>
         <w:rPr>
           <w:b/>
@@ -7933,7 +8409,7 @@
         <w:lastRenderedPageBreak/>
         <w:t>Заключение</w:t>
       </w:r>
-      <w:bookmarkEnd w:id="6"/>
+      <w:bookmarkEnd w:id="7"/>
     </w:p>
     <w:p>
       <w:pPr>
@@ -8014,7 +8490,7 @@
           <w:bCs/>
         </w:rPr>
       </w:pPr>
-      <w:bookmarkStart w:id="7" w:name="_Toc214023235"/>
+      <w:bookmarkStart w:id="8" w:name="_Toc214222711"/>
       <w:r>
         <w:rPr>
           <w:b/>
@@ -8030,7 +8506,7 @@
         </w:rPr>
         <w:t>источников</w:t>
       </w:r>
-      <w:bookmarkEnd w:id="7"/>
+      <w:bookmarkEnd w:id="8"/>
     </w:p>
     <w:p>
       <w:pPr>
@@ -8062,7 +8538,7 @@
         </w:rPr>
         <w:t xml:space="preserve">Методические указания к лабораторным работам по курсу «Основы профессиональной деятельности» / В. В. Кириллов, А. А. Приблуда, С. В. Клименков, Д. Б. Афанасьев. — Санкт-Петербург, 2019. — Версия 1.41. — Электронный ресурс. — Режим доступа: </w:t>
       </w:r>
-      <w:hyperlink r:id="rId13" w:history="1">
+      <w:hyperlink r:id="rId14" w:history="1">
         <w:r>
           <w:rPr>
             <w:rStyle w:val="Hyperlink"/>
@@ -8115,7 +8591,7 @@
         </w:rPr>
         <w:t xml:space="preserve">Основы профессиональной деятельности. Часть первая. Презентация. — 2018–2019 уч. год. — v. 1.45.09 от 31.05.2022. — Электронный ресурс. — 98 с. — Режим доступа: </w:t>
       </w:r>
-      <w:hyperlink r:id="rId14" w:history="1">
+      <w:hyperlink r:id="rId15" w:history="1">
         <w:r>
           <w:rPr>
             <w:rStyle w:val="Hyperlink"/>
@@ -8140,7 +8616,7 @@
     </w:p>
     <w:p/>
     <w:sectPr>
-      <w:footerReference w:type="default" r:id="rId15"/>
+      <w:footerReference w:type="default" r:id="rId16"/>
       <w:pgSz w:w="11906" w:h="16838" w:code="9"/>
       <w:pgMar w:top="1134" w:right="851" w:bottom="1134" w:left="1701" w:header="709" w:footer="709" w:gutter="0"/>
       <w:cols w:space="708"/>

</xml_diff>